<commit_message>
Atualiza ocorrências de 2026 (314 até 12/10/2026)
Co-Authored-By: Claude Opus 5.5 <noreply@anthropic.com>
Claude-Session: https://claude.ai/code/session_01NkJxMjLTPT7uCe2XDfKQHG
</commit_message>
<xml_diff>
--- a/estudo/Estudo_de_Situacao_RMP_27BPM.docx
+++ b/estudo/Estudo_de_Situacao_RMP_27BPM.docx
@@ -1227,7 +1227,7 @@
           <w:szCs w:val="20"/>
           <w:highlight w:val="yellow"/>
         </w:rPr>
-        <w:t>Registro de [PENDENTE] ocorrências de violência doméstica e familiar contra a mulher em 2023, [PENDENTE] em 2024, [PENDENTE] em 2025 e [PENDENTE] em 2026 (até [PENDENTE]);</w:t>
+        <w:t>Registro de [PENDENTE] ocorrências de violência doméstica e familiar contra a mulher em 2023, [PENDENTE] em 2024, [PENDENTE] em 2025 e 314 (trezentas e quatorze) em 2026 (até 12/10/2026, conforme SIGESPOL);</w:t>
       </w:r>
       <w:proofErr w:type="gramStart"/>
       <w:proofErr w:type="gramEnd"/>
@@ -1919,7 +1919,7 @@
           <w:szCs w:val="20"/>
           <w:highlight w:val="yellow"/>
         </w:rPr>
-        <w:t>A análise das ocorrências registradas de 2023 a 2026 demonstra [PENDENTE – tendência de aumento/manutenção], com maior concentração nos bairros [PENDENTE], predominando os delitos de [PENDENTE – ameaça, lesão corporal, descumprimento de MPU]. Os dados são apresentados de forma agregada, sem qualquer elemento que permita a identificação de vítimas ou autores (LGPD).</w:t>
+        <w:t>A análise das ocorrências registradas de 2023 a 2026 demonstra, somente em 2026, 314 ocorrências de “Maria da Penha” registradas no SIGESPOL até 12/10/2026, média superior a 01 (uma) ocorrência por dia, sendo 30 (trinta) registros apenas entre 29/09 e 12/10/2026, distribuídos entre Luís Eduardo Magalhães e São Desidério. Nos anos anteriores, verifica-se [PENDENTE – tendência de aumento/manutenção], com maior concentração nos bairros [PENDENTE], predominando os delitos de [PENDENTE – ameaça, lesão corporal, descumprimento de MPU]. Os dados são apresentados de forma agregada, sem qualquer elemento que permita a identificação de vítimas ou autores (LGPD).</w:t>
       </w:r>
     </w:p>
     <w:p>

</xml_diff>

<commit_message>
Corrige vinculação: RMP com efetivo do 27º BPM, formalmente ligada à 83ª CIPM
Co-Authored-By: Claude Opus 5.5 <noreply@anthropic.com>
Claude-Session: https://claude.ai/code/session_01NkJxMjLTPT7uCe2XDfKQHG
</commit_message>
<xml_diff>
--- a/estudo/Estudo_de_Situacao_RMP_27BPM.docx
+++ b/estudo/Estudo_de_Situacao_RMP_27BPM.docx
@@ -821,7 +821,7 @@
           <w:sz w:val="20"/>
           <w:szCs w:val="20"/>
         </w:rPr>
-        <w:t>Análise do cenário da violência doméstica e familiar contra a mulher na área de responsabilidade do 27º Batalhão de Polícia Militar (Luís Eduardo Magalhães, São Desidério e distritos de Roda Velha e Sítio Grande) e justificativa para a formalização da Ronda Maria da Penha (RMP) própria da Unidade, desvinculando-a da RMP do 10º BPM/Barreiras, nos termos do art. 4º e art. 5º da Portaria n.º 042-CG/2024.</w:t>
+        <w:t>Análise do cenário da violência doméstica e familiar contra a mulher na área de responsabilidade do 27º Batalhão de Polícia Militar (Luís Eduardo Magalhães, São Desidério e distritos de Roda Velha e Sítio Grande) e justificativa para a formalização da Ronda Maria da Penha (RMP) própria da Unidade, atualmente vinculada formalmente à Unidade da Ronda Maria da Penha pertencente à 83ª CIPM/Barreiras, nos termos do art. 4º e art. 5º da Portaria n.º 042-CG/2024.</w:t>
       </w:r>
     </w:p>
     <w:p>
@@ -878,7 +878,7 @@
           <w:sz w:val="20"/>
           <w:szCs w:val="20"/>
         </w:rPr>
-        <w:t>Desde a sua origem como Companhia destacada do 10º BPM/Barreiras e, posteriormente, como 85ª CIPM, a área hoje sob responsabilidade do 27º BPM tem sido atendida, no que se refere à fiscalização de Medidas Protetivas de Urgência (MPU), pela Ronda Maria da Penha vinculada à Unidade de Barreiras. Com a criação do 27º Batalhão de Polícia Militar pela Lei Estadual n.º 14.962, de 05 de setembro de 2025, e sua implantação em 08 de setembro de 2025 (Decreto n.º 23.976), a Unidade passou a deter autonomia administrativa e operacional, sem que, contudo, a RMP que atua em sua circunscrição tenha sido formalizada no âmbito do novo Batalhão.</w:t>
+        <w:t>Na área de responsabilidade do 27º BPM, a fiscalização das Medidas Protetivas de Urgência (MPU) já é realizada pela Ronda Maria da Penha com efetivo do próprio 27º BPM, contando atualmente com 05 (cinco) policiais militares empregados em Luís Eduardo Magalhães. Todavia, no aspecto formal, essa atuação ainda está vinculada à Unidade da Ronda Maria da Penha pertencente à 83ª CIPM, sediada em Barreiras.</w:t>
       </w:r>
     </w:p>
     <w:p>
@@ -897,9 +897,8 @@
           <w:rFonts w:ascii="Verdana" w:eastAsia="Verdana" w:hAnsi="Verdana" w:cs="Verdana"/>
           <w:sz w:val="20"/>
           <w:szCs w:val="20"/>
-          <w:highlight w:val="yellow"/>
-        </w:rPr>
-        <w:t>A distância de aproximadamente [PENDENTE: confirmar – cerca de 90 km pela BR-242] entre Barreiras e Luís Eduardo Magalhães, somada à extensa área territorial do 27º BPM (São Desidério possui, isoladamente, 15.157 km²), compromete a regularidade das visitas às mulheres assistidas, a pronta resposta aos descumprimentos de MPU e a integração com a rede de proteção local.</w:t>
+        </w:rPr>
+        <w:t>Com a criação do 27º Batalhão de Polícia Militar pela Lei Estadual n.º 14.962, de 05 de setembro de 2025, e sua implantação em 08 de setembro de 2025 (Decreto n.º 23.976), a Unidade passou a deter autonomia administrativa e operacional. Contudo, a RMP que atua em sua circunscrição não foi formalizada no âmbito do novo Batalhão, o que gera dependência administrativa de outra UOPM quanto à gestão, ao controle estatístico, à produtividade e ao envio dos relatórios mensais ao COPPM e ao BPPM (art. 7º, §1º, da Portaria n.º 042-CG/2024), além de contrariar o art. 5º da referida Portaria, que veda o funcionamento de RMP sem autorização do COPPM.</w:t>
       </w:r>
     </w:p>
     <w:p>
@@ -919,7 +918,7 @@
           <w:sz w:val="20"/>
           <w:szCs w:val="20"/>
         </w:rPr>
-        <w:t>Paralelamente, a área do 27º BPM registrou 03 (três) feminicídios somente em 2026 (até agosto), evidenciando a gravidade do fenômeno e a necessidade de uma estrutura especializada, permanente e subordinada diretamente ao Comando da Unidade, com efetivo e viatura exclusivos, conforme exige a Portaria n.º 042-CG/2024.</w:t>
+        <w:t>Paralelamente, a área do 27º BPM registrou 314 (trezentas e quatorze) ocorrências de violência doméstica em 2026 (até 12/10/2026) e 03 (três) feminicídios, evidenciando a gravidade do fenômeno e a necessidade de que a RMP seja formalmente estruturada e subordinada diretamente ao Comando da Unidade que já lhe fornece efetivo e meios.</w:t>
       </w:r>
     </w:p>
     <w:p>
@@ -1043,7 +1042,7 @@
           <w:sz w:val="20"/>
           <w:szCs w:val="20"/>
         </w:rPr>
-        <w:t>Demora na resposta por dependência de equipe sediada em outro município;</w:t>
+        <w:t>Dificuldade de gestão, controle e planejamento da RMP em razão da vinculação formal a outra UOPM;</w:t>
       </w:r>
     </w:p>
     <w:p>
@@ -1131,7 +1130,7 @@
           <w:sz w:val="20"/>
           <w:szCs w:val="20"/>
         </w:rPr>
-        <w:t>Desarticulação entre a Polícia Militar e a rede de proteção local.</w:t>
+        <w:t>Desarticulação entre a Polícia Militar e a rede de proteção local, pela ausência de uma RMP formalmente reconhecida no âmbito do 27º BPM.</w:t>
       </w:r>
     </w:p>
     <w:p>
@@ -1303,9 +1302,8 @@
           <w:rFonts w:ascii="Verdana" w:eastAsia="Verdana" w:hAnsi="Verdana" w:cs="Verdana"/>
           <w:sz w:val="20"/>
           <w:szCs w:val="20"/>
-          <w:highlight w:val="yellow"/>
-        </w:rPr>
-        <w:t>Fiscalização das MPUs realizada pela RMP vinculada ao 10º BPM/Barreiras, a aproximadamente [PENDENTE] km da sede do 27º BPM;</w:t>
+        </w:rPr>
+        <w:t>Fiscalização das MPUs já executada por 05 (cinco) policiais militares do 27º BPM em Luís Eduardo Magalhães, porém com vinculação formal à Unidade da Ronda Maria da Penha da 83ª CIPM/Barreiras;</w:t>
       </w:r>
       <w:proofErr w:type="gramStart"/>
       <w:proofErr w:type="gramEnd"/>
@@ -1561,7 +1559,7 @@
           <w:szCs w:val="20"/>
           <w:highlight w:val="yellow"/>
         </w:rPr>
-        <w:t>[INSERIR IMAGEM: Mapa da área de responsabilidade do 27º BPM (LEM, São Desidério, Roda Velha e Sítio Grande), destacando a distância até Barreiras – pode ser reaproveitado do slide 57 da apresentação]</w:t>
+        <w:t>[INSERIR IMAGEM: Mapa da área de responsabilidade do 27º BPM (LEM, São Desidério, Roda Velha e Sítio Grande), com os bairros atendidos pela RMP – pode ser reaproveitado do slide 57 da apresentação]</w:t>
       </w:r>
     </w:p>
     <w:p>
@@ -2038,7 +2036,7 @@
           <w:szCs w:val="20"/>
           <w:highlight w:val="yellow"/>
         </w:rPr>
-        <w:t>Foram concedidas [PENDENTE] MPUs no período de 2023 a 2026, das quais [PENDENTE] permanecem vigentes. A fiscalização regular desse universo exige equipe exclusiva e próxima das assistidas, o que não é possível com equipe sediada em outro município.</w:t>
+        <w:t>Foram concedidas [PENDENTE] MPUs no período de 2023 a 2026, das quais [PENDENTE] permanecem vigentes. A fiscalização regular desse universo já é realizada pelo efetivo do 27º BPM, sendo necessária a sua formalização para garantir gestão, controle e planejamento próprios.</w:t>
       </w:r>
     </w:p>
     <w:p>
@@ -2216,7 +2214,7 @@
           <w:szCs w:val="20"/>
           <w:highlight w:val="yellow"/>
         </w:rPr>
-        <w:t>Em atendimento ao art. 4º, §2º, e art. 7º, §2º, da Portaria n.º 042-CG/2024, a RMP será composta por [PENDENTE – mínimo 05] policiais militares, sendo 01 (um) [PENDENTE – Oficial ou Subtenente] e pelo menos 01 (uma) policial feminina, empregados em guarnição tipo “B”, em regime de escala ordinário, todos com capacitação em enfrentamento à violência contra a mulher [PENDENTE – informar curso/estágio já realizado ou a ser agendado junto ao BPPM]. Será destinada exclusivamente à RMP a viatura [PENDENTE – prefixo e modelo], com cota de combustível sob gestão da Unidade.</w:t>
+        <w:t>Em atendimento ao art. 4º, §2º, e art. 7º, §2º, da Portaria n.º 042-CG/2024, a RMP já conta com 05 (cinco) policiais militares do 27º BPM, efetivo mínimo exigido, sendo 01 (um) [PENDENTE – Oficial ou Subtenente] e [PENDENTE – quantidade] policial(is) feminina(s), empregados em guarnição tipo “B”, em regime de escala ordinário, todos com capacitação em enfrentamento à violência contra a mulher [PENDENTE – informar curso/estágio já realizado ou a ser agendado junto ao BPPM]. Está destinada exclusivamente à RMP a viatura [PENDENTE – prefixo e modelo], com cota de combustível sob gestão da Unidade.</w:t>
       </w:r>
     </w:p>
     <w:p>
@@ -2397,7 +2395,7 @@
           <w:sz w:val="20"/>
           <w:szCs w:val="20"/>
         </w:rPr>
-        <w:t>Formalização da Ronda Maria da Penha do 27º BPM, desvinculando-a da RMP do 10º BPM/Barreiras;</w:t>
+        <w:t>Formalização da Ronda Maria da Penha do 27º BPM, desvinculando-a formalmente da Unidade da RMP da 83ª CIPM/Barreiras;</w:t>
       </w:r>
     </w:p>
     <w:p>
@@ -2463,7 +2461,7 @@
           <w:sz w:val="20"/>
           <w:szCs w:val="20"/>
         </w:rPr>
-        <w:t>Destinação de efetivo e viatura exclusivos, conforme o art. 4º, §2º, da Portaria n.º 042-CG/2024;</w:t>
+        <w:t>Manutenção do efetivo de 05 (cinco) policiais militares e da viatura exclusivos, conforme o art. 4º, §2º, da Portaria n.º 042-CG/2024;</w:t>
       </w:r>
     </w:p>
     <w:p>
@@ -2727,7 +2725,7 @@
           <w:sz w:val="20"/>
           <w:szCs w:val="20"/>
         </w:rPr>
-        <w:t>A área do 27º BPM apresenta cenário de violência doméstica e familiar contra a mulher que exige atuação especializada e permanente, evidenciado pelos 03 feminicídios registrados em 2026, pelo volume de MPUs concedidas e pela extensa área territorial atendida.</w:t>
+        <w:t>A área do 27º BPM apresenta cenário de violência doméstica e familiar contra a mulher que exige atuação especializada e permanente, evidenciado pelas 314 ocorrências e 03 feminicídios registrados em 2026, pelo volume de MPUs concedidas e pela extensa área territorial atendida.</w:t>
       </w:r>
     </w:p>
     <w:p>
@@ -2747,7 +2745,7 @@
           <w:sz w:val="20"/>
           <w:szCs w:val="20"/>
         </w:rPr>
-        <w:t>A dependência da RMP do 10º BPM/Barreiras não mais se justifica após a criação do 27º BPM, pois a distância compromete a fiscalização das medidas protetivas e a resposta aos descumprimentos. Conclui-se, portanto, pela necessidade de formalizar a Ronda Maria da Penha do 27º BPM, que atende aos critérios do art. 4º da Portaria n.º 042-CG/2024.</w:t>
+        <w:t>A RMP já funciona na área com efetivo do 27º BPM, porém permanece formalmente vinculada à Unidade da 83ª CIPM/Barreiras, situação que não mais se justifica após a criação do Batalhão. Conclui-se, portanto, pela necessidade de formalizar a Ronda Maria da Penha do 27º BPM, que atende aos critérios do art. 4º da Portaria n.º 042-CG/2024.</w:t>
       </w:r>
     </w:p>
     <w:p>

</xml_diff>

<commit_message>
Inclui composição do efetivo da RMP e Anexo B
Co-Authored-By: Claude Opus 5.5 <noreply@anthropic.com>
Claude-Session: https://claude.ai/code/session_01NkJxMjLTPT7uCe2XDfKQHG
</commit_message>
<xml_diff>
--- a/estudo/Estudo_de_Situacao_RMP_27BPM.docx
+++ b/estudo/Estudo_de_Situacao_RMP_27BPM.docx
@@ -2214,7 +2214,7 @@
           <w:szCs w:val="20"/>
           <w:highlight w:val="yellow"/>
         </w:rPr>
-        <w:t>Em atendimento ao art. 4º, §2º, e art. 7º, §2º, da Portaria n.º 042-CG/2024, a RMP já conta com 05 (cinco) policiais militares do 27º BPM, efetivo mínimo exigido, sendo 01 (um) [PENDENTE – Oficial ou Subtenente] e [PENDENTE – quantidade] policial(is) feminina(s), empregados em guarnição tipo “B”, em regime de escala ordinário, todos com capacitação em enfrentamento à violência contra a mulher [PENDENTE – informar curso/estágio já realizado ou a ser agendado junto ao BPPM]. Está destinada exclusivamente à RMP a viatura [PENDENTE – prefixo e modelo], com cota de combustível sob gestão da Unidade.</w:t>
+        <w:t>Em atendimento ao art. 4º, §2º, e art. 7º, §2º, da Portaria n.º 042-CG/2024, a RMP já conta com 05 (cinco) policiais militares do 27º BPM, efetivo mínimo exigido, sendo 01 (um) Oficial (Tenente PM), comandante da RMP, 01 (um) Sargento, 01 (um) Cabo e 02 (dois) Soldados, dos quais 02 (duas) são policiais femininas (relação nominal no Anexo B, de acesso restrito), empregados em guarnição tipo “B”, em regime de escala ordinário, todos com capacitação em enfrentamento à violência contra a mulher [PENDENTE – informar curso/estágio já realizado ou a ser agendado junto ao BPPM]. Está destinada exclusivamente à RMP a viatura [PENDENTE – prefixo e modelo], com cota de combustível sob gestão da Unidade.</w:t>
       </w:r>
     </w:p>
     <w:p>
@@ -3807,6 +3807,186 @@
           <w:szCs w:val="20"/>
         </w:rPr>
       </w:pPr>
+    </w:p>
+    <w:p>
+      <w:pPr>
+        <w:spacing w:line="360" w:lineRule="auto"/>
+        <w:ind w:firstLine="720"/>
+        <w:jc w:val="both"/>
+        <w:rPr>
+          <w:rFonts w:ascii="Verdana" w:eastAsia="Verdana" w:hAnsi="Verdana" w:cs="Verdana"/>
+          <w:sz w:val="20"/>
+          <w:szCs w:val="20"/>
+        </w:rPr>
+      </w:pPr>
+      <w:r>
+        <w:rPr>
+          <w:rFonts w:ascii="Verdana" w:eastAsia="Verdana" w:hAnsi="Verdana" w:cs="Verdana"/>
+          <w:sz w:val="20"/>
+          <w:szCs w:val="20"/>
+        </w:rPr>
+        <w:t>ANEXO – B (ACESSO RESTRITO – LGPD)</w:t>
+      </w:r>
+    </w:p>
+    <w:p>
+      <w:pPr>
+        <w:spacing w:line="360" w:lineRule="auto"/>
+        <w:ind w:firstLine="720"/>
+        <w:jc w:val="both"/>
+        <w:rPr>
+          <w:rFonts w:ascii="Verdana" w:eastAsia="Verdana" w:hAnsi="Verdana" w:cs="Verdana"/>
+          <w:sz w:val="20"/>
+          <w:szCs w:val="20"/>
+        </w:rPr>
+      </w:pPr>
+      <w:r>
+        <w:rPr>
+          <w:rFonts w:ascii="Verdana" w:eastAsia="Verdana" w:hAnsi="Verdana" w:cs="Verdana"/>
+          <w:sz w:val="20"/>
+          <w:szCs w:val="20"/>
+        </w:rPr>
+        <w:t>RELAÇÃO NOMINAL DO EFETIVO DA RMP/27º BPM</w:t>
+      </w:r>
+    </w:p>
+    <w:p>
+      <w:pPr>
+        <w:spacing w:line="360" w:lineRule="auto"/>
+        <w:ind w:firstLine="720"/>
+        <w:jc w:val="both"/>
+        <w:rPr>
+          <w:rFonts w:ascii="Verdana" w:eastAsia="Verdana" w:hAnsi="Verdana" w:cs="Verdana"/>
+          <w:sz w:val="20"/>
+          <w:szCs w:val="20"/>
+        </w:rPr>
+      </w:pPr>
+      <w:r>
+        <w:rPr>
+          <w:rFonts w:ascii="Verdana" w:eastAsia="Verdana" w:hAnsi="Verdana" w:cs="Verdana"/>
+          <w:sz w:val="20"/>
+          <w:szCs w:val="20"/>
+        </w:rPr>
+        <w:t>Comandante da RMP: TEN PM LUIS HENRIQUE SANTOS SOUSA</w:t>
+      </w:r>
+    </w:p>
+    <w:p>
+      <w:pPr>
+        <w:spacing w:line="360" w:lineRule="auto"/>
+        <w:ind w:firstLine="720"/>
+        <w:jc w:val="both"/>
+        <w:rPr>
+          <w:rFonts w:ascii="Verdana" w:eastAsia="Verdana" w:hAnsi="Verdana" w:cs="Verdana"/>
+          <w:sz w:val="20"/>
+          <w:szCs w:val="20"/>
+        </w:rPr>
+      </w:pPr>
+      <w:r>
+        <w:rPr>
+          <w:rFonts w:ascii="Verdana" w:eastAsia="Verdana" w:hAnsi="Verdana" w:cs="Verdana"/>
+          <w:sz w:val="20"/>
+          <w:szCs w:val="20"/>
+        </w:rPr>
+        <w:t>SGT PM FLAVIO DE SOUZA SARDEIRO</w:t>
+      </w:r>
+    </w:p>
+    <w:p>
+      <w:pPr>
+        <w:spacing w:line="360" w:lineRule="auto"/>
+        <w:ind w:firstLine="720"/>
+        <w:jc w:val="both"/>
+        <w:rPr>
+          <w:rFonts w:ascii="Verdana" w:eastAsia="Verdana" w:hAnsi="Verdana" w:cs="Verdana"/>
+          <w:sz w:val="20"/>
+          <w:szCs w:val="20"/>
+        </w:rPr>
+      </w:pPr>
+      <w:r>
+        <w:rPr>
+          <w:rFonts w:ascii="Verdana" w:eastAsia="Verdana" w:hAnsi="Verdana" w:cs="Verdana"/>
+          <w:sz w:val="20"/>
+          <w:szCs w:val="20"/>
+        </w:rPr>
+        <w:t>CB PM LIVIA MACIEL SANTIAGO DOS SANTOS</w:t>
+      </w:r>
+    </w:p>
+    <w:p>
+      <w:pPr>
+        <w:spacing w:line="360" w:lineRule="auto"/>
+        <w:ind w:firstLine="720"/>
+        <w:jc w:val="both"/>
+        <w:rPr>
+          <w:rFonts w:ascii="Verdana" w:eastAsia="Verdana" w:hAnsi="Verdana" w:cs="Verdana"/>
+          <w:sz w:val="20"/>
+          <w:szCs w:val="20"/>
+        </w:rPr>
+      </w:pPr>
+      <w:r>
+        <w:rPr>
+          <w:rFonts w:ascii="Verdana" w:eastAsia="Verdana" w:hAnsi="Verdana" w:cs="Verdana"/>
+          <w:sz w:val="20"/>
+          <w:szCs w:val="20"/>
+        </w:rPr>
+        <w:t>SD PM DAVI ALVES DA SILVA</w:t>
+      </w:r>
+    </w:p>
+    <w:p>
+      <w:pPr>
+        <w:spacing w:line="360" w:lineRule="auto"/>
+        <w:ind w:firstLine="720"/>
+        <w:jc w:val="both"/>
+        <w:rPr>
+          <w:rFonts w:ascii="Verdana" w:eastAsia="Verdana" w:hAnsi="Verdana" w:cs="Verdana"/>
+          <w:sz w:val="20"/>
+          <w:szCs w:val="20"/>
+        </w:rPr>
+      </w:pPr>
+      <w:r>
+        <w:rPr>
+          <w:rFonts w:ascii="Verdana" w:eastAsia="Verdana" w:hAnsi="Verdana" w:cs="Verdana"/>
+          <w:sz w:val="20"/>
+          <w:szCs w:val="20"/>
+        </w:rPr>
+        <w:t>SD PM JEOVANA ALVES CIRIACO DOS SANTOS</w:t>
+      </w:r>
+    </w:p>
+    <w:p>
+      <w:pPr>
+        <w:spacing w:line="360" w:lineRule="auto"/>
+        <w:ind w:firstLine="720"/>
+        <w:jc w:val="both"/>
+        <w:rPr>
+          <w:rFonts w:ascii="Verdana" w:eastAsia="Verdana" w:hAnsi="Verdana" w:cs="Verdana"/>
+          <w:sz w:val="20"/>
+          <w:szCs w:val="20"/>
+        </w:rPr>
+      </w:pPr>
+      <w:r>
+        <w:rPr>
+          <w:rFonts w:ascii="Verdana" w:eastAsia="Verdana" w:hAnsi="Verdana" w:cs="Verdana"/>
+          <w:sz w:val="20"/>
+          <w:szCs w:val="20"/>
+          <w:highlight w:val="yellow"/>
+        </w:rPr>
+        <w:t>Capacitação: [PENDENTE – curso/estágio de cada policial]</w:t>
+      </w:r>
+    </w:p>
+    <w:p>
+      <w:pPr>
+        <w:spacing w:line="360" w:lineRule="auto"/>
+        <w:ind w:firstLine="720"/>
+        <w:jc w:val="both"/>
+        <w:rPr>
+          <w:rFonts w:ascii="Verdana" w:eastAsia="Verdana" w:hAnsi="Verdana" w:cs="Verdana"/>
+          <w:sz w:val="20"/>
+          <w:szCs w:val="20"/>
+        </w:rPr>
+      </w:pPr>
+      <w:r>
+        <w:rPr>
+          <w:rFonts w:ascii="Verdana" w:eastAsia="Verdana" w:hAnsi="Verdana" w:cs="Verdana"/>
+          <w:sz w:val="20"/>
+          <w:szCs w:val="20"/>
+        </w:rPr>
+      </w:r>
     </w:p>
     <w:p>
       <w:pPr>

</xml_diff>

<commit_message>
Inclui população, MPUs ativas, palestras, local e viatura da RMP
Co-Authored-By: Claude Opus 5.5 <noreply@anthropic.com>
Claude-Session: https://claude.ai/code/session_01NkJxMjLTPT7uCe2XDfKQHG
</commit_message>
<xml_diff>
--- a/estudo/Estudo_de_Situacao_RMP_27BPM.docx
+++ b/estudo/Estudo_de_Situacao_RMP_27BPM.docx
@@ -1252,7 +1252,7 @@
           <w:szCs w:val="20"/>
           <w:highlight w:val="yellow"/>
         </w:rPr>
-        <w:t>Concessão de [PENDENTE] Medidas Protetivas de Urgência em 2023, [PENDENTE] em 2024, [PENDENTE] em 2025 e [PENDENTE] em 2026, encontrando-se [PENDENTE] vigentes na presente data;</w:t>
+        <w:t>Acompanhamento, pela RMP, de 192 (cento e noventa e duas) Medidas Protetivas de Urgência ativas em 2025 e de 202 (duzentas e duas) ativas em 2026 (até a presente data), restando levantar as MPUs concedidas em 2023 e 2024 [PENDENTE];Registro de [PENDENTE] descumprimentos de MPU no período analisado;</w:t>
       </w:r>
       <w:proofErr w:type="gramStart"/>
       <w:proofErr w:type="gramEnd"/>
@@ -1276,9 +1276,8 @@
           <w:rFonts w:ascii="Verdana" w:eastAsia="Verdana" w:hAnsi="Verdana" w:cs="Verdana"/>
           <w:sz w:val="20"/>
           <w:szCs w:val="20"/>
-          <w:highlight w:val="yellow"/>
-        </w:rPr>
-        <w:t>Registro de [PENDENTE] descumprimentos de MPU no período analisado;</w:t>
+        </w:rPr>
+        <w:t>Fiscalização das MPUs já executada por 05 (cinco) policiais militares do 27º BPM em Luís Eduardo Magalhães, porém com vinculação formal à Unidade da Ronda Maria da Penha da 83ª CIPM/Barreiras;</w:t>
       </w:r>
       <w:proofErr w:type="gramStart"/>
       <w:proofErr w:type="gramEnd"/>
@@ -1303,7 +1302,7 @@
           <w:sz w:val="20"/>
           <w:szCs w:val="20"/>
         </w:rPr>
-        <w:t>Fiscalização das MPUs já executada por 05 (cinco) policiais militares do 27º BPM em Luís Eduardo Magalhães, porém com vinculação formal à Unidade da Ronda Maria da Penha da 83ª CIPM/Barreiras;</w:t>
+        <w:t>Área de responsabilidade composta por Luís Eduardo Magalhães, São Desidério e distritos, com grande extensão territorial e zona rural dispersa;</w:t>
       </w:r>
       <w:proofErr w:type="gramStart"/>
       <w:proofErr w:type="gramEnd"/>
@@ -1328,7 +1327,7 @@
           <w:sz w:val="20"/>
           <w:szCs w:val="20"/>
         </w:rPr>
-        <w:t>Área de responsabilidade composta por Luís Eduardo Magalhães, São Desidério e distritos, com grande extensão territorial e zona rural dispersa;</w:t>
+        <w:t>Criação do 27º BPM (Lei n.º 14.962/2025), com autonomia administrativa e operacional;</w:t>
       </w:r>
       <w:proofErr w:type="gramStart"/>
       <w:proofErr w:type="gramEnd"/>
@@ -1353,7 +1352,7 @@
           <w:sz w:val="20"/>
           <w:szCs w:val="20"/>
         </w:rPr>
-        <w:t>Criação do 27º BPM (Lei n.º 14.962/2025), com autonomia administrativa e operacional;</w:t>
+        <w:t>Existência, no município, de rede de proteção apta à integração com a RMP (detalhada na Discussão);</w:t>
       </w:r>
       <w:proofErr w:type="gramStart"/>
       <w:proofErr w:type="gramEnd"/>
@@ -1378,31 +1377,6 @@
           <w:sz w:val="20"/>
           <w:szCs w:val="20"/>
         </w:rPr>
-        <w:t>Existência, no município, de rede de proteção apta à integração com a RMP (detalhada na Discussão);</w:t>
-      </w:r>
-      <w:proofErr w:type="gramStart"/>
-      <w:proofErr w:type="gramEnd"/>
-    </w:p>
-    <w:p>
-      <w:pPr>
-        <w:numPr>
-          <w:ilvl w:val="0"/>
-          <w:numId w:val="6"/>
-        </w:numPr>
-        <w:spacing w:line="360" w:lineRule="auto"/>
-        <w:jc w:val="both"/>
-        <w:rPr>
-          <w:rFonts w:ascii="Verdana" w:eastAsia="Verdana" w:hAnsi="Verdana" w:cs="Verdana"/>
-          <w:sz w:val="20"/>
-          <w:szCs w:val="20"/>
-        </w:rPr>
-      </w:pPr>
-      <w:r>
-        <w:rPr>
-          <w:rFonts w:ascii="Verdana" w:eastAsia="Verdana" w:hAnsi="Verdana" w:cs="Verdana"/>
-          <w:sz w:val="20"/>
-          <w:szCs w:val="20"/>
-        </w:rPr>
         <w:t>Vigência da Lei n.º 15.383/2026 (monitoração eletrônica de agressores) e da Lei n.º 15.384/2026 (violência vicária), que ampliam a demanda de fiscalização.</w:t>
       </w:r>
       <w:proofErr w:type="gramStart"/>
@@ -1527,9 +1501,38 @@
           <w:color w:val="000000"/>
           <w:sz w:val="20"/>
           <w:szCs w:val="20"/>
+        </w:rPr>
+        <w:t>O 27º BPM abrange Luís Eduardo Magalhães (população estimada de 119.947 habitantes em 2026, contra 107.909 no Censo Demográfico de 2022, crescimento de aproximadamente 11% em quatro anos) e, por meio da 4ª CIA destacada, São Desidério (32.828 habitantes e 15.157 km²) e os distritos de Roda Velha e Sítio Grande, totalizando população superior a 150 mil habitantes. A região, marcada pelo agronegócio e pelo crescimento populacional acelerado, recebe intenso fluxo migratório, o que fragiliza vínculos familiares e comunitários e dificulta o acesso das mulheres à rede de proteção.</w:t>
+      </w:r>
+    </w:p>
+    <w:p>
+      <w:pPr>
+        <w:pBdr>
+          <w:top w:val="nil"/>
+          <w:left w:val="nil"/>
+          <w:bottom w:val="nil"/>
+          <w:right w:val="nil"/>
+          <w:between w:val="nil"/>
+        </w:pBdr>
+        <w:spacing w:line="360" w:lineRule="auto"/>
+        <w:ind w:firstLine="709"/>
+        <w:jc w:val="both"/>
+        <w:rPr>
+          <w:rFonts w:ascii="Verdana" w:eastAsia="Verdana" w:hAnsi="Verdana" w:cs="Verdana"/>
+          <w:color w:val="000000"/>
+          <w:sz w:val="20"/>
+          <w:szCs w:val="20"/>
+        </w:rPr>
+      </w:pPr>
+      <w:r>
+        <w:rPr>
+          <w:rFonts w:ascii="Verdana" w:eastAsia="Verdana" w:hAnsi="Verdana" w:cs="Verdana"/>
+          <w:color w:val="000000"/>
+          <w:sz w:val="20"/>
+          <w:szCs w:val="20"/>
           <w:highlight w:val="yellow"/>
         </w:rPr>
-        <w:t>O 27º BPM abrange Luís Eduardo Magalhães (população de [PENDENTE] habitantes e área de [PENDENTE] km²) e, por meio da 4ª CIA destacada, São Desidério (32.828 habitantes e 15.157 km²) e os distritos de Roda Velha e Sítio Grande, totalizando aproximadamente [PENDENTE] habitantes. A região, marcada pelo agronegócio e pelo crescimento populacional acelerado, recebe intenso fluxo migratório, o que fragiliza vínculos familiares e comunitários e dificulta o acesso das mulheres à rede de proteção.</w:t>
+        <w:t>[INSERIR IMAGEM: Mapa da área de responsabilidade do 27º BPM (LEM, São Desidério, Roda Velha e Sítio Grande), com os bairros atendidos pela RMP – pode ser reaproveitado do slide 57 da apresentação]</w:t>
       </w:r>
     </w:p>
     <w:p>
@@ -1557,9 +1560,38 @@
           <w:color w:val="000000"/>
           <w:sz w:val="20"/>
           <w:szCs w:val="20"/>
+        </w:rPr>
+        <w:t>2. Rede de proteção e enfrentamento à violência contra a mulher</w:t>
+      </w:r>
+    </w:p>
+    <w:p>
+      <w:pPr>
+        <w:pBdr>
+          <w:top w:val="nil"/>
+          <w:left w:val="nil"/>
+          <w:bottom w:val="nil"/>
+          <w:right w:val="nil"/>
+          <w:between w:val="nil"/>
+        </w:pBdr>
+        <w:spacing w:line="360" w:lineRule="auto"/>
+        <w:ind w:firstLine="709"/>
+        <w:jc w:val="both"/>
+        <w:rPr>
+          <w:rFonts w:ascii="Verdana" w:eastAsia="Verdana" w:hAnsi="Verdana" w:cs="Verdana"/>
+          <w:color w:val="000000"/>
+          <w:sz w:val="20"/>
+          <w:szCs w:val="20"/>
+        </w:rPr>
+      </w:pPr>
+      <w:r>
+        <w:rPr>
+          <w:rFonts w:ascii="Verdana" w:eastAsia="Verdana" w:hAnsi="Verdana" w:cs="Verdana"/>
+          <w:color w:val="000000"/>
+          <w:sz w:val="20"/>
+          <w:szCs w:val="20"/>
           <w:highlight w:val="yellow"/>
         </w:rPr>
-        <w:t>[INSERIR IMAGEM: Mapa da área de responsabilidade do 27º BPM (LEM, São Desidério, Roda Velha e Sítio Grande), com os bairros atendidos pela RMP – pode ser reaproveitado do slide 57 da apresentação]</w:t>
+        <w:t>Delegacia: [PENDENTE – DEAM ou Delegacia Territorial de LEM];</w:t>
       </w:r>
     </w:p>
     <w:p>
@@ -1587,8 +1619,9 @@
           <w:color w:val="000000"/>
           <w:sz w:val="20"/>
           <w:szCs w:val="20"/>
-        </w:rPr>
-        <w:t>2. Rede de proteção e enfrentamento à violência contra a mulher</w:t>
+          <w:highlight w:val="yellow"/>
+        </w:rPr>
+        <w:t>Poder Judiciário: [PENDENTE – Vara Crime/Vara de Violência Doméstica da Comarca de LEM e de São Desidério];</w:t>
       </w:r>
     </w:p>
     <w:p>
@@ -1618,7 +1651,7 @@
           <w:szCs w:val="20"/>
           <w:highlight w:val="yellow"/>
         </w:rPr>
-        <w:t>Delegacia: [PENDENTE – DEAM ou Delegacia Territorial de LEM];</w:t>
+        <w:t>Ministério Público: [PENDENTE – Promotoria de Justiça de LEM];</w:t>
       </w:r>
     </w:p>
     <w:p>
@@ -1648,7 +1681,7 @@
           <w:szCs w:val="20"/>
           <w:highlight w:val="yellow"/>
         </w:rPr>
-        <w:t>Poder Judiciário: [PENDENTE – Vara Crime/Vara de Violência Doméstica da Comarca de LEM e de São Desidério];</w:t>
+        <w:t>Defensoria Pública: [PENDENTE];</w:t>
       </w:r>
     </w:p>
     <w:p>
@@ -1678,7 +1711,7 @@
           <w:szCs w:val="20"/>
           <w:highlight w:val="yellow"/>
         </w:rPr>
-        <w:t>Ministério Público: [PENDENTE – Promotoria de Justiça de LEM];</w:t>
+        <w:t>Subseção da OAB: [PENDENTE];</w:t>
       </w:r>
     </w:p>
     <w:p>
@@ -1708,7 +1741,7 @@
           <w:szCs w:val="20"/>
           <w:highlight w:val="yellow"/>
         </w:rPr>
-        <w:t>Defensoria Pública: [PENDENTE];</w:t>
+        <w:t>Secretaria Municipal / Coordenadoria da Mulher: [PENDENTE];</w:t>
       </w:r>
     </w:p>
     <w:p>
@@ -1738,7 +1771,7 @@
           <w:szCs w:val="20"/>
           <w:highlight w:val="yellow"/>
         </w:rPr>
-        <w:t>Subseção da OAB: [PENDENTE];</w:t>
+        <w:t>CRAM, CRAS e CREAS: [PENDENTE – quantidade de unidades em cada município];</w:t>
       </w:r>
     </w:p>
     <w:p>
@@ -1768,7 +1801,7 @@
           <w:szCs w:val="20"/>
           <w:highlight w:val="yellow"/>
         </w:rPr>
-        <w:t>Secretaria Municipal / Coordenadoria da Mulher: [PENDENTE];</w:t>
+        <w:t>Guarda Municipal: [PENDENTE];</w:t>
       </w:r>
     </w:p>
     <w:p>
@@ -1798,7 +1831,7 @@
           <w:szCs w:val="20"/>
           <w:highlight w:val="yellow"/>
         </w:rPr>
-        <w:t>CRAM, CRAS e CREAS: [PENDENTE – quantidade de unidades em cada município];</w:t>
+        <w:t>ONGs e Conselho Municipal dos Direitos da Mulher: [PENDENTE].</w:t>
       </w:r>
     </w:p>
     <w:p>
@@ -1826,9 +1859,38 @@
           <w:color w:val="000000"/>
           <w:sz w:val="20"/>
           <w:szCs w:val="20"/>
+        </w:rPr>
+        <w:t>3. Dados estatísticos de violência doméstica (últimos três anos)</w:t>
+      </w:r>
+    </w:p>
+    <w:p>
+      <w:pPr>
+        <w:pBdr>
+          <w:top w:val="nil"/>
+          <w:left w:val="nil"/>
+          <w:bottom w:val="nil"/>
+          <w:right w:val="nil"/>
+          <w:between w:val="nil"/>
+        </w:pBdr>
+        <w:spacing w:line="360" w:lineRule="auto"/>
+        <w:ind w:firstLine="709"/>
+        <w:jc w:val="both"/>
+        <w:rPr>
+          <w:rFonts w:ascii="Verdana" w:eastAsia="Verdana" w:hAnsi="Verdana" w:cs="Verdana"/>
+          <w:color w:val="000000"/>
+          <w:sz w:val="20"/>
+          <w:szCs w:val="20"/>
+        </w:rPr>
+      </w:pPr>
+      <w:r>
+        <w:rPr>
+          <w:rFonts w:ascii="Verdana" w:eastAsia="Verdana" w:hAnsi="Verdana" w:cs="Verdana"/>
+          <w:color w:val="000000"/>
+          <w:sz w:val="20"/>
+          <w:szCs w:val="20"/>
           <w:highlight w:val="yellow"/>
         </w:rPr>
-        <w:t>Guarda Municipal: [PENDENTE];</w:t>
+        <w:t>A análise das ocorrências registradas de 2023 a 2026 demonstra, somente em 2026, 314 ocorrências de “Maria da Penha” registradas no SIGESPOL até 12/10/2026, média superior a 01 (uma) ocorrência por dia, sendo 30 (trinta) registros apenas entre 29/09 e 12/10/2026, distribuídos entre Luís Eduardo Magalhães e São Desidério. Nos anos anteriores, verifica-se [PENDENTE – tendência de aumento/manutenção], com maior concentração nos bairros [PENDENTE], predominando os delitos de [PENDENTE – ameaça, lesão corporal, descumprimento de MPU]. Os dados são apresentados de forma agregada, sem qualquer elemento que permita a identificação de vítimas ou autores (LGPD).</w:t>
       </w:r>
     </w:p>
     <w:p>
@@ -1858,7 +1920,7 @@
           <w:szCs w:val="20"/>
           <w:highlight w:val="yellow"/>
         </w:rPr>
-        <w:t>ONGs e Conselho Municipal dos Direitos da Mulher: [PENDENTE].</w:t>
+        <w:t>[INSERIR IMAGEM: Gráfico de colunas – ocorrências de violência doméstica por ano (2023, 2024, 2025 e 2026) e por localidade (LEM, SD, RV, SG)]</w:t>
       </w:r>
     </w:p>
     <w:p>
@@ -1886,8 +1948,9 @@
           <w:color w:val="000000"/>
           <w:sz w:val="20"/>
           <w:szCs w:val="20"/>
-        </w:rPr>
-        <w:t>3. Dados estatísticos de violência doméstica (últimos três anos)</w:t>
+          <w:highlight w:val="yellow"/>
+        </w:rPr>
+        <w:t>[INSERIR IMAGEM: Mancha criminal de violência doméstica em 2026 – apenas por bairro/área, sem pontos de residência das vítimas]</w:t>
       </w:r>
     </w:p>
     <w:p>
@@ -1915,9 +1978,38 @@
           <w:color w:val="000000"/>
           <w:sz w:val="20"/>
           <w:szCs w:val="20"/>
+        </w:rPr>
+        <w:t>4. Medidas Protetivas de Urgência (últimos três anos)</w:t>
+      </w:r>
+    </w:p>
+    <w:p>
+      <w:pPr>
+        <w:pBdr>
+          <w:top w:val="nil"/>
+          <w:left w:val="nil"/>
+          <w:bottom w:val="nil"/>
+          <w:right w:val="nil"/>
+          <w:between w:val="nil"/>
+        </w:pBdr>
+        <w:spacing w:line="360" w:lineRule="auto"/>
+        <w:ind w:firstLine="709"/>
+        <w:jc w:val="both"/>
+        <w:rPr>
+          <w:rFonts w:ascii="Verdana" w:eastAsia="Verdana" w:hAnsi="Verdana" w:cs="Verdana"/>
+          <w:color w:val="000000"/>
+          <w:sz w:val="20"/>
+          <w:szCs w:val="20"/>
+        </w:rPr>
+      </w:pPr>
+      <w:r>
+        <w:rPr>
+          <w:rFonts w:ascii="Verdana" w:eastAsia="Verdana" w:hAnsi="Verdana" w:cs="Verdana"/>
+          <w:color w:val="000000"/>
+          <w:sz w:val="20"/>
+          <w:szCs w:val="20"/>
           <w:highlight w:val="yellow"/>
         </w:rPr>
-        <w:t>A análise das ocorrências registradas de 2023 a 2026 demonstra, somente em 2026, 314 ocorrências de “Maria da Penha” registradas no SIGESPOL até 12/10/2026, média superior a 01 (uma) ocorrência por dia, sendo 30 (trinta) registros apenas entre 29/09 e 12/10/2026, distribuídos entre Luís Eduardo Magalhães e São Desidério. Nos anos anteriores, verifica-se [PENDENTE – tendência de aumento/manutenção], com maior concentração nos bairros [PENDENTE], predominando os delitos de [PENDENTE – ameaça, lesão corporal, descumprimento de MPU]. Os dados são apresentados de forma agregada, sem qualquer elemento que permita a identificação de vítimas ou autores (LGPD).</w:t>
+        <w:t>A RMP acompanhava 192 (cento e noventa e duas) MPUs ativas em 2025 e acompanha, atualmente, 202 (duzentas e duas) MPUs ativas em 2026, aumento de aproximadamente 5%. As MPUs concedidas em 2023 e 2024 são: [PENDENTE]. A fiscalização regular desse universo já é realizada pelo efetivo do 27º BPM, sendo necessária a sua formalização para garantir gestão, controle e planejamento próprios.</w:t>
       </w:r>
     </w:p>
     <w:p>
@@ -1947,7 +2039,7 @@
           <w:szCs w:val="20"/>
           <w:highlight w:val="yellow"/>
         </w:rPr>
-        <w:t>[INSERIR IMAGEM: Gráfico de colunas – ocorrências de violência doméstica por ano (2023, 2024, 2025 e 2026) e por localidade (LEM, SD, RV, SG)]</w:t>
+        <w:t>[INSERIR IMAGEM: Gráfico de linha – MPUs concedidas por ano, com destaque para vigentes e descumpridas]</w:t>
       </w:r>
     </w:p>
     <w:p>
@@ -1975,9 +2067,38 @@
           <w:color w:val="000000"/>
           <w:sz w:val="20"/>
           <w:szCs w:val="20"/>
+        </w:rPr>
+        <w:t>5. Local de funcionamento</w:t>
+      </w:r>
+    </w:p>
+    <w:p>
+      <w:pPr>
+        <w:pBdr>
+          <w:top w:val="nil"/>
+          <w:left w:val="nil"/>
+          <w:bottom w:val="nil"/>
+          <w:right w:val="nil"/>
+          <w:between w:val="nil"/>
+        </w:pBdr>
+        <w:spacing w:line="360" w:lineRule="auto"/>
+        <w:ind w:firstLine="709"/>
+        <w:jc w:val="both"/>
+        <w:rPr>
+          <w:rFonts w:ascii="Verdana" w:eastAsia="Verdana" w:hAnsi="Verdana" w:cs="Verdana"/>
+          <w:color w:val="000000"/>
+          <w:sz w:val="20"/>
+          <w:szCs w:val="20"/>
+        </w:rPr>
+      </w:pPr>
+      <w:r>
+        <w:rPr>
+          <w:rFonts w:ascii="Verdana" w:eastAsia="Verdana" w:hAnsi="Verdana" w:cs="Verdana"/>
+          <w:color w:val="000000"/>
+          <w:sz w:val="20"/>
+          <w:szCs w:val="20"/>
           <w:highlight w:val="yellow"/>
         </w:rPr>
-        <w:t>[INSERIR IMAGEM: Mancha criminal de violência doméstica em 2026 – apenas por bairro/área, sem pontos de residência das vítimas]</w:t>
+        <w:t>A RMP do 27º BPM já dispõe de local próprio de funcionamento, em [PENDENTE – endereço/instalação], com ambiente reservado para o acolhimento das mulheres, garantindo privacidade no atendimento.</w:t>
       </w:r>
     </w:p>
     <w:p>
@@ -2005,8 +2126,9 @@
           <w:color w:val="000000"/>
           <w:sz w:val="20"/>
           <w:szCs w:val="20"/>
-        </w:rPr>
-        <w:t>4. Medidas Protetivas de Urgência (últimos três anos)</w:t>
+          <w:highlight w:val="yellow"/>
+        </w:rPr>
+        <w:t>[INSERIR IMAGEM: Foto da Sala Lilás / instalações da RMP – sem pessoas atendidas]</w:t>
       </w:r>
     </w:p>
     <w:p>
@@ -2034,9 +2156,38 @@
           <w:color w:val="000000"/>
           <w:sz w:val="20"/>
           <w:szCs w:val="20"/>
+        </w:rPr>
+        <w:t>6. Recursos humanos e materiais exclusivos</w:t>
+      </w:r>
+    </w:p>
+    <w:p>
+      <w:pPr>
+        <w:pBdr>
+          <w:top w:val="nil"/>
+          <w:left w:val="nil"/>
+          <w:bottom w:val="nil"/>
+          <w:right w:val="nil"/>
+          <w:between w:val="nil"/>
+        </w:pBdr>
+        <w:spacing w:line="360" w:lineRule="auto"/>
+        <w:ind w:firstLine="709"/>
+        <w:jc w:val="both"/>
+        <w:rPr>
+          <w:rFonts w:ascii="Verdana" w:eastAsia="Verdana" w:hAnsi="Verdana" w:cs="Verdana"/>
+          <w:color w:val="000000"/>
+          <w:sz w:val="20"/>
+          <w:szCs w:val="20"/>
+        </w:rPr>
+      </w:pPr>
+      <w:r>
+        <w:rPr>
+          <w:rFonts w:ascii="Verdana" w:eastAsia="Verdana" w:hAnsi="Verdana" w:cs="Verdana"/>
+          <w:color w:val="000000"/>
+          <w:sz w:val="20"/>
+          <w:szCs w:val="20"/>
           <w:highlight w:val="yellow"/>
         </w:rPr>
-        <w:t>Foram concedidas [PENDENTE] MPUs no período de 2023 a 2026, das quais [PENDENTE] permanecem vigentes. A fiscalização regular desse universo já é realizada pelo efetivo do 27º BPM, sendo necessária a sua formalização para garantir gestão, controle e planejamento próprios.</w:t>
+        <w:t>Em atendimento ao art. 4º, §2º, e art. 7º, §2º, da Portaria n.º 042-CG/2024, a RMP já conta com 05 (cinco) policiais militares do 27º BPM, efetivo mínimo exigido, sendo 01 (um) Oficial (Tenente PM), comandante da RMP, 01 (um) Sargento, 01 (um) Cabo e 02 (dois) Soldados, dos quais 02 (duas) são policiais femininas (relação nominal no Anexo B, de acesso restrito), empregados em guarnição tipo “B”, em regime de escala ordinário, empregados exclusivamente na atividade da RMP, todos com capacitação em enfrentamento à violência contra a mulher [PENDENTE – informar curso/estágio já realizado ou a ser agendado junto ao BPPM]. A RMP já dispõe de viatura exclusiva, [PENDENTE – prefixo e modelo], com cota de combustível sob gestão da Unidade.</w:t>
       </w:r>
     </w:p>
     <w:p>
@@ -2066,7 +2217,7 @@
           <w:szCs w:val="20"/>
           <w:highlight w:val="yellow"/>
         </w:rPr>
-        <w:t>[INSERIR IMAGEM: Gráfico de linha – MPUs concedidas por ano, com destaque para vigentes e descumpridas]</w:t>
+        <w:t>[INSERIR IMAGEM: Foto da viatura caracterizada destinada à RMP]</w:t>
       </w:r>
     </w:p>
     <w:p>
@@ -2095,7 +2246,7 @@
           <w:sz w:val="20"/>
           <w:szCs w:val="20"/>
         </w:rPr>
-        <w:t>5. Local de funcionamento</w:t>
+        <w:t>7. Outras informações</w:t>
       </w:r>
     </w:p>
     <w:p>
@@ -2123,187 +2274,8 @@
           <w:color w:val="000000"/>
           <w:sz w:val="20"/>
           <w:szCs w:val="20"/>
-          <w:highlight w:val="yellow"/>
-        </w:rPr>
-        <w:t>A RMP do 27º BPM funcionará [PENDENTE – na sede do Batalhão, à Rua Xique-Xique, Loteamento Santa Cruz, LEM / ou em outro espaço], em ambiente reservado para acolhimento (Sala Lilás), garantindo privacidade no atendimento às mulheres.</w:t>
-      </w:r>
-    </w:p>
-    <w:p>
-      <w:pPr>
-        <w:pBdr>
-          <w:top w:val="nil"/>
-          <w:left w:val="nil"/>
-          <w:bottom w:val="nil"/>
-          <w:right w:val="nil"/>
-          <w:between w:val="nil"/>
-        </w:pBdr>
-        <w:spacing w:line="360" w:lineRule="auto"/>
-        <w:ind w:firstLine="709"/>
-        <w:jc w:val="both"/>
-        <w:rPr>
-          <w:rFonts w:ascii="Verdana" w:eastAsia="Verdana" w:hAnsi="Verdana" w:cs="Verdana"/>
-          <w:color w:val="000000"/>
-          <w:sz w:val="20"/>
-          <w:szCs w:val="20"/>
-        </w:rPr>
-      </w:pPr>
-      <w:r>
-        <w:rPr>
-          <w:rFonts w:ascii="Verdana" w:eastAsia="Verdana" w:hAnsi="Verdana" w:cs="Verdana"/>
-          <w:color w:val="000000"/>
-          <w:sz w:val="20"/>
-          <w:szCs w:val="20"/>
-          <w:highlight w:val="yellow"/>
-        </w:rPr>
-        <w:t>[INSERIR IMAGEM: Foto da Sala Lilás / instalações da RMP – sem pessoas atendidas]</w:t>
-      </w:r>
-    </w:p>
-    <w:p>
-      <w:pPr>
-        <w:pBdr>
-          <w:top w:val="nil"/>
-          <w:left w:val="nil"/>
-          <w:bottom w:val="nil"/>
-          <w:right w:val="nil"/>
-          <w:between w:val="nil"/>
-        </w:pBdr>
-        <w:spacing w:line="360" w:lineRule="auto"/>
-        <w:ind w:firstLine="709"/>
-        <w:jc w:val="both"/>
-        <w:rPr>
-          <w:rFonts w:ascii="Verdana" w:eastAsia="Verdana" w:hAnsi="Verdana" w:cs="Verdana"/>
-          <w:color w:val="000000"/>
-          <w:sz w:val="20"/>
-          <w:szCs w:val="20"/>
-        </w:rPr>
-      </w:pPr>
-      <w:r>
-        <w:rPr>
-          <w:rFonts w:ascii="Verdana" w:eastAsia="Verdana" w:hAnsi="Verdana" w:cs="Verdana"/>
-          <w:color w:val="000000"/>
-          <w:sz w:val="20"/>
-          <w:szCs w:val="20"/>
-        </w:rPr>
-        <w:t>6. Recursos humanos e materiais exclusivos</w:t>
-      </w:r>
-    </w:p>
-    <w:p>
-      <w:pPr>
-        <w:pBdr>
-          <w:top w:val="nil"/>
-          <w:left w:val="nil"/>
-          <w:bottom w:val="nil"/>
-          <w:right w:val="nil"/>
-          <w:between w:val="nil"/>
-        </w:pBdr>
-        <w:spacing w:line="360" w:lineRule="auto"/>
-        <w:ind w:firstLine="709"/>
-        <w:jc w:val="both"/>
-        <w:rPr>
-          <w:rFonts w:ascii="Verdana" w:eastAsia="Verdana" w:hAnsi="Verdana" w:cs="Verdana"/>
-          <w:color w:val="000000"/>
-          <w:sz w:val="20"/>
-          <w:szCs w:val="20"/>
-        </w:rPr>
-      </w:pPr>
-      <w:r>
-        <w:rPr>
-          <w:rFonts w:ascii="Verdana" w:eastAsia="Verdana" w:hAnsi="Verdana" w:cs="Verdana"/>
-          <w:color w:val="000000"/>
-          <w:sz w:val="20"/>
-          <w:szCs w:val="20"/>
-          <w:highlight w:val="yellow"/>
-        </w:rPr>
-        <w:t>Em atendimento ao art. 4º, §2º, e art. 7º, §2º, da Portaria n.º 042-CG/2024, a RMP já conta com 05 (cinco) policiais militares do 27º BPM, efetivo mínimo exigido, sendo 01 (um) Oficial (Tenente PM), comandante da RMP, 01 (um) Sargento, 01 (um) Cabo e 02 (dois) Soldados, dos quais 02 (duas) são policiais femininas (relação nominal no Anexo B, de acesso restrito), empregados em guarnição tipo “B”, em regime de escala ordinário, todos com capacitação em enfrentamento à violência contra a mulher [PENDENTE – informar curso/estágio já realizado ou a ser agendado junto ao BPPM]. Está destinada exclusivamente à RMP a viatura [PENDENTE – prefixo e modelo], com cota de combustível sob gestão da Unidade.</w:t>
-      </w:r>
-    </w:p>
-    <w:p>
-      <w:pPr>
-        <w:pBdr>
-          <w:top w:val="nil"/>
-          <w:left w:val="nil"/>
-          <w:bottom w:val="nil"/>
-          <w:right w:val="nil"/>
-          <w:between w:val="nil"/>
-        </w:pBdr>
-        <w:spacing w:line="360" w:lineRule="auto"/>
-        <w:ind w:firstLine="709"/>
-        <w:jc w:val="both"/>
-        <w:rPr>
-          <w:rFonts w:ascii="Verdana" w:eastAsia="Verdana" w:hAnsi="Verdana" w:cs="Verdana"/>
-          <w:color w:val="000000"/>
-          <w:sz w:val="20"/>
-          <w:szCs w:val="20"/>
-        </w:rPr>
-      </w:pPr>
-      <w:r>
-        <w:rPr>
-          <w:rFonts w:ascii="Verdana" w:eastAsia="Verdana" w:hAnsi="Verdana" w:cs="Verdana"/>
-          <w:color w:val="000000"/>
-          <w:sz w:val="20"/>
-          <w:szCs w:val="20"/>
-          <w:highlight w:val="yellow"/>
-        </w:rPr>
-        <w:t>[INSERIR IMAGEM: Foto da viatura caracterizada destinada à RMP]</w:t>
-      </w:r>
-    </w:p>
-    <w:p>
-      <w:pPr>
-        <w:pBdr>
-          <w:top w:val="nil"/>
-          <w:left w:val="nil"/>
-          <w:bottom w:val="nil"/>
-          <w:right w:val="nil"/>
-          <w:between w:val="nil"/>
-        </w:pBdr>
-        <w:spacing w:line="360" w:lineRule="auto"/>
-        <w:ind w:firstLine="709"/>
-        <w:jc w:val="both"/>
-        <w:rPr>
-          <w:rFonts w:ascii="Verdana" w:eastAsia="Verdana" w:hAnsi="Verdana" w:cs="Verdana"/>
-          <w:color w:val="000000"/>
-          <w:sz w:val="20"/>
-          <w:szCs w:val="20"/>
-        </w:rPr>
-      </w:pPr>
-      <w:r>
-        <w:rPr>
-          <w:rFonts w:ascii="Verdana" w:eastAsia="Verdana" w:hAnsi="Verdana" w:cs="Verdana"/>
-          <w:color w:val="000000"/>
-          <w:sz w:val="20"/>
-          <w:szCs w:val="20"/>
-        </w:rPr>
-        <w:t>7. Outras informações</w:t>
-      </w:r>
-    </w:p>
-    <w:p>
-      <w:pPr>
-        <w:pBdr>
-          <w:top w:val="nil"/>
-          <w:left w:val="nil"/>
-          <w:bottom w:val="nil"/>
-          <w:right w:val="nil"/>
-          <w:between w:val="nil"/>
-        </w:pBdr>
-        <w:spacing w:line="360" w:lineRule="auto"/>
-        <w:ind w:firstLine="709"/>
-        <w:jc w:val="both"/>
-        <w:rPr>
-          <w:rFonts w:ascii="Verdana" w:eastAsia="Verdana" w:hAnsi="Verdana" w:cs="Verdana"/>
-          <w:color w:val="000000"/>
-          <w:sz w:val="20"/>
-          <w:szCs w:val="20"/>
-        </w:rPr>
-      </w:pPr>
-      <w:r>
-        <w:rPr>
-          <w:rFonts w:ascii="Verdana" w:eastAsia="Verdana" w:hAnsi="Verdana" w:cs="Verdana"/>
-          <w:color w:val="000000"/>
-          <w:sz w:val="20"/>
-          <w:szCs w:val="20"/>
-          <w:highlight w:val="yellow"/>
-        </w:rPr>
-        <w:t>A atuação já desenvolvida na área do 27º BPM (fiscalização de MPU, atendimento pós-ocorrência, palestras e Sala Lilás) demonstra a viabilidade da formalização. Registra-se, ainda, a produtividade de [PENDENTE – visitas, palestras e prisões por descumprimento no último ano]. A RMP também atuará no cumprimento da Portaria n.º 083-CG/2026, apoiando os casos que envolvam policiais militares e conduzindo o projeto “Homens em Diálogo”.</w:t>
+        </w:rPr>
+        <w:t>A atuação já desenvolvida na área do 27º BPM (fiscalização de MPU, atendimento pós-ocorrência, palestras e Sala Lilás) demonstra a viabilidade da formalização. Registra-se, ainda, a realização de mais de 25 (vinte e cinco) palestras em 2025 e de 22 (vinte e duas) palestras em 2026, até a presente data, voltadas ao público interno e externo (art. 2º, IV, da Portaria n.º 042-CG/2024). A RMP também atuará no cumprimento da Portaria n.º 083-CG/2026, apoiando os casos que envolvam policiais militares e conduzindo o projeto “Homens em Diálogo”.</w:t>
       </w:r>
     </w:p>
     <w:p>
@@ -2725,7 +2697,7 @@
           <w:sz w:val="20"/>
           <w:szCs w:val="20"/>
         </w:rPr>
-        <w:t>A área do 27º BPM apresenta cenário de violência doméstica e familiar contra a mulher que exige atuação especializada e permanente, evidenciado pelas 314 ocorrências e 03 feminicídios registrados em 2026, pelo volume de MPUs concedidas e pela extensa área territorial atendida.</w:t>
+        <w:t>A área do 27º BPM apresenta cenário de violência doméstica e familiar contra a mulher que exige atuação especializada e permanente, evidenciado pelas 314 ocorrências e 03 feminicídios registrados em 2026, pelas 202 MPUs ativas e pela extensa área territorial atendida.</w:t>
       </w:r>
     </w:p>
     <w:p>

</xml_diff>

<commit_message>
Corrige item de MPU nos Fatos
Co-Authored-By: Claude Opus 5.5 <noreply@anthropic.com>
Claude-Session: https://claude.ai/code/session_01NkJxMjLTPT7uCe2XDfKQHG
</commit_message>
<xml_diff>
--- a/estudo/Estudo_de_Situacao_RMP_27BPM.docx
+++ b/estudo/Estudo_de_Situacao_RMP_27BPM.docx
@@ -1252,7 +1252,33 @@
           <w:szCs w:val="20"/>
           <w:highlight w:val="yellow"/>
         </w:rPr>
-        <w:t>Acompanhamento, pela RMP, de 192 (cento e noventa e duas) Medidas Protetivas de Urgência ativas em 2025 e de 202 (duzentas e duas) ativas em 2026 (até a presente data), restando levantar as MPUs concedidas em 2023 e 2024 [PENDENTE];Registro de [PENDENTE] descumprimentos de MPU no período analisado;</w:t>
+        <w:t>Acompanhamento, pela RMP, de 192 (cento e noventa e duas) Medidas Protetivas de Urgência ativas em 2025 e de 202 (duzentas e duas) ativas em 2026 (até a presente data), restando levantar as MPUs concedidas em 2023 e 2024 [PENDENTE];</w:t>
+      </w:r>
+      <w:proofErr w:type="gramStart"/>
+      <w:proofErr w:type="gramEnd"/>
+    </w:p>
+    <w:p>
+      <w:pPr>
+        <w:numPr>
+          <w:ilvl w:val="0"/>
+          <w:numId w:val="6"/>
+        </w:numPr>
+        <w:spacing w:line="360" w:lineRule="auto"/>
+        <w:jc w:val="both"/>
+        <w:rPr>
+          <w:rFonts w:ascii="Verdana" w:eastAsia="Verdana" w:hAnsi="Verdana" w:cs="Verdana"/>
+          <w:sz w:val="20"/>
+          <w:szCs w:val="20"/>
+        </w:rPr>
+      </w:pPr>
+      <w:r>
+        <w:rPr>
+          <w:rFonts w:ascii="Verdana" w:eastAsia="Verdana" w:hAnsi="Verdana" w:cs="Verdana"/>
+          <w:sz w:val="20"/>
+          <w:szCs w:val="20"/>
+          <w:highlight w:val="yellow"/>
+        </w:rPr>
+        <w:t>Registro de [PENDENTE] descumprimentos de MPU no período analisado;</w:t>
       </w:r>
       <w:proofErr w:type="gramStart"/>
       <w:proofErr w:type="gramEnd"/>

</xml_diff>

<commit_message>
Inclui ocorrências de 2024 e 2025
Co-Authored-By: Claude Opus 5.5 <noreply@anthropic.com>
Claude-Session: https://claude.ai/code/session_01NkJxMjLTPT7uCe2XDfKQHG
</commit_message>
<xml_diff>
--- a/estudo/Estudo_de_Situacao_RMP_27BPM.docx
+++ b/estudo/Estudo_de_Situacao_RMP_27BPM.docx
@@ -1226,7 +1226,7 @@
           <w:szCs w:val="20"/>
           <w:highlight w:val="yellow"/>
         </w:rPr>
-        <w:t>Registro de [PENDENTE] ocorrências de violência doméstica e familiar contra a mulher em 2023, [PENDENTE] em 2024, [PENDENTE] em 2025 e 314 (trezentas e quatorze) em 2026 (até 12/10/2026, conforme SIGESPOL);</w:t>
+        <w:t>Registro de [PENDENTE] ocorrências de violência doméstica e familiar contra a mulher em 2023, 382 (trezentas e oitenta e duas) em 2024, 404 (quatrocentas e quatro) em 2025 e 314 (trezentas e quatorze) em 2026 (até 12/10/2026, conforme SIGESPOL);</w:t>
       </w:r>
       <w:proofErr w:type="gramStart"/>
       <w:proofErr w:type="gramEnd"/>
@@ -1916,7 +1916,7 @@
           <w:szCs w:val="20"/>
           <w:highlight w:val="yellow"/>
         </w:rPr>
-        <w:t>A análise das ocorrências registradas de 2023 a 2026 demonstra, somente em 2026, 314 ocorrências de “Maria da Penha” registradas no SIGESPOL até 12/10/2026, média superior a 01 (uma) ocorrência por dia, sendo 30 (trinta) registros apenas entre 29/09 e 12/10/2026, distribuídos entre Luís Eduardo Magalhães e São Desidério. Nos anos anteriores, verifica-se [PENDENTE – tendência de aumento/manutenção], com maior concentração nos bairros [PENDENTE], predominando os delitos de [PENDENTE – ameaça, lesão corporal, descumprimento de MPU]. Os dados são apresentados de forma agregada, sem qualquer elemento que permita a identificação de vítimas ou autores (LGPD).</w:t>
+        <w:t>A análise das ocorrências registradas de 2023 a 2026 demonstra, somente em 2026, 314 ocorrências de “Maria da Penha” registradas no SIGESPOL até 12/10/2026, média superior a 01 (uma) ocorrência por dia, sendo 30 (trinta) registros apenas entre 29/09 e 12/10/2026, distribuídos entre Luís Eduardo Magalhães e São Desidério. Nos anos anteriores, foram registradas 382 ocorrências em 2024 e 404 em 2025, aumento de aproximadamente 6%. Mantida a média diária de 2026 (cerca de 1,1 ocorrência por dia), a projeção para o ano é de aproximadamente 400 ocorrências, confirmando o patamar elevado e constante da demanda. Os dados de 2023 são: [PENDENTE]. Observa-se maior concentração nos bairros [PENDENTE], predominando os delitos de [PENDENTE – ameaça, lesão corporal, descumprimento de MPU]. Os dados são apresentados de forma agregada, sem qualquer elemento que permita a identificação de vítimas ou autores (LGPD).</w:t>
       </w:r>
     </w:p>
     <w:p>

</xml_diff>

<commit_message>
ES 019/2026: rede de proteção, viatura, local, capacitação; remove 2023
Co-Authored-By: Claude Opus 5.5 <noreply@anthropic.com>
Claude-Session: https://claude.ai/code/session_01NkJxMjLTPT7uCe2XDfKQHG
</commit_message>
<xml_diff>
--- a/estudo/Estudo_de_Situacao_RMP_27BPM.docx
+++ b/estudo/Estudo_de_Situacao_RMP_27BPM.docx
@@ -742,9 +742,8 @@
           <w:color w:val="000000"/>
           <w:sz w:val="20"/>
           <w:szCs w:val="20"/>
-          <w:highlight w:val="yellow"/>
-        </w:rPr>
-        <w:t>ESTUDO DE SITUAÇÃO Nº 0[PENDENTE]/2026</w:t>
+        </w:rPr>
+        <w:t>ESTUDO DE SITUAÇÃO Nº 019/2026</w:t>
       </w:r>
     </w:p>
     <w:p>
@@ -1224,9 +1223,8 @@
           <w:rFonts w:ascii="Verdana" w:eastAsia="Verdana" w:hAnsi="Verdana" w:cs="Verdana"/>
           <w:sz w:val="20"/>
           <w:szCs w:val="20"/>
-          <w:highlight w:val="yellow"/>
-        </w:rPr>
-        <w:t>Registro de [PENDENTE] ocorrências de violência doméstica e familiar contra a mulher em 2023, 382 (trezentas e oitenta e duas) em 2024, 404 (quatrocentas e quatro) em 2025 e 314 (trezentas e quatorze) em 2026 (até 12/10/2026, conforme SIGESPOL);</w:t>
+        </w:rPr>
+        <w:t>Registro de 382 (trezentas e oitenta e duas) ocorrências de violência doméstica e familiar contra a mulher em 2024, 404 (quatrocentas e quatro) em 2025 e 314 (trezentas e quatorze) em 2026 (até 12/10/2026, conforme SIGESPOL);</w:t>
       </w:r>
       <w:proofErr w:type="gramStart"/>
       <w:proofErr w:type="gramEnd"/>
@@ -1250,9 +1248,8 @@
           <w:rFonts w:ascii="Verdana" w:eastAsia="Verdana" w:hAnsi="Verdana" w:cs="Verdana"/>
           <w:sz w:val="20"/>
           <w:szCs w:val="20"/>
-          <w:highlight w:val="yellow"/>
-        </w:rPr>
-        <w:t>Acompanhamento, pela RMP, de 192 (cento e noventa e duas) Medidas Protetivas de Urgência ativas em 2025 e de 202 (duzentas e duas) ativas em 2026 (até a presente data), restando levantar as MPUs concedidas em 2023 e 2024 [PENDENTE];</w:t>
+        </w:rPr>
+        <w:t>Acompanhamento, pela RMP, de 192 (cento e noventa e duas) Medidas Protetivas de Urgência ativas em 2025 e de 202 (duzentas e duas) ativas em 2026 (até a presente data);</w:t>
       </w:r>
       <w:proofErr w:type="gramStart"/>
       <w:proofErr w:type="gramEnd"/>
@@ -1276,9 +1273,8 @@
           <w:rFonts w:ascii="Verdana" w:eastAsia="Verdana" w:hAnsi="Verdana" w:cs="Verdana"/>
           <w:sz w:val="20"/>
           <w:szCs w:val="20"/>
-          <w:highlight w:val="yellow"/>
-        </w:rPr>
-        <w:t>Registro de [PENDENTE] descumprimentos de MPU no período analisado;</w:t>
+        </w:rPr>
+        <w:t>Fiscalização das MPUs já executada por 05 (cinco) policiais militares do 27º BPM em Luís Eduardo Magalhães, porém com vinculação formal à Unidade da Ronda Maria da Penha da 83ª CIPM/Barreiras;</w:t>
       </w:r>
       <w:proofErr w:type="gramStart"/>
       <w:proofErr w:type="gramEnd"/>
@@ -1303,7 +1299,7 @@
           <w:sz w:val="20"/>
           <w:szCs w:val="20"/>
         </w:rPr>
-        <w:t>Fiscalização das MPUs já executada por 05 (cinco) policiais militares do 27º BPM em Luís Eduardo Magalhães, porém com vinculação formal à Unidade da Ronda Maria da Penha da 83ª CIPM/Barreiras;</w:t>
+        <w:t>Área de responsabilidade composta por Luís Eduardo Magalhães, São Desidério e distritos, com grande extensão territorial e zona rural dispersa;</w:t>
       </w:r>
       <w:proofErr w:type="gramStart"/>
       <w:proofErr w:type="gramEnd"/>
@@ -1328,7 +1324,7 @@
           <w:sz w:val="20"/>
           <w:szCs w:val="20"/>
         </w:rPr>
-        <w:t>Área de responsabilidade composta por Luís Eduardo Magalhães, São Desidério e distritos, com grande extensão territorial e zona rural dispersa;</w:t>
+        <w:t>Criação do 27º BPM (Lei n.º 14.962/2025), com autonomia administrativa e operacional;</w:t>
       </w:r>
       <w:proofErr w:type="gramStart"/>
       <w:proofErr w:type="gramEnd"/>
@@ -1353,7 +1349,7 @@
           <w:sz w:val="20"/>
           <w:szCs w:val="20"/>
         </w:rPr>
-        <w:t>Criação do 27º BPM (Lei n.º 14.962/2025), com autonomia administrativa e operacional;</w:t>
+        <w:t>Existência, no município, de rede de proteção apta à integração com a RMP (detalhada na Discussão);</w:t>
       </w:r>
       <w:proofErr w:type="gramStart"/>
       <w:proofErr w:type="gramEnd"/>
@@ -1378,31 +1374,6 @@
           <w:sz w:val="20"/>
           <w:szCs w:val="20"/>
         </w:rPr>
-        <w:t>Existência, no município, de rede de proteção apta à integração com a RMP (detalhada na Discussão);</w:t>
-      </w:r>
-      <w:proofErr w:type="gramStart"/>
-      <w:proofErr w:type="gramEnd"/>
-    </w:p>
-    <w:p>
-      <w:pPr>
-        <w:numPr>
-          <w:ilvl w:val="0"/>
-          <w:numId w:val="6"/>
-        </w:numPr>
-        <w:spacing w:line="360" w:lineRule="auto"/>
-        <w:jc w:val="both"/>
-        <w:rPr>
-          <w:rFonts w:ascii="Verdana" w:eastAsia="Verdana" w:hAnsi="Verdana" w:cs="Verdana"/>
-          <w:sz w:val="20"/>
-          <w:szCs w:val="20"/>
-        </w:rPr>
-      </w:pPr>
-      <w:r>
-        <w:rPr>
-          <w:rFonts w:ascii="Verdana" w:eastAsia="Verdana" w:hAnsi="Verdana" w:cs="Verdana"/>
-          <w:sz w:val="20"/>
-          <w:szCs w:val="20"/>
-        </w:rPr>
         <w:t>Vigência da Lei n.º 15.383/2026 (monitoração eletrônica de agressores) e da Lei n.º 15.384/2026 (violência vicária), que ampliam a demanda de fiscalização.</w:t>
       </w:r>
       <w:proofErr w:type="gramStart"/>
@@ -1615,9 +1586,154 @@
           <w:color w:val="000000"/>
           <w:sz w:val="20"/>
           <w:szCs w:val="20"/>
+        </w:rPr>
+        <w:t>Delegacia de Polícia de Luís Eduardo Magalhães – (77) 99929-1570;</w:t>
+      </w:r>
+    </w:p>
+    <w:p>
+      <w:pPr>
+        <w:pBdr>
+          <w:top w:val="nil"/>
+          <w:left w:val="nil"/>
+          <w:bottom w:val="nil"/>
+          <w:right w:val="nil"/>
+          <w:between w:val="nil"/>
+        </w:pBdr>
+        <w:spacing w:line="360" w:lineRule="auto"/>
+        <w:ind w:firstLine="709"/>
+        <w:jc w:val="both"/>
+        <w:rPr>
+          <w:rFonts w:ascii="Verdana" w:eastAsia="Verdana" w:hAnsi="Verdana" w:cs="Verdana"/>
+          <w:color w:val="000000"/>
+          <w:sz w:val="20"/>
+          <w:szCs w:val="20"/>
+        </w:rPr>
+      </w:pPr>
+      <w:r>
+        <w:rPr>
+          <w:rFonts w:ascii="Verdana" w:eastAsia="Verdana" w:hAnsi="Verdana" w:cs="Verdana"/>
+          <w:color w:val="000000"/>
+          <w:sz w:val="20"/>
+          <w:szCs w:val="20"/>
+        </w:rPr>
+        <w:t>Poder Judiciário – Fórum da Comarca de Luís Eduardo Magalhães – (77) 3628-8213 / (77) 3628-8214;</w:t>
+      </w:r>
+    </w:p>
+    <w:p>
+      <w:pPr>
+        <w:pBdr>
+          <w:top w:val="nil"/>
+          <w:left w:val="nil"/>
+          <w:bottom w:val="nil"/>
+          <w:right w:val="nil"/>
+          <w:between w:val="nil"/>
+        </w:pBdr>
+        <w:spacing w:line="360" w:lineRule="auto"/>
+        <w:ind w:firstLine="709"/>
+        <w:jc w:val="both"/>
+        <w:rPr>
+          <w:rFonts w:ascii="Verdana" w:eastAsia="Verdana" w:hAnsi="Verdana" w:cs="Verdana"/>
+          <w:color w:val="000000"/>
+          <w:sz w:val="20"/>
+          <w:szCs w:val="20"/>
+        </w:rPr>
+      </w:pPr>
+      <w:r>
+        <w:rPr>
+          <w:rFonts w:ascii="Verdana" w:eastAsia="Verdana" w:hAnsi="Verdana" w:cs="Verdana"/>
+          <w:color w:val="000000"/>
+          <w:sz w:val="20"/>
+          <w:szCs w:val="20"/>
+        </w:rPr>
+        <w:t>Ministério Público – Promotoria de Justiça de Luís Eduardo Magalhães – (77) 3628-0513 / (77) 3628-0153;</w:t>
+      </w:r>
+    </w:p>
+    <w:p>
+      <w:pPr>
+        <w:pBdr>
+          <w:top w:val="nil"/>
+          <w:left w:val="nil"/>
+          <w:bottom w:val="nil"/>
+          <w:right w:val="nil"/>
+          <w:between w:val="nil"/>
+        </w:pBdr>
+        <w:spacing w:line="360" w:lineRule="auto"/>
+        <w:ind w:firstLine="709"/>
+        <w:jc w:val="both"/>
+        <w:rPr>
+          <w:rFonts w:ascii="Verdana" w:eastAsia="Verdana" w:hAnsi="Verdana" w:cs="Verdana"/>
+          <w:color w:val="000000"/>
+          <w:sz w:val="20"/>
+          <w:szCs w:val="20"/>
+        </w:rPr>
+      </w:pPr>
+      <w:r>
+        <w:rPr>
+          <w:rFonts w:ascii="Verdana" w:eastAsia="Verdana" w:hAnsi="Verdana" w:cs="Verdana"/>
+          <w:color w:val="000000"/>
+          <w:sz w:val="20"/>
+          <w:szCs w:val="20"/>
+        </w:rPr>
+        <w:t>Defensoria Pública – (77) 3628-8997;</w:t>
+      </w:r>
+    </w:p>
+    <w:p>
+      <w:pPr>
+        <w:pBdr>
+          <w:top w:val="nil"/>
+          <w:left w:val="nil"/>
+          <w:bottom w:val="nil"/>
+          <w:right w:val="nil"/>
+          <w:between w:val="nil"/>
+        </w:pBdr>
+        <w:spacing w:line="360" w:lineRule="auto"/>
+        <w:ind w:firstLine="709"/>
+        <w:jc w:val="both"/>
+        <w:rPr>
+          <w:rFonts w:ascii="Verdana" w:eastAsia="Verdana" w:hAnsi="Verdana" w:cs="Verdana"/>
+          <w:color w:val="000000"/>
+          <w:sz w:val="20"/>
+          <w:szCs w:val="20"/>
+        </w:rPr>
+      </w:pPr>
+      <w:r>
+        <w:rPr>
+          <w:rFonts w:ascii="Verdana" w:eastAsia="Verdana" w:hAnsi="Verdana" w:cs="Verdana"/>
+          <w:color w:val="000000"/>
+          <w:sz w:val="20"/>
+          <w:szCs w:val="20"/>
+        </w:rPr>
+        <w:t>Subseção da OAB – (77) 99839-1520;</w:t>
+      </w:r>
+    </w:p>
+    <w:p>
+      <w:pPr>
+        <w:pBdr>
+          <w:top w:val="nil"/>
+          <w:left w:val="nil"/>
+          <w:bottom w:val="nil"/>
+          <w:right w:val="nil"/>
+          <w:between w:val="nil"/>
+        </w:pBdr>
+        <w:spacing w:line="360" w:lineRule="auto"/>
+        <w:ind w:firstLine="709"/>
+        <w:jc w:val="both"/>
+        <w:rPr>
+          <w:rFonts w:ascii="Verdana" w:eastAsia="Verdana" w:hAnsi="Verdana" w:cs="Verdana"/>
+          <w:color w:val="000000"/>
+          <w:sz w:val="20"/>
+          <w:szCs w:val="20"/>
+        </w:rPr>
+      </w:pPr>
+      <w:r>
+        <w:rPr>
+          <w:rFonts w:ascii="Verdana" w:eastAsia="Verdana" w:hAnsi="Verdana" w:cs="Verdana"/>
+          <w:color w:val="000000"/>
+          <w:sz w:val="20"/>
+          <w:szCs w:val="20"/>
           <w:highlight w:val="yellow"/>
         </w:rPr>
-        <w:t>Delegacia: [PENDENTE – DEAM ou Delegacia Territorial de LEM];</w:t>
+        <w:t>Secretaria Municipal / Coordenadoria da Mulher: [PENDENTE];</w:t>
       </w:r>
     </w:p>
     <w:p>
@@ -1645,9 +1761,154 @@
           <w:color w:val="000000"/>
           <w:sz w:val="20"/>
           <w:szCs w:val="20"/>
+        </w:rPr>
+        <w:t>Centro de Atendimento à Mulher (CAM) – (77) 99933-8740;</w:t>
+      </w:r>
+    </w:p>
+    <w:p>
+      <w:pPr>
+        <w:pBdr>
+          <w:top w:val="nil"/>
+          <w:left w:val="nil"/>
+          <w:bottom w:val="nil"/>
+          <w:right w:val="nil"/>
+          <w:between w:val="nil"/>
+        </w:pBdr>
+        <w:spacing w:line="360" w:lineRule="auto"/>
+        <w:ind w:firstLine="709"/>
+        <w:jc w:val="both"/>
+        <w:rPr>
+          <w:rFonts w:ascii="Verdana" w:eastAsia="Verdana" w:hAnsi="Verdana" w:cs="Verdana"/>
+          <w:color w:val="000000"/>
+          <w:sz w:val="20"/>
+          <w:szCs w:val="20"/>
+        </w:rPr>
+      </w:pPr>
+      <w:r>
+        <w:rPr>
+          <w:rFonts w:ascii="Verdana" w:eastAsia="Verdana" w:hAnsi="Verdana" w:cs="Verdana"/>
+          <w:color w:val="000000"/>
+          <w:sz w:val="20"/>
+          <w:szCs w:val="20"/>
+        </w:rPr>
+        <w:t>Guarda Municipal – (77) 99934-4109;</w:t>
+      </w:r>
+    </w:p>
+    <w:p>
+      <w:pPr>
+        <w:pBdr>
+          <w:top w:val="nil"/>
+          <w:left w:val="nil"/>
+          <w:bottom w:val="nil"/>
+          <w:right w:val="nil"/>
+          <w:between w:val="nil"/>
+        </w:pBdr>
+        <w:spacing w:line="360" w:lineRule="auto"/>
+        <w:ind w:firstLine="709"/>
+        <w:jc w:val="both"/>
+        <w:rPr>
+          <w:rFonts w:ascii="Verdana" w:eastAsia="Verdana" w:hAnsi="Verdana" w:cs="Verdana"/>
+          <w:color w:val="000000"/>
+          <w:sz w:val="20"/>
+          <w:szCs w:val="20"/>
+        </w:rPr>
+      </w:pPr>
+      <w:r>
+        <w:rPr>
+          <w:rFonts w:ascii="Verdana" w:eastAsia="Verdana" w:hAnsi="Verdana" w:cs="Verdana"/>
+          <w:color w:val="000000"/>
+          <w:sz w:val="20"/>
+          <w:szCs w:val="20"/>
+        </w:rPr>
+        <w:t>Conselho Municipal dos Direitos da Mulher / ONGs – (77) 99932-2032.</w:t>
+      </w:r>
+    </w:p>
+    <w:p>
+      <w:pPr>
+        <w:pBdr>
+          <w:top w:val="nil"/>
+          <w:left w:val="nil"/>
+          <w:bottom w:val="nil"/>
+          <w:right w:val="nil"/>
+          <w:between w:val="nil"/>
+        </w:pBdr>
+        <w:spacing w:line="360" w:lineRule="auto"/>
+        <w:ind w:firstLine="709"/>
+        <w:jc w:val="both"/>
+        <w:rPr>
+          <w:rFonts w:ascii="Verdana" w:eastAsia="Verdana" w:hAnsi="Verdana" w:cs="Verdana"/>
+          <w:color w:val="000000"/>
+          <w:sz w:val="20"/>
+          <w:szCs w:val="20"/>
+        </w:rPr>
+      </w:pPr>
+      <w:r>
+        <w:rPr>
+          <w:rFonts w:ascii="Verdana" w:eastAsia="Verdana" w:hAnsi="Verdana" w:cs="Verdana"/>
+          <w:color w:val="000000"/>
+          <w:sz w:val="20"/>
+          <w:szCs w:val="20"/>
+        </w:rPr>
+        <w:t>3. Dados estatísticos de violência doméstica (últimos três anos – fonte: SIGESPOL)</w:t>
+      </w:r>
+    </w:p>
+    <w:p>
+      <w:pPr>
+        <w:pBdr>
+          <w:top w:val="nil"/>
+          <w:left w:val="nil"/>
+          <w:bottom w:val="nil"/>
+          <w:right w:val="nil"/>
+          <w:between w:val="nil"/>
+        </w:pBdr>
+        <w:spacing w:line="360" w:lineRule="auto"/>
+        <w:ind w:firstLine="709"/>
+        <w:jc w:val="both"/>
+        <w:rPr>
+          <w:rFonts w:ascii="Verdana" w:eastAsia="Verdana" w:hAnsi="Verdana" w:cs="Verdana"/>
+          <w:color w:val="000000"/>
+          <w:sz w:val="20"/>
+          <w:szCs w:val="20"/>
+        </w:rPr>
+      </w:pPr>
+      <w:r>
+        <w:rPr>
+          <w:rFonts w:ascii="Verdana" w:eastAsia="Verdana" w:hAnsi="Verdana" w:cs="Verdana"/>
+          <w:color w:val="000000"/>
+          <w:sz w:val="20"/>
+          <w:szCs w:val="20"/>
+        </w:rPr>
+        <w:t>A análise das ocorrências registradas de 2024 a 2026 demonstra, somente em 2026, 314 ocorrências de “Maria da Penha” registradas no SIGESPOL até 12/10/2026, média superior a 01 (uma) ocorrência por dia, sendo 30 (trinta) registros apenas entre 29/09 e 12/10/2026, distribuídos entre Luís Eduardo Magalhães e São Desidério. Nos anos anteriores, foram registradas 382 ocorrências em 2024 e 404 em 2025, aumento de aproximadamente 6%. Mantida a média diária de 2026 (cerca de 1,1 ocorrência por dia), a projeção para o ano é de aproximadamente 400 ocorrências, confirmando o patamar elevado e constante da demanda. Observa-se maior concentração de ocorrências no bairro Santa Cruz. Os dados são apresentados de forma agregada, sem qualquer elemento que permita a identificação de vítimas ou autores (LGPD).</w:t>
+      </w:r>
+    </w:p>
+    <w:p>
+      <w:pPr>
+        <w:pBdr>
+          <w:top w:val="nil"/>
+          <w:left w:val="nil"/>
+          <w:bottom w:val="nil"/>
+          <w:right w:val="nil"/>
+          <w:between w:val="nil"/>
+        </w:pBdr>
+        <w:spacing w:line="360" w:lineRule="auto"/>
+        <w:ind w:firstLine="709"/>
+        <w:jc w:val="both"/>
+        <w:rPr>
+          <w:rFonts w:ascii="Verdana" w:eastAsia="Verdana" w:hAnsi="Verdana" w:cs="Verdana"/>
+          <w:color w:val="000000"/>
+          <w:sz w:val="20"/>
+          <w:szCs w:val="20"/>
+        </w:rPr>
+      </w:pPr>
+      <w:r>
+        <w:rPr>
+          <w:rFonts w:ascii="Verdana" w:eastAsia="Verdana" w:hAnsi="Verdana" w:cs="Verdana"/>
+          <w:color w:val="000000"/>
+          <w:sz w:val="20"/>
+          <w:szCs w:val="20"/>
           <w:highlight w:val="yellow"/>
         </w:rPr>
-        <w:t>Poder Judiciário: [PENDENTE – Vara Crime/Vara de Violência Doméstica da Comarca de LEM e de São Desidério];</w:t>
+        <w:t>[INSERIR IMAGEM: Gráfico de colunas – ocorrências de violência doméstica por ano (2024, 2025 e 2026), fonte SIGESPOL]</w:t>
       </w:r>
     </w:p>
     <w:p>
@@ -1677,7 +1938,7 @@
           <w:szCs w:val="20"/>
           <w:highlight w:val="yellow"/>
         </w:rPr>
-        <w:t>Ministério Público: [PENDENTE – Promotoria de Justiça de LEM];</w:t>
+        <w:t>[INSERIR IMAGEM: Mancha criminal de violência doméstica em 2026 – apenas por bairro/área, sem pontos de residência das vítimas]</w:t>
       </w:r>
     </w:p>
     <w:p>
@@ -1705,9 +1966,67 @@
           <w:color w:val="000000"/>
           <w:sz w:val="20"/>
           <w:szCs w:val="20"/>
+        </w:rPr>
+        <w:t>4. Medidas Protetivas de Urgência (últimos três anos)</w:t>
+      </w:r>
+    </w:p>
+    <w:p>
+      <w:pPr>
+        <w:pBdr>
+          <w:top w:val="nil"/>
+          <w:left w:val="nil"/>
+          <w:bottom w:val="nil"/>
+          <w:right w:val="nil"/>
+          <w:between w:val="nil"/>
+        </w:pBdr>
+        <w:spacing w:line="360" w:lineRule="auto"/>
+        <w:ind w:firstLine="709"/>
+        <w:jc w:val="both"/>
+        <w:rPr>
+          <w:rFonts w:ascii="Verdana" w:eastAsia="Verdana" w:hAnsi="Verdana" w:cs="Verdana"/>
+          <w:color w:val="000000"/>
+          <w:sz w:val="20"/>
+          <w:szCs w:val="20"/>
+        </w:rPr>
+      </w:pPr>
+      <w:r>
+        <w:rPr>
+          <w:rFonts w:ascii="Verdana" w:eastAsia="Verdana" w:hAnsi="Verdana" w:cs="Verdana"/>
+          <w:color w:val="000000"/>
+          <w:sz w:val="20"/>
+          <w:szCs w:val="20"/>
+        </w:rPr>
+        <w:t>A RMP acompanhava 192 (cento e noventa e duas) MPUs ativas em 2025 e acompanha, atualmente, 202 (duzentas e duas) MPUs ativas em 2026, aumento de aproximadamente 5%. Os registros de MPUs de períodos anteriores não estão disponíveis no 27º BPM, pois eram realizados pela Unidade da RMP da 83ª CIPM/Barreiras, o que reforça a necessidade de gestão própria. A fiscalização regular desse universo já é realizada pelo efetivo do 27º BPM, sendo necessária a sua formalização para garantir gestão, controle e planejamento próprios.</w:t>
+      </w:r>
+    </w:p>
+    <w:p>
+      <w:pPr>
+        <w:pBdr>
+          <w:top w:val="nil"/>
+          <w:left w:val="nil"/>
+          <w:bottom w:val="nil"/>
+          <w:right w:val="nil"/>
+          <w:between w:val="nil"/>
+        </w:pBdr>
+        <w:spacing w:line="360" w:lineRule="auto"/>
+        <w:ind w:firstLine="709"/>
+        <w:jc w:val="both"/>
+        <w:rPr>
+          <w:rFonts w:ascii="Verdana" w:eastAsia="Verdana" w:hAnsi="Verdana" w:cs="Verdana"/>
+          <w:color w:val="000000"/>
+          <w:sz w:val="20"/>
+          <w:szCs w:val="20"/>
+        </w:rPr>
+      </w:pPr>
+      <w:r>
+        <w:rPr>
+          <w:rFonts w:ascii="Verdana" w:eastAsia="Verdana" w:hAnsi="Verdana" w:cs="Verdana"/>
+          <w:color w:val="000000"/>
+          <w:sz w:val="20"/>
+          <w:szCs w:val="20"/>
           <w:highlight w:val="yellow"/>
         </w:rPr>
-        <w:t>Defensoria Pública: [PENDENTE];</w:t>
+        <w:t>[INSERIR IMAGEM: Gráfico de colunas – MPUs ativas em 2025 (192) e 2026 (202)]</w:t>
       </w:r>
     </w:p>
     <w:p>
@@ -1735,9 +2054,67 @@
           <w:color w:val="000000"/>
           <w:sz w:val="20"/>
           <w:szCs w:val="20"/>
+        </w:rPr>
+        <w:t>5. Local de funcionamento</w:t>
+      </w:r>
+    </w:p>
+    <w:p>
+      <w:pPr>
+        <w:pBdr>
+          <w:top w:val="nil"/>
+          <w:left w:val="nil"/>
+          <w:bottom w:val="nil"/>
+          <w:right w:val="nil"/>
+          <w:between w:val="nil"/>
+        </w:pBdr>
+        <w:spacing w:line="360" w:lineRule="auto"/>
+        <w:ind w:firstLine="709"/>
+        <w:jc w:val="both"/>
+        <w:rPr>
+          <w:rFonts w:ascii="Verdana" w:eastAsia="Verdana" w:hAnsi="Verdana" w:cs="Verdana"/>
+          <w:color w:val="000000"/>
+          <w:sz w:val="20"/>
+          <w:szCs w:val="20"/>
+        </w:rPr>
+      </w:pPr>
+      <w:r>
+        <w:rPr>
+          <w:rFonts w:ascii="Verdana" w:eastAsia="Verdana" w:hAnsi="Verdana" w:cs="Verdana"/>
+          <w:color w:val="000000"/>
+          <w:sz w:val="20"/>
+          <w:szCs w:val="20"/>
+        </w:rPr>
+        <w:t>A RMP do 27º BPM funciona na sede do 27º BPM, à Rua Xique-Xique, n.º 530, Loteamento Santa Cruz, Luís Eduardo Magalhães/BA, em espaço compartilhado com a Coordenação de Apoio Administrativo (CAA), dispondo de ambiente reservado para o acolhimento das mulheres, garantindo privacidade no atendimento.</w:t>
+      </w:r>
+    </w:p>
+    <w:p>
+      <w:pPr>
+        <w:pBdr>
+          <w:top w:val="nil"/>
+          <w:left w:val="nil"/>
+          <w:bottom w:val="nil"/>
+          <w:right w:val="nil"/>
+          <w:between w:val="nil"/>
+        </w:pBdr>
+        <w:spacing w:line="360" w:lineRule="auto"/>
+        <w:ind w:firstLine="709"/>
+        <w:jc w:val="both"/>
+        <w:rPr>
+          <w:rFonts w:ascii="Verdana" w:eastAsia="Verdana" w:hAnsi="Verdana" w:cs="Verdana"/>
+          <w:color w:val="000000"/>
+          <w:sz w:val="20"/>
+          <w:szCs w:val="20"/>
+        </w:rPr>
+      </w:pPr>
+      <w:r>
+        <w:rPr>
+          <w:rFonts w:ascii="Verdana" w:eastAsia="Verdana" w:hAnsi="Verdana" w:cs="Verdana"/>
+          <w:color w:val="000000"/>
+          <w:sz w:val="20"/>
+          <w:szCs w:val="20"/>
           <w:highlight w:val="yellow"/>
         </w:rPr>
-        <w:t>Subseção da OAB: [PENDENTE];</w:t>
+        <w:t>[INSERIR IMAGEM: Foto das instalações da RMP na sede do 27º BPM – sem pessoas atendidas]</w:t>
       </w:r>
     </w:p>
     <w:p>
@@ -1765,9 +2142,8 @@
           <w:color w:val="000000"/>
           <w:sz w:val="20"/>
           <w:szCs w:val="20"/>
-          <w:highlight w:val="yellow"/>
-        </w:rPr>
-        <w:t>Secretaria Municipal / Coordenadoria da Mulher: [PENDENTE];</w:t>
+        </w:rPr>
+        <w:t>6. Recursos humanos e materiais exclusivos</w:t>
       </w:r>
     </w:p>
     <w:p>
@@ -1795,425 +2171,8 @@
           <w:color w:val="000000"/>
           <w:sz w:val="20"/>
           <w:szCs w:val="20"/>
-          <w:highlight w:val="yellow"/>
-        </w:rPr>
-        <w:t>CRAM, CRAS e CREAS: [PENDENTE – quantidade de unidades em cada município];</w:t>
-      </w:r>
-    </w:p>
-    <w:p>
-      <w:pPr>
-        <w:pBdr>
-          <w:top w:val="nil"/>
-          <w:left w:val="nil"/>
-          <w:bottom w:val="nil"/>
-          <w:right w:val="nil"/>
-          <w:between w:val="nil"/>
-        </w:pBdr>
-        <w:spacing w:line="360" w:lineRule="auto"/>
-        <w:ind w:firstLine="709"/>
-        <w:jc w:val="both"/>
-        <w:rPr>
-          <w:rFonts w:ascii="Verdana" w:eastAsia="Verdana" w:hAnsi="Verdana" w:cs="Verdana"/>
-          <w:color w:val="000000"/>
-          <w:sz w:val="20"/>
-          <w:szCs w:val="20"/>
-        </w:rPr>
-      </w:pPr>
-      <w:r>
-        <w:rPr>
-          <w:rFonts w:ascii="Verdana" w:eastAsia="Verdana" w:hAnsi="Verdana" w:cs="Verdana"/>
-          <w:color w:val="000000"/>
-          <w:sz w:val="20"/>
-          <w:szCs w:val="20"/>
-          <w:highlight w:val="yellow"/>
-        </w:rPr>
-        <w:t>Guarda Municipal: [PENDENTE];</w:t>
-      </w:r>
-    </w:p>
-    <w:p>
-      <w:pPr>
-        <w:pBdr>
-          <w:top w:val="nil"/>
-          <w:left w:val="nil"/>
-          <w:bottom w:val="nil"/>
-          <w:right w:val="nil"/>
-          <w:between w:val="nil"/>
-        </w:pBdr>
-        <w:spacing w:line="360" w:lineRule="auto"/>
-        <w:ind w:firstLine="709"/>
-        <w:jc w:val="both"/>
-        <w:rPr>
-          <w:rFonts w:ascii="Verdana" w:eastAsia="Verdana" w:hAnsi="Verdana" w:cs="Verdana"/>
-          <w:color w:val="000000"/>
-          <w:sz w:val="20"/>
-          <w:szCs w:val="20"/>
-        </w:rPr>
-      </w:pPr>
-      <w:r>
-        <w:rPr>
-          <w:rFonts w:ascii="Verdana" w:eastAsia="Verdana" w:hAnsi="Verdana" w:cs="Verdana"/>
-          <w:color w:val="000000"/>
-          <w:sz w:val="20"/>
-          <w:szCs w:val="20"/>
-          <w:highlight w:val="yellow"/>
-        </w:rPr>
-        <w:t>ONGs e Conselho Municipal dos Direitos da Mulher: [PENDENTE].</w:t>
-      </w:r>
-    </w:p>
-    <w:p>
-      <w:pPr>
-        <w:pBdr>
-          <w:top w:val="nil"/>
-          <w:left w:val="nil"/>
-          <w:bottom w:val="nil"/>
-          <w:right w:val="nil"/>
-          <w:between w:val="nil"/>
-        </w:pBdr>
-        <w:spacing w:line="360" w:lineRule="auto"/>
-        <w:ind w:firstLine="709"/>
-        <w:jc w:val="both"/>
-        <w:rPr>
-          <w:rFonts w:ascii="Verdana" w:eastAsia="Verdana" w:hAnsi="Verdana" w:cs="Verdana"/>
-          <w:color w:val="000000"/>
-          <w:sz w:val="20"/>
-          <w:szCs w:val="20"/>
-        </w:rPr>
-      </w:pPr>
-      <w:r>
-        <w:rPr>
-          <w:rFonts w:ascii="Verdana" w:eastAsia="Verdana" w:hAnsi="Verdana" w:cs="Verdana"/>
-          <w:color w:val="000000"/>
-          <w:sz w:val="20"/>
-          <w:szCs w:val="20"/>
-        </w:rPr>
-        <w:t>3. Dados estatísticos de violência doméstica (últimos três anos)</w:t>
-      </w:r>
-    </w:p>
-    <w:p>
-      <w:pPr>
-        <w:pBdr>
-          <w:top w:val="nil"/>
-          <w:left w:val="nil"/>
-          <w:bottom w:val="nil"/>
-          <w:right w:val="nil"/>
-          <w:between w:val="nil"/>
-        </w:pBdr>
-        <w:spacing w:line="360" w:lineRule="auto"/>
-        <w:ind w:firstLine="709"/>
-        <w:jc w:val="both"/>
-        <w:rPr>
-          <w:rFonts w:ascii="Verdana" w:eastAsia="Verdana" w:hAnsi="Verdana" w:cs="Verdana"/>
-          <w:color w:val="000000"/>
-          <w:sz w:val="20"/>
-          <w:szCs w:val="20"/>
-        </w:rPr>
-      </w:pPr>
-      <w:r>
-        <w:rPr>
-          <w:rFonts w:ascii="Verdana" w:eastAsia="Verdana" w:hAnsi="Verdana" w:cs="Verdana"/>
-          <w:color w:val="000000"/>
-          <w:sz w:val="20"/>
-          <w:szCs w:val="20"/>
-          <w:highlight w:val="yellow"/>
-        </w:rPr>
-        <w:t>A análise das ocorrências registradas de 2023 a 2026 demonstra, somente em 2026, 314 ocorrências de “Maria da Penha” registradas no SIGESPOL até 12/10/2026, média superior a 01 (uma) ocorrência por dia, sendo 30 (trinta) registros apenas entre 29/09 e 12/10/2026, distribuídos entre Luís Eduardo Magalhães e São Desidério. Nos anos anteriores, foram registradas 382 ocorrências em 2024 e 404 em 2025, aumento de aproximadamente 6%. Mantida a média diária de 2026 (cerca de 1,1 ocorrência por dia), a projeção para o ano é de aproximadamente 400 ocorrências, confirmando o patamar elevado e constante da demanda. Os dados de 2023 são: [PENDENTE]. Observa-se maior concentração nos bairros [PENDENTE], predominando os delitos de [PENDENTE – ameaça, lesão corporal, descumprimento de MPU]. Os dados são apresentados de forma agregada, sem qualquer elemento que permita a identificação de vítimas ou autores (LGPD).</w:t>
-      </w:r>
-    </w:p>
-    <w:p>
-      <w:pPr>
-        <w:pBdr>
-          <w:top w:val="nil"/>
-          <w:left w:val="nil"/>
-          <w:bottom w:val="nil"/>
-          <w:right w:val="nil"/>
-          <w:between w:val="nil"/>
-        </w:pBdr>
-        <w:spacing w:line="360" w:lineRule="auto"/>
-        <w:ind w:firstLine="709"/>
-        <w:jc w:val="both"/>
-        <w:rPr>
-          <w:rFonts w:ascii="Verdana" w:eastAsia="Verdana" w:hAnsi="Verdana" w:cs="Verdana"/>
-          <w:color w:val="000000"/>
-          <w:sz w:val="20"/>
-          <w:szCs w:val="20"/>
-        </w:rPr>
-      </w:pPr>
-      <w:r>
-        <w:rPr>
-          <w:rFonts w:ascii="Verdana" w:eastAsia="Verdana" w:hAnsi="Verdana" w:cs="Verdana"/>
-          <w:color w:val="000000"/>
-          <w:sz w:val="20"/>
-          <w:szCs w:val="20"/>
-          <w:highlight w:val="yellow"/>
-        </w:rPr>
-        <w:t>[INSERIR IMAGEM: Gráfico de colunas – ocorrências de violência doméstica por ano (2023, 2024, 2025 e 2026) e por localidade (LEM, SD, RV, SG)]</w:t>
-      </w:r>
-    </w:p>
-    <w:p>
-      <w:pPr>
-        <w:pBdr>
-          <w:top w:val="nil"/>
-          <w:left w:val="nil"/>
-          <w:bottom w:val="nil"/>
-          <w:right w:val="nil"/>
-          <w:between w:val="nil"/>
-        </w:pBdr>
-        <w:spacing w:line="360" w:lineRule="auto"/>
-        <w:ind w:firstLine="709"/>
-        <w:jc w:val="both"/>
-        <w:rPr>
-          <w:rFonts w:ascii="Verdana" w:eastAsia="Verdana" w:hAnsi="Verdana" w:cs="Verdana"/>
-          <w:color w:val="000000"/>
-          <w:sz w:val="20"/>
-          <w:szCs w:val="20"/>
-        </w:rPr>
-      </w:pPr>
-      <w:r>
-        <w:rPr>
-          <w:rFonts w:ascii="Verdana" w:eastAsia="Verdana" w:hAnsi="Verdana" w:cs="Verdana"/>
-          <w:color w:val="000000"/>
-          <w:sz w:val="20"/>
-          <w:szCs w:val="20"/>
-          <w:highlight w:val="yellow"/>
-        </w:rPr>
-        <w:t>[INSERIR IMAGEM: Mancha criminal de violência doméstica em 2026 – apenas por bairro/área, sem pontos de residência das vítimas]</w:t>
-      </w:r>
-    </w:p>
-    <w:p>
-      <w:pPr>
-        <w:pBdr>
-          <w:top w:val="nil"/>
-          <w:left w:val="nil"/>
-          <w:bottom w:val="nil"/>
-          <w:right w:val="nil"/>
-          <w:between w:val="nil"/>
-        </w:pBdr>
-        <w:spacing w:line="360" w:lineRule="auto"/>
-        <w:ind w:firstLine="709"/>
-        <w:jc w:val="both"/>
-        <w:rPr>
-          <w:rFonts w:ascii="Verdana" w:eastAsia="Verdana" w:hAnsi="Verdana" w:cs="Verdana"/>
-          <w:color w:val="000000"/>
-          <w:sz w:val="20"/>
-          <w:szCs w:val="20"/>
-        </w:rPr>
-      </w:pPr>
-      <w:r>
-        <w:rPr>
-          <w:rFonts w:ascii="Verdana" w:eastAsia="Verdana" w:hAnsi="Verdana" w:cs="Verdana"/>
-          <w:color w:val="000000"/>
-          <w:sz w:val="20"/>
-          <w:szCs w:val="20"/>
-        </w:rPr>
-        <w:t>4. Medidas Protetivas de Urgência (últimos três anos)</w:t>
-      </w:r>
-    </w:p>
-    <w:p>
-      <w:pPr>
-        <w:pBdr>
-          <w:top w:val="nil"/>
-          <w:left w:val="nil"/>
-          <w:bottom w:val="nil"/>
-          <w:right w:val="nil"/>
-          <w:between w:val="nil"/>
-        </w:pBdr>
-        <w:spacing w:line="360" w:lineRule="auto"/>
-        <w:ind w:firstLine="709"/>
-        <w:jc w:val="both"/>
-        <w:rPr>
-          <w:rFonts w:ascii="Verdana" w:eastAsia="Verdana" w:hAnsi="Verdana" w:cs="Verdana"/>
-          <w:color w:val="000000"/>
-          <w:sz w:val="20"/>
-          <w:szCs w:val="20"/>
-        </w:rPr>
-      </w:pPr>
-      <w:r>
-        <w:rPr>
-          <w:rFonts w:ascii="Verdana" w:eastAsia="Verdana" w:hAnsi="Verdana" w:cs="Verdana"/>
-          <w:color w:val="000000"/>
-          <w:sz w:val="20"/>
-          <w:szCs w:val="20"/>
-          <w:highlight w:val="yellow"/>
-        </w:rPr>
-        <w:t>A RMP acompanhava 192 (cento e noventa e duas) MPUs ativas em 2025 e acompanha, atualmente, 202 (duzentas e duas) MPUs ativas em 2026, aumento de aproximadamente 5%. As MPUs concedidas em 2023 e 2024 são: [PENDENTE]. A fiscalização regular desse universo já é realizada pelo efetivo do 27º BPM, sendo necessária a sua formalização para garantir gestão, controle e planejamento próprios.</w:t>
-      </w:r>
-    </w:p>
-    <w:p>
-      <w:pPr>
-        <w:pBdr>
-          <w:top w:val="nil"/>
-          <w:left w:val="nil"/>
-          <w:bottom w:val="nil"/>
-          <w:right w:val="nil"/>
-          <w:between w:val="nil"/>
-        </w:pBdr>
-        <w:spacing w:line="360" w:lineRule="auto"/>
-        <w:ind w:firstLine="709"/>
-        <w:jc w:val="both"/>
-        <w:rPr>
-          <w:rFonts w:ascii="Verdana" w:eastAsia="Verdana" w:hAnsi="Verdana" w:cs="Verdana"/>
-          <w:color w:val="000000"/>
-          <w:sz w:val="20"/>
-          <w:szCs w:val="20"/>
-        </w:rPr>
-      </w:pPr>
-      <w:r>
-        <w:rPr>
-          <w:rFonts w:ascii="Verdana" w:eastAsia="Verdana" w:hAnsi="Verdana" w:cs="Verdana"/>
-          <w:color w:val="000000"/>
-          <w:sz w:val="20"/>
-          <w:szCs w:val="20"/>
-          <w:highlight w:val="yellow"/>
-        </w:rPr>
-        <w:t>[INSERIR IMAGEM: Gráfico de linha – MPUs concedidas por ano, com destaque para vigentes e descumpridas]</w:t>
-      </w:r>
-    </w:p>
-    <w:p>
-      <w:pPr>
-        <w:pBdr>
-          <w:top w:val="nil"/>
-          <w:left w:val="nil"/>
-          <w:bottom w:val="nil"/>
-          <w:right w:val="nil"/>
-          <w:between w:val="nil"/>
-        </w:pBdr>
-        <w:spacing w:line="360" w:lineRule="auto"/>
-        <w:ind w:firstLine="709"/>
-        <w:jc w:val="both"/>
-        <w:rPr>
-          <w:rFonts w:ascii="Verdana" w:eastAsia="Verdana" w:hAnsi="Verdana" w:cs="Verdana"/>
-          <w:color w:val="000000"/>
-          <w:sz w:val="20"/>
-          <w:szCs w:val="20"/>
-        </w:rPr>
-      </w:pPr>
-      <w:r>
-        <w:rPr>
-          <w:rFonts w:ascii="Verdana" w:eastAsia="Verdana" w:hAnsi="Verdana" w:cs="Verdana"/>
-          <w:color w:val="000000"/>
-          <w:sz w:val="20"/>
-          <w:szCs w:val="20"/>
-        </w:rPr>
-        <w:t>5. Local de funcionamento</w:t>
-      </w:r>
-    </w:p>
-    <w:p>
-      <w:pPr>
-        <w:pBdr>
-          <w:top w:val="nil"/>
-          <w:left w:val="nil"/>
-          <w:bottom w:val="nil"/>
-          <w:right w:val="nil"/>
-          <w:between w:val="nil"/>
-        </w:pBdr>
-        <w:spacing w:line="360" w:lineRule="auto"/>
-        <w:ind w:firstLine="709"/>
-        <w:jc w:val="both"/>
-        <w:rPr>
-          <w:rFonts w:ascii="Verdana" w:eastAsia="Verdana" w:hAnsi="Verdana" w:cs="Verdana"/>
-          <w:color w:val="000000"/>
-          <w:sz w:val="20"/>
-          <w:szCs w:val="20"/>
-        </w:rPr>
-      </w:pPr>
-      <w:r>
-        <w:rPr>
-          <w:rFonts w:ascii="Verdana" w:eastAsia="Verdana" w:hAnsi="Verdana" w:cs="Verdana"/>
-          <w:color w:val="000000"/>
-          <w:sz w:val="20"/>
-          <w:szCs w:val="20"/>
-          <w:highlight w:val="yellow"/>
-        </w:rPr>
-        <w:t>A RMP do 27º BPM já dispõe de local próprio de funcionamento, em [PENDENTE – endereço/instalação], com ambiente reservado para o acolhimento das mulheres, garantindo privacidade no atendimento.</w:t>
-      </w:r>
-    </w:p>
-    <w:p>
-      <w:pPr>
-        <w:pBdr>
-          <w:top w:val="nil"/>
-          <w:left w:val="nil"/>
-          <w:bottom w:val="nil"/>
-          <w:right w:val="nil"/>
-          <w:between w:val="nil"/>
-        </w:pBdr>
-        <w:spacing w:line="360" w:lineRule="auto"/>
-        <w:ind w:firstLine="709"/>
-        <w:jc w:val="both"/>
-        <w:rPr>
-          <w:rFonts w:ascii="Verdana" w:eastAsia="Verdana" w:hAnsi="Verdana" w:cs="Verdana"/>
-          <w:color w:val="000000"/>
-          <w:sz w:val="20"/>
-          <w:szCs w:val="20"/>
-        </w:rPr>
-      </w:pPr>
-      <w:r>
-        <w:rPr>
-          <w:rFonts w:ascii="Verdana" w:eastAsia="Verdana" w:hAnsi="Verdana" w:cs="Verdana"/>
-          <w:color w:val="000000"/>
-          <w:sz w:val="20"/>
-          <w:szCs w:val="20"/>
-          <w:highlight w:val="yellow"/>
-        </w:rPr>
-        <w:t>[INSERIR IMAGEM: Foto da Sala Lilás / instalações da RMP – sem pessoas atendidas]</w:t>
-      </w:r>
-    </w:p>
-    <w:p>
-      <w:pPr>
-        <w:pBdr>
-          <w:top w:val="nil"/>
-          <w:left w:val="nil"/>
-          <w:bottom w:val="nil"/>
-          <w:right w:val="nil"/>
-          <w:between w:val="nil"/>
-        </w:pBdr>
-        <w:spacing w:line="360" w:lineRule="auto"/>
-        <w:ind w:firstLine="709"/>
-        <w:jc w:val="both"/>
-        <w:rPr>
-          <w:rFonts w:ascii="Verdana" w:eastAsia="Verdana" w:hAnsi="Verdana" w:cs="Verdana"/>
-          <w:color w:val="000000"/>
-          <w:sz w:val="20"/>
-          <w:szCs w:val="20"/>
-        </w:rPr>
-      </w:pPr>
-      <w:r>
-        <w:rPr>
-          <w:rFonts w:ascii="Verdana" w:eastAsia="Verdana" w:hAnsi="Verdana" w:cs="Verdana"/>
-          <w:color w:val="000000"/>
-          <w:sz w:val="20"/>
-          <w:szCs w:val="20"/>
-        </w:rPr>
-        <w:t>6. Recursos humanos e materiais exclusivos</w:t>
-      </w:r>
-    </w:p>
-    <w:p>
-      <w:pPr>
-        <w:pBdr>
-          <w:top w:val="nil"/>
-          <w:left w:val="nil"/>
-          <w:bottom w:val="nil"/>
-          <w:right w:val="nil"/>
-          <w:between w:val="nil"/>
-        </w:pBdr>
-        <w:spacing w:line="360" w:lineRule="auto"/>
-        <w:ind w:firstLine="709"/>
-        <w:jc w:val="both"/>
-        <w:rPr>
-          <w:rFonts w:ascii="Verdana" w:eastAsia="Verdana" w:hAnsi="Verdana" w:cs="Verdana"/>
-          <w:color w:val="000000"/>
-          <w:sz w:val="20"/>
-          <w:szCs w:val="20"/>
-        </w:rPr>
-      </w:pPr>
-      <w:r>
-        <w:rPr>
-          <w:rFonts w:ascii="Verdana" w:eastAsia="Verdana" w:hAnsi="Verdana" w:cs="Verdana"/>
-          <w:color w:val="000000"/>
-          <w:sz w:val="20"/>
-          <w:szCs w:val="20"/>
-          <w:highlight w:val="yellow"/>
-        </w:rPr>
-        <w:t>Em atendimento ao art. 4º, §2º, e art. 7º, §2º, da Portaria n.º 042-CG/2024, a RMP já conta com 05 (cinco) policiais militares do 27º BPM, efetivo mínimo exigido, sendo 01 (um) Oficial (Tenente PM), comandante da RMP, 01 (um) Sargento, 01 (um) Cabo e 02 (dois) Soldados, dos quais 02 (duas) são policiais femininas (relação nominal no Anexo B, de acesso restrito), empregados em guarnição tipo “B”, em regime de escala ordinário, empregados exclusivamente na atividade da RMP, todos com capacitação em enfrentamento à violência contra a mulher [PENDENTE – informar curso/estágio já realizado ou a ser agendado junto ao BPPM]. A RMP já dispõe de viatura exclusiva, [PENDENTE – prefixo e modelo], com cota de combustível sob gestão da Unidade.</w:t>
+        </w:rPr>
+        <w:t>Em atendimento ao art. 4º, §2º, e art. 7º, §2º, da Portaria n.º 042-CG/2024, a RMP já conta com 05 (cinco) policiais militares do 27º BPM, efetivo mínimo exigido, sendo 01 (um) Oficial (Tenente PM), comandante da RMP, 01 (um) Sargento, 01 (um) Cabo e 02 (dois) Soldados, dos quais 02 (duas) são policiais femininas (relação nominal no Anexo B, de acesso restrito), empregados em guarnição tipo “B”, em regime de escala ordinário, empregados exclusivamente na atividade da RMP, estando a capacitação em enfrentamento à violência contra a mulher (art. 4º, §5º) já agendada junto ao BPPM. A RMP já dispõe de viatura exclusiva, prefixo 8.2732, Renault/Duster, placa TGX 2E57, com cota de combustível sob gestão da Unidade.</w:t>
       </w:r>
     </w:p>
     <w:p>
@@ -2963,7 +2922,7 @@
           <w:sz w:val="20"/>
           <w:szCs w:val="20"/>
         </w:rPr>
-        <w:t>Anexo C – Dados estatísticos de violência doméstica e MPUs (2023–2026).</w:t>
+        <w:t>Anexo C – Dados estatísticos de violência doméstica e MPUs (2024–2026), fonte SIGESPOL.</w:t>
       </w:r>
     </w:p>
     <w:p>
@@ -3962,9 +3921,8 @@
           <w:rFonts w:ascii="Verdana" w:eastAsia="Verdana" w:hAnsi="Verdana" w:cs="Verdana"/>
           <w:sz w:val="20"/>
           <w:szCs w:val="20"/>
-          <w:highlight w:val="yellow"/>
-        </w:rPr>
-        <w:t>Capacitação: [PENDENTE – curso/estágio de cada policial]</w:t>
+        </w:rPr>
+        <w:t>Capacitação: agendada junto ao BPPM.</w:t>
       </w:r>
     </w:p>
     <w:p>

</xml_diff>

<commit_message>
Move imagens para anexos C–H; remove ofício e trecho remanescentes do modelo
Co-Authored-By: Claude Opus 5.5 <noreply@anthropic.com>
Claude-Session: https://claude.ai/code/session_01NkJxMjLTPT7uCe2XDfKQHG
</commit_message>
<xml_diff>
--- a/estudo/Estudo_de_Situacao_RMP_27BPM.docx
+++ b/estudo/Estudo_de_Situacao_RMP_27BPM.docx
@@ -2,8 +2,6 @@
 <file path=word/document.xml><?xml version="1.0" encoding="utf-8"?>
 <w:document xmlns:wpc="http://schemas.microsoft.com/office/word/2010/wordprocessingCanvas" xmlns:cx="http://schemas.microsoft.com/office/drawing/2014/chartex" xmlns:cx1="http://schemas.microsoft.com/office/drawing/2015/9/8/chartex" xmlns:cx2="http://schemas.microsoft.com/office/drawing/2015/10/21/chartex" xmlns:cx3="http://schemas.microsoft.com/office/drawing/2016/5/9/chartex" xmlns:cx4="http://schemas.microsoft.com/office/drawing/2016/5/10/chartex" xmlns:cx5="http://schemas.microsoft.com/office/drawing/2016/5/11/chartex" xmlns:cx6="http://schemas.microsoft.com/office/drawing/2016/5/12/chartex" xmlns:cx7="http://schemas.microsoft.com/office/drawing/2016/5/13/chartex" xmlns:cx8="http://schemas.microsoft.com/office/drawing/2016/5/14/chartex" xmlns:mc="http://schemas.openxmlformats.org/markup-compatibility/2006" xmlns:aink="http://schemas.microsoft.com/office/drawing/2016/ink" xmlns:am3d="http://schemas.microsoft.com/office/drawing/2017/model3d" xmlns:o="urn:schemas-microsoft-com:office:office" xmlns:oel="http://schemas.microsoft.com/office/2019/extlst" xmlns:r="http://schemas.openxmlformats.org/officeDocument/2006/relationships" xmlns:m="http://schemas.openxmlformats.org/officeDocument/2006/math" xmlns:v="urn:schemas-microsoft-com:vml" xmlns:wp14="http://schemas.microsoft.com/office/word/2010/wordprocessingDrawing" xmlns:wp="http://schemas.openxmlformats.org/drawingml/2006/wordprocessingDrawing" xmlns:w10="urn:schemas-microsoft-com:office:word" xmlns:w="http://schemas.openxmlformats.org/wordprocessingml/2006/main" xmlns:w14="http://schemas.microsoft.com/office/word/2010/wordml" xmlns:w15="http://schemas.microsoft.com/office/word/2012/wordml" xmlns:w16cex="http://schemas.microsoft.com/office/word/2018/wordml/cex" xmlns:w16cid="http://schemas.microsoft.com/office/word/2016/wordml/cid" xmlns:w16="http://schemas.microsoft.com/office/word/2018/wordml" xmlns:w16du="http://schemas.microsoft.com/office/word/2023/wordml/word16du" xmlns:w16sdtdh="http://schemas.microsoft.com/office/word/2020/wordml/sdtdatahash" xmlns:w16sdtfl="http://schemas.microsoft.com/office/word/2024/wordml/sdtformatlock" xmlns:w16se="http://schemas.microsoft.com/office/word/2015/wordml/symex" xmlns:wpg="http://schemas.microsoft.com/office/word/2010/wordprocessingGroup" xmlns:wpi="http://schemas.microsoft.com/office/word/2010/wordprocessingInk" xmlns:wne="http://schemas.microsoft.com/office/word/2006/wordml" xmlns:wps="http://schemas.microsoft.com/office/word/2010/wordprocessingShape" mc:Ignorable="w14 w15 w16se w16cid w16 w16cex w16sdtdh w16sdtfl w16du wp14">
   <w:body>
-    <w:bookmarkStart w:id="0" w:name="_heading=h.oiim62kv8y77" w:colFirst="0" w:colLast="0"/>
-    <w:bookmarkEnd w:id="0"/>
     <w:p>
       <w:pPr>
         <w:pStyle w:val="Ttulo1"/>
@@ -13,6 +11,8 @@
           <w:szCs w:val="20"/>
         </w:rPr>
       </w:pPr>
+      <w:bookmarkStart w:id="0" w:name="_heading=h.oiim62kv8y77" w:colFirst="0" w:colLast="0"/>
+      <w:bookmarkEnd w:id="0"/>
       <w:r>
         <w:rPr>
           <w:noProof/>
@@ -668,7 +668,7 @@
               </wp:anchor>
             </w:drawing>
           </mc:Choice>
-          <mc:Fallback xmlns:sl="http://schemas.openxmlformats.org/schemaLibrary/2006/main" xmlns:a="http://schemas.openxmlformats.org/drawingml/2006/main" xmlns:pic="http://schemas.openxmlformats.org/drawingml/2006/picture" xmlns:c="http://schemas.openxmlformats.org/drawingml/2006/chart" xmlns:lc="http://schemas.openxmlformats.org/drawingml/2006/lockedCanvas" xmlns:dgm="http://schemas.openxmlformats.org/drawingml/2006/diagram" xmlns="http://schemas.microsoft.com/office/tasks/2019/documenttasks" xmlns:cr="http://schemas.microsoft.com/office/comments/2020/reactions">
+          <mc:Fallback xmlns:cr="http://schemas.microsoft.com/office/comments/2020/reactions" xmlns="http://schemas.microsoft.com/office/tasks/2019/documenttasks" xmlns:dgm="http://schemas.openxmlformats.org/drawingml/2006/diagram" xmlns:lc="http://schemas.openxmlformats.org/drawingml/2006/lockedCanvas" xmlns:c="http://schemas.openxmlformats.org/drawingml/2006/chart" xmlns:pic="http://schemas.openxmlformats.org/drawingml/2006/picture" xmlns:a="http://schemas.openxmlformats.org/drawingml/2006/main" xmlns:sl="http://schemas.openxmlformats.org/schemaLibrary/2006/main">
             <w:drawing>
               <wp:anchor allowOverlap="1" behindDoc="0" distB="0" distT="0" distL="114300" distR="114300" hidden="0" layoutInCell="1" locked="0" relativeHeight="0" simplePos="0">
                 <wp:simplePos x="0" y="0"/>
@@ -953,6 +953,7 @@
           <w:sz w:val="20"/>
           <w:szCs w:val="20"/>
         </w:rPr>
+        <w:lastRenderedPageBreak/>
         <w:t>HIPÓTESES</w:t>
       </w:r>
     </w:p>
@@ -1199,10 +1200,8 @@
           <w:sz w:val="20"/>
           <w:szCs w:val="20"/>
         </w:rPr>
-        <w:t>Ocorrência de 03 (três) feminicídios na área do 27º BPM em 2026 (janeiro a agosto), sem identificação das vítimas, em observância à Lei n.º 13.709/2018 (LGPD);</w:t>
-      </w:r>
-      <w:proofErr w:type="gramStart"/>
-      <w:proofErr w:type="gramEnd"/>
+        <w:t>Ocorrência de 03 (três) feminicídios na área do 27º BPM em 2026 (janeiro a agosto);</w:t>
+      </w:r>
     </w:p>
     <w:p>
       <w:pPr>
@@ -1226,8 +1225,6 @@
         </w:rPr>
         <w:t>Registro de 382 (trezentas e oitenta e duas) ocorrências de violência doméstica e familiar contra a mulher em 2024, 404 (quatrocentas e quatro) em 2025 e 314 (trezentas e quatorze) em 2026 (até 12/10/2026, conforme SIGESPOL);</w:t>
       </w:r>
-      <w:proofErr w:type="gramStart"/>
-      <w:proofErr w:type="gramEnd"/>
     </w:p>
     <w:p>
       <w:pPr>
@@ -1251,8 +1248,6 @@
         </w:rPr>
         <w:t>Acompanhamento, pela RMP, de 192 (cento e noventa e duas) Medidas Protetivas de Urgência ativas em 2025 e de 202 (duzentas e duas) ativas em 2026 (até a presente data);</w:t>
       </w:r>
-      <w:proofErr w:type="gramStart"/>
-      <w:proofErr w:type="gramEnd"/>
     </w:p>
     <w:p>
       <w:pPr>
@@ -1276,8 +1271,6 @@
         </w:rPr>
         <w:t>Fiscalização das MPUs já executada por 05 (cinco) policiais militares do 27º BPM em Luís Eduardo Magalhães, porém com vinculação formal à Unidade da Ronda Maria da Penha da 83ª CIPM/Barreiras;</w:t>
       </w:r>
-      <w:proofErr w:type="gramStart"/>
-      <w:proofErr w:type="gramEnd"/>
     </w:p>
     <w:p>
       <w:pPr>
@@ -1301,8 +1294,6 @@
         </w:rPr>
         <w:t>Área de responsabilidade composta por Luís Eduardo Magalhães, São Desidério e distritos, com grande extensão territorial e zona rural dispersa;</w:t>
       </w:r>
-      <w:proofErr w:type="gramStart"/>
-      <w:proofErr w:type="gramEnd"/>
     </w:p>
     <w:p>
       <w:pPr>
@@ -1326,8 +1317,6 @@
         </w:rPr>
         <w:t>Criação do 27º BPM (Lei n.º 14.962/2025), com autonomia administrativa e operacional;</w:t>
       </w:r>
-      <w:proofErr w:type="gramStart"/>
-      <w:proofErr w:type="gramEnd"/>
     </w:p>
     <w:p>
       <w:pPr>
@@ -1349,10 +1338,8 @@
           <w:sz w:val="20"/>
           <w:szCs w:val="20"/>
         </w:rPr>
-        <w:t>Existência, no município, de rede de proteção apta à integração com a RMP (detalhada na Discussão);</w:t>
-      </w:r>
-      <w:proofErr w:type="gramStart"/>
-      <w:proofErr w:type="gramEnd"/>
+        <w:t>Existência, no município, de rede de proteção apta à integração com a RMP;</w:t>
+      </w:r>
     </w:p>
     <w:p>
       <w:pPr>
@@ -1376,8 +1363,40 @@
         </w:rPr>
         <w:t>Vigência da Lei n.º 15.383/2026 (monitoração eletrônica de agressores) e da Lei n.º 15.384/2026 (violência vicária), que ampliam a demanda de fiscalização.</w:t>
       </w:r>
-      <w:proofErr w:type="gramStart"/>
-      <w:proofErr w:type="gramEnd"/>
+    </w:p>
+    <w:p>
+      <w:pPr>
+        <w:spacing w:line="360" w:lineRule="auto"/>
+        <w:ind w:left="720"/>
+        <w:jc w:val="both"/>
+        <w:rPr>
+          <w:rFonts w:ascii="Verdana" w:eastAsia="Verdana" w:hAnsi="Verdana" w:cs="Verdana"/>
+          <w:sz w:val="20"/>
+          <w:szCs w:val="20"/>
+        </w:rPr>
+      </w:pPr>
+    </w:p>
+    <w:p>
+      <w:pPr>
+        <w:spacing w:line="360" w:lineRule="auto"/>
+        <w:jc w:val="both"/>
+        <w:rPr>
+          <w:rFonts w:ascii="Verdana" w:eastAsia="Verdana" w:hAnsi="Verdana" w:cs="Verdana"/>
+          <w:sz w:val="20"/>
+          <w:szCs w:val="20"/>
+        </w:rPr>
+      </w:pPr>
+    </w:p>
+    <w:p>
+      <w:pPr>
+        <w:spacing w:line="360" w:lineRule="auto"/>
+        <w:jc w:val="both"/>
+        <w:rPr>
+          <w:rFonts w:ascii="Verdana" w:eastAsia="Verdana" w:hAnsi="Verdana" w:cs="Verdana"/>
+          <w:sz w:val="20"/>
+          <w:szCs w:val="20"/>
+        </w:rPr>
+      </w:pPr>
     </w:p>
     <w:p>
       <w:pPr>
@@ -1412,6 +1431,7 @@
           <w:sz w:val="20"/>
           <w:szCs w:val="20"/>
         </w:rPr>
+        <w:lastRenderedPageBreak/>
         <w:t>DISCUSSÃO</w:t>
       </w:r>
     </w:p>
@@ -1463,14 +1483,39 @@
           <w:szCs w:val="20"/>
         </w:rPr>
       </w:pPr>
-      <w:r>
-        <w:rPr>
-          <w:rFonts w:ascii="Verdana" w:eastAsia="Verdana" w:hAnsi="Verdana" w:cs="Verdana"/>
-          <w:color w:val="000000"/>
-          <w:sz w:val="20"/>
-          <w:szCs w:val="20"/>
-        </w:rPr>
-        <w:t>1. Contextualização do território</w:t>
+    </w:p>
+    <w:p>
+      <w:pPr>
+        <w:pStyle w:val="PargrafodaLista"/>
+        <w:numPr>
+          <w:ilvl w:val="0"/>
+          <w:numId w:val="15"/>
+        </w:numPr>
+        <w:pBdr>
+          <w:top w:val="nil"/>
+          <w:left w:val="nil"/>
+          <w:bottom w:val="nil"/>
+          <w:right w:val="nil"/>
+          <w:between w:val="nil"/>
+        </w:pBdr>
+        <w:spacing w:line="360" w:lineRule="auto"/>
+        <w:ind w:left="0" w:firstLine="709"/>
+        <w:jc w:val="both"/>
+        <w:rPr>
+          <w:rFonts w:ascii="Verdana" w:eastAsia="Verdana" w:hAnsi="Verdana" w:cs="Verdana"/>
+          <w:color w:val="000000"/>
+          <w:sz w:val="20"/>
+          <w:szCs w:val="20"/>
+        </w:rPr>
+      </w:pPr>
+      <w:r>
+        <w:rPr>
+          <w:rFonts w:ascii="Verdana" w:eastAsia="Verdana" w:hAnsi="Verdana" w:cs="Verdana"/>
+          <w:color w:val="000000"/>
+          <w:sz w:val="20"/>
+          <w:szCs w:val="20"/>
+        </w:rPr>
+        <w:t>Contextualização do território</w:t>
       </w:r>
     </w:p>
     <w:p>
@@ -1521,15 +1566,42 @@
           <w:szCs w:val="20"/>
         </w:rPr>
       </w:pPr>
-      <w:r>
-        <w:rPr>
-          <w:rFonts w:ascii="Verdana" w:eastAsia="Verdana" w:hAnsi="Verdana" w:cs="Verdana"/>
-          <w:color w:val="000000"/>
-          <w:sz w:val="20"/>
-          <w:szCs w:val="20"/>
-          <w:highlight w:val="yellow"/>
-        </w:rPr>
-        <w:t>[INSERIR IMAGEM: Mapa da área de responsabilidade do 27º BPM (LEM, São Desidério, Roda Velha e Sítio Grande), com os bairros atendidos pela RMP – pode ser reaproveitado do slide 57 da apresentação]</w:t>
+    </w:p>
+    <w:p>
+      <w:pPr>
+        <w:pStyle w:val="PargrafodaLista"/>
+        <w:numPr>
+          <w:ilvl w:val="0"/>
+          <w:numId w:val="15"/>
+        </w:numPr>
+        <w:pBdr>
+          <w:top w:val="nil"/>
+          <w:left w:val="nil"/>
+          <w:bottom w:val="nil"/>
+          <w:right w:val="nil"/>
+          <w:between w:val="nil"/>
+        </w:pBdr>
+        <w:tabs>
+          <w:tab w:val="left" w:pos="1276"/>
+        </w:tabs>
+        <w:spacing w:line="360" w:lineRule="auto"/>
+        <w:ind w:left="0" w:firstLine="709"/>
+        <w:jc w:val="both"/>
+        <w:rPr>
+          <w:rFonts w:ascii="Verdana" w:eastAsia="Verdana" w:hAnsi="Verdana" w:cs="Verdana"/>
+          <w:color w:val="000000"/>
+          <w:sz w:val="20"/>
+          <w:szCs w:val="20"/>
+        </w:rPr>
+      </w:pPr>
+      <w:r>
+        <w:rPr>
+          <w:rFonts w:ascii="Verdana" w:eastAsia="Verdana" w:hAnsi="Verdana" w:cs="Verdana"/>
+          <w:color w:val="000000"/>
+          <w:sz w:val="20"/>
+          <w:szCs w:val="20"/>
+        </w:rPr>
+        <w:t>Rede de proteção e enfrentamento à violência contra a mulher</w:t>
       </w:r>
     </w:p>
     <w:p>
@@ -1558,7 +1630,7 @@
           <w:sz w:val="20"/>
           <w:szCs w:val="20"/>
         </w:rPr>
-        <w:t>2. Rede de proteção e enfrentamento à violência contra a mulher</w:t>
+        <w:t>Delegacia de Polícia de Luís Eduardo Magalhães – (77) 99929-1570;</w:t>
       </w:r>
     </w:p>
     <w:p>
@@ -1587,7 +1659,7 @@
           <w:sz w:val="20"/>
           <w:szCs w:val="20"/>
         </w:rPr>
-        <w:t>Delegacia de Polícia de Luís Eduardo Magalhães – (77) 99929-1570;</w:t>
+        <w:t>Poder Judiciário – Fórum da Comarca de Luís Eduardo Magalhães – (77) 3628-8213 / (77) 3628-8214;</w:t>
       </w:r>
     </w:p>
     <w:p>
@@ -1616,7 +1688,7 @@
           <w:sz w:val="20"/>
           <w:szCs w:val="20"/>
         </w:rPr>
-        <w:t>Poder Judiciário – Fórum da Comarca de Luís Eduardo Magalhães – (77) 3628-8213 / (77) 3628-8214;</w:t>
+        <w:t>Ministério Público – Promotoria de Justiça de Luís Eduardo Magalhães – (77) 3628-0513 / (77) 3628-0153;</w:t>
       </w:r>
     </w:p>
     <w:p>
@@ -1645,7 +1717,7 @@
           <w:sz w:val="20"/>
           <w:szCs w:val="20"/>
         </w:rPr>
-        <w:t>Ministério Público – Promotoria de Justiça de Luís Eduardo Magalhães – (77) 3628-0513 / (77) 3628-0153;</w:t>
+        <w:t>Defensoria Pública – (77) 3628-8997;</w:t>
       </w:r>
     </w:p>
     <w:p>
@@ -1674,7 +1746,7 @@
           <w:sz w:val="20"/>
           <w:szCs w:val="20"/>
         </w:rPr>
-        <w:t>Defensoria Pública – (77) 3628-8997;</w:t>
+        <w:t>Subseção da OAB – (77) 99839-1520;</w:t>
       </w:r>
     </w:p>
     <w:p>
@@ -1703,7 +1775,7 @@
           <w:sz w:val="20"/>
           <w:szCs w:val="20"/>
         </w:rPr>
-        <w:t>Subseção da OAB – (77) 99839-1520;</w:t>
+        <w:t>Centro de Atendimento à Mulher (CAM) – (77) 99933-8740;</w:t>
       </w:r>
     </w:p>
     <w:p>
@@ -1731,9 +1803,8 @@
           <w:color w:val="000000"/>
           <w:sz w:val="20"/>
           <w:szCs w:val="20"/>
-          <w:highlight w:val="yellow"/>
-        </w:rPr>
-        <w:t>Secretaria Municipal / Coordenadoria da Mulher: [PENDENTE];</w:t>
+        </w:rPr>
+        <w:t>Guarda Municipal – (77) 99934-4109;</w:t>
       </w:r>
     </w:p>
     <w:p>
@@ -1762,7 +1833,7 @@
           <w:sz w:val="20"/>
           <w:szCs w:val="20"/>
         </w:rPr>
-        <w:t>Centro de Atendimento à Mulher (CAM) – (77) 99933-8740;</w:t>
+        <w:t>Conselho Municipal dos Direitos da Mulher / ONGs – (77) 99932-2032.</w:t>
       </w:r>
     </w:p>
     <w:p>
@@ -1784,14 +1855,39 @@
           <w:szCs w:val="20"/>
         </w:rPr>
       </w:pPr>
-      <w:r>
-        <w:rPr>
-          <w:rFonts w:ascii="Verdana" w:eastAsia="Verdana" w:hAnsi="Verdana" w:cs="Verdana"/>
-          <w:color w:val="000000"/>
-          <w:sz w:val="20"/>
-          <w:szCs w:val="20"/>
-        </w:rPr>
-        <w:t>Guarda Municipal – (77) 99934-4109;</w:t>
+    </w:p>
+    <w:p>
+      <w:pPr>
+        <w:pStyle w:val="PargrafodaLista"/>
+        <w:numPr>
+          <w:ilvl w:val="0"/>
+          <w:numId w:val="15"/>
+        </w:numPr>
+        <w:pBdr>
+          <w:top w:val="nil"/>
+          <w:left w:val="nil"/>
+          <w:bottom w:val="nil"/>
+          <w:right w:val="nil"/>
+          <w:between w:val="nil"/>
+        </w:pBdr>
+        <w:spacing w:line="360" w:lineRule="auto"/>
+        <w:ind w:left="0" w:firstLine="709"/>
+        <w:jc w:val="both"/>
+        <w:rPr>
+          <w:rFonts w:ascii="Verdana" w:eastAsia="Verdana" w:hAnsi="Verdana" w:cs="Verdana"/>
+          <w:color w:val="000000"/>
+          <w:sz w:val="20"/>
+          <w:szCs w:val="20"/>
+        </w:rPr>
+      </w:pPr>
+      <w:r>
+        <w:rPr>
+          <w:rFonts w:ascii="Verdana" w:eastAsia="Verdana" w:hAnsi="Verdana" w:cs="Verdana"/>
+          <w:color w:val="000000"/>
+          <w:sz w:val="20"/>
+          <w:szCs w:val="20"/>
+        </w:rPr>
+        <w:t>Dados estatísticos de violência doméstica (últimos três anos – fonte: SIGESPOL)</w:t>
       </w:r>
     </w:p>
     <w:p>
@@ -1820,7 +1916,17 @@
           <w:sz w:val="20"/>
           <w:szCs w:val="20"/>
         </w:rPr>
-        <w:t>Conselho Municipal dos Direitos da Mulher / ONGs – (77) 99932-2032.</w:t>
+        <w:t xml:space="preserve">A análise das ocorrências registradas de 2024 a 2026 demonstra, somente em 2026, 314 ocorrências de “Maria da Penha” registradas no SIGESPOL até 12/10/2026, média superior a 01 (uma) ocorrência por dia, sendo 30 (trinta) registros apenas entre 29/09 e 12/10/2026, distribuídos entre Luís Eduardo Magalhães e São Desidério. Nos anos anteriores, foram registradas 382 ocorrências em 2024 e 404 em 2025, aumento de aproximadamente 6%. Mantida a média diária de 2026 (cerca de 1,1 ocorrência por dia), a projeção para o ano </w:t>
+      </w:r>
+      <w:r>
+        <w:rPr>
+          <w:rFonts w:ascii="Verdana" w:eastAsia="Verdana" w:hAnsi="Verdana" w:cs="Verdana"/>
+          <w:color w:val="000000"/>
+          <w:sz w:val="20"/>
+          <w:szCs w:val="20"/>
+        </w:rPr>
+        <w:lastRenderedPageBreak/>
+        <w:t xml:space="preserve">é de aproximadamente 400 ocorrências, confirmando o patamar elevado e constante da demanda. Observa-se maior concentração de ocorrências no bairro Santa Cruz. </w:t>
       </w:r>
     </w:p>
     <w:p>
@@ -1849,7 +1955,7 @@
           <w:sz w:val="20"/>
           <w:szCs w:val="20"/>
         </w:rPr>
-        <w:t>3. Dados estatísticos de violência doméstica (últimos três anos – fonte: SIGESPOL)</w:t>
+        <w:t>(Gráfico das ocorrências de 2024 a 2026 – ver Anexo C)</w:t>
       </w:r>
     </w:p>
     <w:p>
@@ -1878,7 +1984,7 @@
           <w:sz w:val="20"/>
           <w:szCs w:val="20"/>
         </w:rPr>
-        <w:t>A análise das ocorrências registradas de 2024 a 2026 demonstra, somente em 2026, 314 ocorrências de “Maria da Penha” registradas no SIGESPOL até 12/10/2026, média superior a 01 (uma) ocorrência por dia, sendo 30 (trinta) registros apenas entre 29/09 e 12/10/2026, distribuídos entre Luís Eduardo Magalhães e São Desidério. Nos anos anteriores, foram registradas 382 ocorrências em 2024 e 404 em 2025, aumento de aproximadamente 6%. Mantida a média diária de 2026 (cerca de 1,1 ocorrência por dia), a projeção para o ano é de aproximadamente 400 ocorrências, confirmando o patamar elevado e constante da demanda. Observa-se maior concentração de ocorrências no bairro Santa Cruz. Os dados são apresentados de forma agregada, sem qualquer elemento que permita a identificação de vítimas ou autores (LGPD).</w:t>
+        <w:t>(Mancha criminal de violência doméstica em 2026 – ver Anexo D)</w:t>
       </w:r>
     </w:p>
     <w:p>
@@ -1906,9 +2012,8 @@
           <w:color w:val="000000"/>
           <w:sz w:val="20"/>
           <w:szCs w:val="20"/>
-          <w:highlight w:val="yellow"/>
-        </w:rPr>
-        <w:t>[INSERIR IMAGEM: Gráfico de colunas – ocorrências de violência doméstica por ano (2024, 2025 e 2026), fonte SIGESPOL]</w:t>
+        </w:rPr>
+        <w:t>4. Medidas Protetivas de Urgência (últimos três anos)</w:t>
       </w:r>
     </w:p>
     <w:p>
@@ -1936,9 +2041,8 @@
           <w:color w:val="000000"/>
           <w:sz w:val="20"/>
           <w:szCs w:val="20"/>
-          <w:highlight w:val="yellow"/>
-        </w:rPr>
-        <w:t>[INSERIR IMAGEM: Mancha criminal de violência doméstica em 2026 – apenas por bairro/área, sem pontos de residência das vítimas]</w:t>
+        </w:rPr>
+        <w:t>A RMP acompanhava 192 (cento e noventa e duas) MPUs ativas em 2025 e acompanha, atualmente, 202 (duzentas e duas) MPUs ativas em 2026, aumento de aproximadamente 5%. Os registros de MPUs de períodos anteriores não estão disponíveis no 27º BPM, pois eram realizados pela Unidade da RMP da 83ª CIPM/Barreiras, o que reforça a necessidade de gestão própria. A fiscalização regular desse universo já é realizada pelo efetivo do 27º BPM, sendo necessária a sua formalização para garantir gestão, controle e planejamento próprios.</w:t>
       </w:r>
     </w:p>
     <w:p>
@@ -1967,7 +2071,7 @@
           <w:sz w:val="20"/>
           <w:szCs w:val="20"/>
         </w:rPr>
-        <w:t>4. Medidas Protetivas de Urgência (últimos três anos)</w:t>
+        <w:t>(Gráfico das MPUs ativas em 2025 e 2026 – ver Anexo E)</w:t>
       </w:r>
     </w:p>
     <w:p>
@@ -1996,7 +2100,7 @@
           <w:sz w:val="20"/>
           <w:szCs w:val="20"/>
         </w:rPr>
-        <w:t>A RMP acompanhava 192 (cento e noventa e duas) MPUs ativas em 2025 e acompanha, atualmente, 202 (duzentas e duas) MPUs ativas em 2026, aumento de aproximadamente 5%. Os registros de MPUs de períodos anteriores não estão disponíveis no 27º BPM, pois eram realizados pela Unidade da RMP da 83ª CIPM/Barreiras, o que reforça a necessidade de gestão própria. A fiscalização regular desse universo já é realizada pelo efetivo do 27º BPM, sendo necessária a sua formalização para garantir gestão, controle e planejamento próprios.</w:t>
+        <w:t>5. Local de funcionamento</w:t>
       </w:r>
     </w:p>
     <w:p>
@@ -2024,9 +2128,8 @@
           <w:color w:val="000000"/>
           <w:sz w:val="20"/>
           <w:szCs w:val="20"/>
-          <w:highlight w:val="yellow"/>
-        </w:rPr>
-        <w:t>[INSERIR IMAGEM: Gráfico de colunas – MPUs ativas em 2025 (192) e 2026 (202)]</w:t>
+        </w:rPr>
+        <w:t>A RMP do 27º BPM funciona na sede do 27º BPM, à Rua Xique-Xique, n.º 530, Loteamento Santa Cruz, Luís Eduardo Magalhães/BA, em espaço compartilhado com a Coordenação de Apoio Administrativo (CAA), dispondo de ambiente reservado para o acolhimento das mulheres, garantindo privacidade no atendimento.</w:t>
       </w:r>
     </w:p>
     <w:p>
@@ -2055,7 +2158,7 @@
           <w:sz w:val="20"/>
           <w:szCs w:val="20"/>
         </w:rPr>
-        <w:t>5. Local de funcionamento</w:t>
+        <w:t>(Fotos das instalações da RMP – ver Anexo F)</w:t>
       </w:r>
     </w:p>
     <w:p>
@@ -2084,7 +2187,7 @@
           <w:sz w:val="20"/>
           <w:szCs w:val="20"/>
         </w:rPr>
-        <w:t>A RMP do 27º BPM funciona na sede do 27º BPM, à Rua Xique-Xique, n.º 530, Loteamento Santa Cruz, Luís Eduardo Magalhães/BA, em espaço compartilhado com a Coordenação de Apoio Administrativo (CAA), dispondo de ambiente reservado para o acolhimento das mulheres, garantindo privacidade no atendimento.</w:t>
+        <w:t>6. Recursos humanos e materiais exclusivos</w:t>
       </w:r>
     </w:p>
     <w:p>
@@ -2112,9 +2215,8 @@
           <w:color w:val="000000"/>
           <w:sz w:val="20"/>
           <w:szCs w:val="20"/>
-          <w:highlight w:val="yellow"/>
-        </w:rPr>
-        <w:t>[INSERIR IMAGEM: Foto das instalações da RMP na sede do 27º BPM – sem pessoas atendidas]</w:t>
+        </w:rPr>
+        <w:t>Em atendimento ao art. 4º, §2º, e art. 7º, §2º, da Portaria n.º 042-CG/2024, a RMP já conta com 05 (cinco) policiais militares do 27º BPM, efetivo mínimo exigido, sendo 01 (um) Oficial (Tenente PM), comandante da RMP, 01 (um) Sargento, 01 (um) Cabo e 02 (dois) Soldados, dos quais 02 (duas) são policiais femininas (relação nominal no Anexo B, de acesso restrito), empregados em guarnição tipo “B”, em regime de escala ordinário, empregados exclusivamente na atividade da RMP, estando a capacitação em enfrentamento à violência contra a mulher (art. 4º, §5º) já agendada junto ao BPPM. A RMP já dispõe de viatura exclusiva, prefixo 8.2732, Renault/Duster, placa TGX 2E57, com cota de combustível sob gestão da Unidade.</w:t>
       </w:r>
     </w:p>
     <w:p>
@@ -2143,7 +2245,7 @@
           <w:sz w:val="20"/>
           <w:szCs w:val="20"/>
         </w:rPr>
-        <w:t>6. Recursos humanos e materiais exclusivos</w:t>
+        <w:t>(Foto da viatura da RMP – ver Anexo G)</w:t>
       </w:r>
     </w:p>
     <w:p>
@@ -2172,7 +2274,7 @@
           <w:sz w:val="20"/>
           <w:szCs w:val="20"/>
         </w:rPr>
-        <w:t>Em atendimento ao art. 4º, §2º, e art. 7º, §2º, da Portaria n.º 042-CG/2024, a RMP já conta com 05 (cinco) policiais militares do 27º BPM, efetivo mínimo exigido, sendo 01 (um) Oficial (Tenente PM), comandante da RMP, 01 (um) Sargento, 01 (um) Cabo e 02 (dois) Soldados, dos quais 02 (duas) são policiais femininas (relação nominal no Anexo B, de acesso restrito), empregados em guarnição tipo “B”, em regime de escala ordinário, empregados exclusivamente na atividade da RMP, estando a capacitação em enfrentamento à violência contra a mulher (art. 4º, §5º) já agendada junto ao BPPM. A RMP já dispõe de viatura exclusiva, prefixo 8.2732, Renault/Duster, placa TGX 2E57, com cota de combustível sob gestão da Unidade.</w:t>
+        <w:t>7. Outras informações</w:t>
       </w:r>
     </w:p>
     <w:p>
@@ -2200,9 +2302,18 @@
           <w:color w:val="000000"/>
           <w:sz w:val="20"/>
           <w:szCs w:val="20"/>
-          <w:highlight w:val="yellow"/>
-        </w:rPr>
-        <w:t>[INSERIR IMAGEM: Foto da viatura caracterizada destinada à RMP]</w:t>
+        </w:rPr>
+        <w:t xml:space="preserve">A atuação já desenvolvida na área do 27º BPM (fiscalização de MPU, atendimento pós-ocorrência, palestras e Sala Lilás) demonstra a viabilidade da formalização. Registra-se, </w:t>
+      </w:r>
+      <w:r>
+        <w:rPr>
+          <w:rFonts w:ascii="Verdana" w:eastAsia="Verdana" w:hAnsi="Verdana" w:cs="Verdana"/>
+          <w:color w:val="000000"/>
+          <w:sz w:val="20"/>
+          <w:szCs w:val="20"/>
+        </w:rPr>
+        <w:lastRenderedPageBreak/>
+        <w:t>ainda, a realização de mais de 25 (vinte e cinco) palestras em 2025 e de 22 (vinte e duas) palestras em 2026, até a presente data, voltadas ao público interno e externo (art. 2º, IV, da Portaria n.º 042-CG/2024). A RMP também atuará no cumprimento da Portaria n.º 083-CG/2026, apoiando os casos que envolvam policiais militares e conduzindo o projeto “Homens em Diálogo”.</w:t>
       </w:r>
     </w:p>
     <w:p>
@@ -2231,66 +2342,7 @@
           <w:sz w:val="20"/>
           <w:szCs w:val="20"/>
         </w:rPr>
-        <w:t>7. Outras informações</w:t>
-      </w:r>
-    </w:p>
-    <w:p>
-      <w:pPr>
-        <w:pBdr>
-          <w:top w:val="nil"/>
-          <w:left w:val="nil"/>
-          <w:bottom w:val="nil"/>
-          <w:right w:val="nil"/>
-          <w:between w:val="nil"/>
-        </w:pBdr>
-        <w:spacing w:line="360" w:lineRule="auto"/>
-        <w:ind w:firstLine="709"/>
-        <w:jc w:val="both"/>
-        <w:rPr>
-          <w:rFonts w:ascii="Verdana" w:eastAsia="Verdana" w:hAnsi="Verdana" w:cs="Verdana"/>
-          <w:color w:val="000000"/>
-          <w:sz w:val="20"/>
-          <w:szCs w:val="20"/>
-        </w:rPr>
-      </w:pPr>
-      <w:r>
-        <w:rPr>
-          <w:rFonts w:ascii="Verdana" w:eastAsia="Verdana" w:hAnsi="Verdana" w:cs="Verdana"/>
-          <w:color w:val="000000"/>
-          <w:sz w:val="20"/>
-          <w:szCs w:val="20"/>
-        </w:rPr>
-        <w:t>A atuação já desenvolvida na área do 27º BPM (fiscalização de MPU, atendimento pós-ocorrência, palestras e Sala Lilás) demonstra a viabilidade da formalização. Registra-se, ainda, a realização de mais de 25 (vinte e cinco) palestras em 2025 e de 22 (vinte e duas) palestras em 2026, até a presente data, voltadas ao público interno e externo (art. 2º, IV, da Portaria n.º 042-CG/2024). A RMP também atuará no cumprimento da Portaria n.º 083-CG/2026, apoiando os casos que envolvam policiais militares e conduzindo o projeto “Homens em Diálogo”.</w:t>
-      </w:r>
-    </w:p>
-    <w:p>
-      <w:pPr>
-        <w:pBdr>
-          <w:top w:val="nil"/>
-          <w:left w:val="nil"/>
-          <w:bottom w:val="nil"/>
-          <w:right w:val="nil"/>
-          <w:between w:val="nil"/>
-        </w:pBdr>
-        <w:spacing w:line="360" w:lineRule="auto"/>
-        <w:ind w:firstLine="709"/>
-        <w:jc w:val="both"/>
-        <w:rPr>
-          <w:rFonts w:ascii="Verdana" w:eastAsia="Verdana" w:hAnsi="Verdana" w:cs="Verdana"/>
-          <w:color w:val="000000"/>
-          <w:sz w:val="20"/>
-          <w:szCs w:val="20"/>
-        </w:rPr>
-      </w:pPr>
-      <w:r>
-        <w:rPr>
-          <w:rFonts w:ascii="Verdana" w:eastAsia="Verdana" w:hAnsi="Verdana" w:cs="Verdana"/>
-          <w:color w:val="000000"/>
-          <w:sz w:val="20"/>
-          <w:szCs w:val="20"/>
-          <w:highlight w:val="yellow"/>
-        </w:rPr>
-        <w:t>[INSERIR IMAGEM: Fotos de palestras e ações da RMP – reaproveitar o slide 55 da apresentação, evitando rostos de vítimas]</w:t>
+        <w:t>(Registros fotográficos de palestras e ações da RMP – ver Anexo H)</w:t>
       </w:r>
     </w:p>
     <w:p>
@@ -2572,62 +2624,6 @@
           <w:szCs w:val="20"/>
         </w:rPr>
       </w:pPr>
-      <w:r>
-        <w:rPr>
-          <w:rFonts w:ascii="Verdana" w:eastAsia="Verdana" w:hAnsi="Verdana" w:cs="Verdana"/>
-          <w:color w:val="000000"/>
-          <w:sz w:val="20"/>
-          <w:szCs w:val="20"/>
-        </w:rPr>
-        <w:t>Paralelamente, torna-se imprescindível preservar o policiamento ordinário do município, evitando o comprometimento da segurança nas demais localidades atendidas</w:t>
-      </w:r>
-      <w:r>
-        <w:rPr>
-          <w:rFonts w:ascii="Verdana" w:eastAsia="Verdana" w:hAnsi="Verdana" w:cs="Verdana"/>
-          <w:color w:val="000000"/>
-          <w:sz w:val="20"/>
-          <w:szCs w:val="20"/>
-        </w:rPr>
-        <w:t xml:space="preserve"> pelo</w:t>
-      </w:r>
-      <w:r>
-        <w:rPr>
-          <w:rFonts w:ascii="Verdana" w:eastAsia="Verdana" w:hAnsi="Verdana" w:cs="Verdana"/>
-          <w:color w:val="000000"/>
-          <w:sz w:val="20"/>
-          <w:szCs w:val="20"/>
-        </w:rPr>
-        <w:t xml:space="preserve"> </w:t>
-      </w:r>
-      <w:r>
-        <w:rPr>
-          <w:rFonts w:ascii="Verdana" w:eastAsia="Verdana" w:hAnsi="Verdana" w:cs="Verdana"/>
-          <w:color w:val="000000"/>
-          <w:sz w:val="20"/>
-          <w:szCs w:val="20"/>
-        </w:rPr>
-        <w:t>27º BPM.</w:t>
-      </w:r>
-    </w:p>
-    <w:p>
-      <w:pPr>
-        <w:pBdr>
-          <w:top w:val="nil"/>
-          <w:left w:val="nil"/>
-          <w:bottom w:val="nil"/>
-          <w:right w:val="nil"/>
-          <w:between w:val="nil"/>
-        </w:pBdr>
-        <w:spacing w:line="360" w:lineRule="auto"/>
-        <w:ind w:firstLine="709"/>
-        <w:jc w:val="both"/>
-        <w:rPr>
-          <w:rFonts w:ascii="Verdana" w:eastAsia="Verdana" w:hAnsi="Verdana" w:cs="Verdana"/>
-          <w:color w:val="000000"/>
-          <w:sz w:val="20"/>
-          <w:szCs w:val="20"/>
-        </w:rPr>
-      </w:pPr>
     </w:p>
     <w:p>
       <w:pPr>
@@ -2922,7 +2918,147 @@
           <w:sz w:val="20"/>
           <w:szCs w:val="20"/>
         </w:rPr>
-        <w:t>Anexo C – Dados estatísticos de violência doméstica e MPUs (2024–2026), fonte SIGESPOL.</w:t>
+        <w:t>Anexo C – Gráfico das ocorrências de violência doméstica (2024–2026), fonte SIGESPOL;</w:t>
+      </w:r>
+    </w:p>
+    <w:p>
+      <w:pPr>
+        <w:pBdr>
+          <w:top w:val="nil"/>
+          <w:left w:val="nil"/>
+          <w:bottom w:val="nil"/>
+          <w:right w:val="nil"/>
+          <w:between w:val="nil"/>
+        </w:pBdr>
+        <w:spacing w:line="360" w:lineRule="auto"/>
+        <w:ind w:left="426"/>
+        <w:rPr>
+          <w:rFonts w:ascii="Verdana" w:eastAsia="Verdana" w:hAnsi="Verdana" w:cs="Verdana"/>
+          <w:color w:val="000000"/>
+          <w:sz w:val="20"/>
+          <w:szCs w:val="20"/>
+        </w:rPr>
+      </w:pPr>
+      <w:r>
+        <w:rPr>
+          <w:rFonts w:ascii="Verdana" w:eastAsia="Verdana" w:hAnsi="Verdana" w:cs="Verdana"/>
+          <w:color w:val="000000"/>
+          <w:sz w:val="20"/>
+          <w:szCs w:val="20"/>
+        </w:rPr>
+        <w:t>Anexo D – Mancha criminal de violência doméstica (2026);</w:t>
+      </w:r>
+    </w:p>
+    <w:p>
+      <w:pPr>
+        <w:pBdr>
+          <w:top w:val="nil"/>
+          <w:left w:val="nil"/>
+          <w:bottom w:val="nil"/>
+          <w:right w:val="nil"/>
+          <w:between w:val="nil"/>
+        </w:pBdr>
+        <w:spacing w:line="360" w:lineRule="auto"/>
+        <w:ind w:left="426"/>
+        <w:rPr>
+          <w:rFonts w:ascii="Verdana" w:eastAsia="Verdana" w:hAnsi="Verdana" w:cs="Verdana"/>
+          <w:color w:val="000000"/>
+          <w:sz w:val="20"/>
+          <w:szCs w:val="20"/>
+        </w:rPr>
+      </w:pPr>
+      <w:r>
+        <w:rPr>
+          <w:rFonts w:ascii="Verdana" w:eastAsia="Verdana" w:hAnsi="Verdana" w:cs="Verdana"/>
+          <w:color w:val="000000"/>
+          <w:sz w:val="20"/>
+          <w:szCs w:val="20"/>
+        </w:rPr>
+        <w:t>Anexo E – Gráfico das MPUs ativas (2025–2026);</w:t>
+      </w:r>
+    </w:p>
+    <w:p>
+      <w:pPr>
+        <w:pBdr>
+          <w:top w:val="nil"/>
+          <w:left w:val="nil"/>
+          <w:bottom w:val="nil"/>
+          <w:right w:val="nil"/>
+          <w:between w:val="nil"/>
+        </w:pBdr>
+        <w:spacing w:line="360" w:lineRule="auto"/>
+        <w:ind w:left="426"/>
+        <w:rPr>
+          <w:rFonts w:ascii="Verdana" w:eastAsia="Verdana" w:hAnsi="Verdana" w:cs="Verdana"/>
+          <w:color w:val="000000"/>
+          <w:sz w:val="20"/>
+          <w:szCs w:val="20"/>
+        </w:rPr>
+      </w:pPr>
+      <w:r>
+        <w:rPr>
+          <w:rFonts w:ascii="Verdana" w:eastAsia="Verdana" w:hAnsi="Verdana" w:cs="Verdana"/>
+          <w:color w:val="000000"/>
+          <w:sz w:val="20"/>
+          <w:szCs w:val="20"/>
+        </w:rPr>
+        <w:t>Anexo F – Fotos das instalações da RMP;</w:t>
+      </w:r>
+    </w:p>
+    <w:p>
+      <w:pPr>
+        <w:pBdr>
+          <w:top w:val="nil"/>
+          <w:left w:val="nil"/>
+          <w:bottom w:val="nil"/>
+          <w:right w:val="nil"/>
+          <w:between w:val="nil"/>
+        </w:pBdr>
+        <w:spacing w:line="360" w:lineRule="auto"/>
+        <w:ind w:left="426"/>
+        <w:rPr>
+          <w:rFonts w:ascii="Verdana" w:eastAsia="Verdana" w:hAnsi="Verdana" w:cs="Verdana"/>
+          <w:color w:val="000000"/>
+          <w:sz w:val="20"/>
+          <w:szCs w:val="20"/>
+        </w:rPr>
+      </w:pPr>
+      <w:r>
+        <w:rPr>
+          <w:rFonts w:ascii="Verdana" w:eastAsia="Verdana" w:hAnsi="Verdana" w:cs="Verdana"/>
+          <w:color w:val="000000"/>
+          <w:sz w:val="20"/>
+          <w:szCs w:val="20"/>
+        </w:rPr>
+        <w:t>Anexo G – Foto da viatura da RMP;</w:t>
+      </w:r>
+    </w:p>
+    <w:p>
+      <w:pPr>
+        <w:pBdr>
+          <w:top w:val="nil"/>
+          <w:left w:val="nil"/>
+          <w:bottom w:val="nil"/>
+          <w:right w:val="nil"/>
+          <w:between w:val="nil"/>
+        </w:pBdr>
+        <w:spacing w:line="360" w:lineRule="auto"/>
+        <w:ind w:left="426"/>
+        <w:rPr>
+          <w:rFonts w:ascii="Verdana" w:eastAsia="Verdana" w:hAnsi="Verdana" w:cs="Verdana"/>
+          <w:color w:val="000000"/>
+          <w:sz w:val="20"/>
+          <w:szCs w:val="20"/>
+        </w:rPr>
+      </w:pPr>
+      <w:r>
+        <w:rPr>
+          <w:rFonts w:ascii="Verdana" w:eastAsia="Verdana" w:hAnsi="Verdana" w:cs="Verdana"/>
+          <w:color w:val="000000"/>
+          <w:sz w:val="20"/>
+          <w:szCs w:val="20"/>
+        </w:rPr>
+        <w:t>Anexo H – Registros fotográficos de palestras e ações da RMP.</w:t>
       </w:r>
     </w:p>
     <w:p>
@@ -3742,7 +3878,7 @@
           <w:szCs w:val="20"/>
           <w:highlight w:val="yellow"/>
         </w:rPr>
-        <w:t>[INSERIR IMAGEM: Digitalização do parecer favorável do CPR-O, substituindo o ofício que estava aqui]</w:t>
+        <w:t>[INSERIR IMAGEM: Digitalização do parecer favorável do Comandante do CPR-O]</w:t>
       </w:r>
     </w:p>
     <w:p>
@@ -3782,6 +3918,14 @@
           <w:sz w:val="20"/>
           <w:szCs w:val="20"/>
         </w:rPr>
+        <w:br w:type="page"/>
+      </w:r>
+      <w:r>
+        <w:rPr>
+          <w:rFonts w:ascii="Verdana" w:eastAsia="Verdana" w:hAnsi="Verdana" w:cs="Verdana"/>
+          <w:sz w:val="20"/>
+          <w:szCs w:val="20"/>
+        </w:rPr>
         <w:t>ANEXO – B (ACESSO RESTRITO – LGPD)</w:t>
       </w:r>
     </w:p>
@@ -3927,82 +4071,525 @@
     </w:p>
     <w:p>
       <w:pPr>
+        <w:jc w:val="center"/>
+        <w:rPr>
+          <w:rFonts w:ascii="Verdana" w:eastAsia="Verdana" w:hAnsi="Verdana" w:cs="Verdana"/>
+          <w:b/>
+          <w:bCs/>
+          <w:color w:val="000000"/>
+          <w:sz w:val="20"/>
+          <w:szCs w:val="20"/>
+        </w:rPr>
+      </w:pPr>
+      <w:r>
+        <w:rPr>
+          <w:rFonts w:ascii="Verdana" w:eastAsia="Verdana" w:hAnsi="Verdana" w:cs="Verdana"/>
+          <w:b/>
+          <w:bCs/>
+          <w:color w:val="000000"/>
+          <w:sz w:val="20"/>
+          <w:szCs w:val="20"/>
+        </w:rPr>
+        <w:br w:type="page"/>
+      </w:r>
+      <w:r>
+        <w:rPr>
+          <w:rFonts w:ascii="Verdana" w:eastAsia="Verdana" w:hAnsi="Verdana" w:cs="Verdana"/>
+          <w:b/>
+          <w:bCs/>
+          <w:color w:val="000000"/>
+          <w:sz w:val="20"/>
+          <w:szCs w:val="20"/>
+        </w:rPr>
+        <w:t>ANEXO – C</w:t>
+      </w:r>
+    </w:p>
+    <w:p>
+      <w:pPr>
+        <w:pBdr>
+          <w:top w:val="nil"/>
+          <w:left w:val="nil"/>
+          <w:bottom w:val="nil"/>
+          <w:right w:val="nil"/>
+          <w:between w:val="nil"/>
+        </w:pBdr>
+        <w:spacing w:line="360" w:lineRule="auto"/>
+        <w:jc w:val="center"/>
+        <w:rPr>
+          <w:rFonts w:ascii="Verdana" w:eastAsia="Verdana" w:hAnsi="Verdana" w:cs="Verdana"/>
+          <w:color w:val="000000"/>
+          <w:sz w:val="20"/>
+          <w:szCs w:val="20"/>
+        </w:rPr>
+      </w:pPr>
+      <w:r>
+        <w:rPr>
+          <w:rFonts w:ascii="Verdana" w:eastAsia="Verdana" w:hAnsi="Verdana" w:cs="Verdana"/>
+          <w:color w:val="000000"/>
+          <w:sz w:val="20"/>
+          <w:szCs w:val="20"/>
+        </w:rPr>
+        <w:t>GRÁFICO DAS OCORRÊNCIAS DE VIOLÊNCIA DOMÉSTICA (2024–2026)</w:t>
+      </w:r>
+    </w:p>
+    <w:p>
+      <w:pPr>
         <w:spacing w:line="360" w:lineRule="auto"/>
         <w:ind w:firstLine="720"/>
-        <w:jc w:val="both"/>
-        <w:rPr>
-          <w:rFonts w:ascii="Verdana" w:eastAsia="Verdana" w:hAnsi="Verdana" w:cs="Verdana"/>
-          <w:sz w:val="20"/>
-          <w:szCs w:val="20"/>
-        </w:rPr>
-      </w:pPr>
-      <w:r>
-        <w:rPr>
-          <w:rFonts w:ascii="Verdana" w:eastAsia="Verdana" w:hAnsi="Verdana" w:cs="Verdana"/>
-          <w:sz w:val="20"/>
-          <w:szCs w:val="20"/>
-        </w:rPr>
-      </w:r>
-    </w:p>
-    <w:p>
-      <w:pPr>
-        <w:pBdr>
-          <w:top w:val="nil"/>
-          <w:left w:val="nil"/>
-          <w:bottom w:val="nil"/>
-          <w:right w:val="nil"/>
-          <w:between w:val="nil"/>
-        </w:pBdr>
-        <w:spacing w:line="360" w:lineRule="auto"/>
         <w:jc w:val="center"/>
         <w:rPr>
           <w:rFonts w:ascii="Verdana" w:eastAsia="Verdana" w:hAnsi="Verdana" w:cs="Verdana"/>
-          <w:noProof/>
-          <w:color w:val="000000"/>
-          <w:sz w:val="20"/>
-          <w:szCs w:val="20"/>
-        </w:rPr>
-      </w:pPr>
-      <w:r>
-        <w:rPr>
-          <w:noProof/>
-        </w:rPr>
-        <w:drawing>
-          <wp:inline distT="0" distB="0" distL="0" distR="0" wp14:anchorId="189A8DEF" wp14:editId="33A25FF5">
-            <wp:extent cx="4495165" cy="7171478"/>
-            <wp:effectExtent l="0" t="0" r="635" b="0"/>
-            <wp:docPr id="918713205" name="Imagem 1"/>
-            <wp:cNvGraphicFramePr>
-              <a:graphicFrameLocks xmlns:a="http://schemas.openxmlformats.org/drawingml/2006/main" noChangeAspect="1"/>
-            </wp:cNvGraphicFramePr>
-            <a:graphic xmlns:a="http://schemas.openxmlformats.org/drawingml/2006/main">
-              <a:graphicData uri="http://schemas.openxmlformats.org/drawingml/2006/picture">
-                <pic:pic xmlns:pic="http://schemas.openxmlformats.org/drawingml/2006/picture">
-                  <pic:nvPicPr>
-                    <pic:cNvPr id="918713205" name=""/>
-                    <pic:cNvPicPr/>
-                  </pic:nvPicPr>
-                  <pic:blipFill>
-                    <a:blip r:embed="rId11"/>
-                    <a:stretch>
-                      <a:fillRect/>
-                    </a:stretch>
-                  </pic:blipFill>
-                  <pic:spPr>
-                    <a:xfrm>
-                      <a:off x="0" y="0"/>
-                      <a:ext cx="4496102" cy="7172973"/>
-                    </a:xfrm>
-                    <a:prstGeom prst="rect">
-                      <a:avLst/>
-                    </a:prstGeom>
-                  </pic:spPr>
-                </pic:pic>
-              </a:graphicData>
-            </a:graphic>
-          </wp:inline>
-        </w:drawing>
-      </w:r>
+          <w:sz w:val="20"/>
+          <w:szCs w:val="20"/>
+        </w:rPr>
+      </w:pPr>
+      <w:r>
+        <w:rPr>
+          <w:rFonts w:ascii="Verdana" w:eastAsia="Verdana" w:hAnsi="Verdana" w:cs="Verdana"/>
+          <w:i/>
+          <w:sz w:val="20"/>
+          <w:szCs w:val="20"/>
+          <w:highlight w:val="yellow"/>
+        </w:rPr>
+        <w:t>[INSERIR IMAGEM: Gráfico de colunas: 2024 – 382; 2025 – 404; 2026 – 314 (até 12/10/2026). Fonte: SIGESPOL]</w:t>
+      </w:r>
+    </w:p>
+    <w:p>
+      <w:pPr>
+        <w:jc w:val="center"/>
+        <w:rPr>
+          <w:rFonts w:ascii="Verdana" w:eastAsia="Verdana" w:hAnsi="Verdana" w:cs="Verdana"/>
+          <w:b/>
+          <w:bCs/>
+          <w:color w:val="000000"/>
+          <w:sz w:val="20"/>
+          <w:szCs w:val="20"/>
+        </w:rPr>
+      </w:pPr>
+      <w:r>
+        <w:rPr>
+          <w:rFonts w:ascii="Verdana" w:eastAsia="Verdana" w:hAnsi="Verdana" w:cs="Verdana"/>
+          <w:b/>
+          <w:bCs/>
+          <w:color w:val="000000"/>
+          <w:sz w:val="20"/>
+          <w:szCs w:val="20"/>
+        </w:rPr>
+        <w:br w:type="page"/>
+      </w:r>
+      <w:r>
+        <w:rPr>
+          <w:rFonts w:ascii="Verdana" w:eastAsia="Verdana" w:hAnsi="Verdana" w:cs="Verdana"/>
+          <w:b/>
+          <w:bCs/>
+          <w:color w:val="000000"/>
+          <w:sz w:val="20"/>
+          <w:szCs w:val="20"/>
+        </w:rPr>
+        <w:t>ANEXO – D</w:t>
+      </w:r>
+    </w:p>
+    <w:p>
+      <w:pPr>
+        <w:pBdr>
+          <w:top w:val="nil"/>
+          <w:left w:val="nil"/>
+          <w:bottom w:val="nil"/>
+          <w:right w:val="nil"/>
+          <w:between w:val="nil"/>
+        </w:pBdr>
+        <w:spacing w:line="360" w:lineRule="auto"/>
+        <w:jc w:val="center"/>
+        <w:rPr>
+          <w:rFonts w:ascii="Verdana" w:eastAsia="Verdana" w:hAnsi="Verdana" w:cs="Verdana"/>
+          <w:color w:val="000000"/>
+          <w:sz w:val="20"/>
+          <w:szCs w:val="20"/>
+        </w:rPr>
+      </w:pPr>
+      <w:r>
+        <w:rPr>
+          <w:rFonts w:ascii="Verdana" w:eastAsia="Verdana" w:hAnsi="Verdana" w:cs="Verdana"/>
+          <w:color w:val="000000"/>
+          <w:sz w:val="20"/>
+          <w:szCs w:val="20"/>
+        </w:rPr>
+        <w:t>MANCHA CRIMINAL DE VIOLÊNCIA DOMÉSTICA (2026)</w:t>
+      </w:r>
+    </w:p>
+    <w:p>
+      <w:pPr>
+        <w:spacing w:line="360" w:lineRule="auto"/>
+        <w:ind w:firstLine="720"/>
+        <w:jc w:val="center"/>
+        <w:rPr>
+          <w:rFonts w:ascii="Verdana" w:eastAsia="Verdana" w:hAnsi="Verdana" w:cs="Verdana"/>
+          <w:sz w:val="20"/>
+          <w:szCs w:val="20"/>
+        </w:rPr>
+      </w:pPr>
+      <w:r>
+        <w:rPr>
+          <w:rFonts w:ascii="Verdana" w:eastAsia="Verdana" w:hAnsi="Verdana" w:cs="Verdana"/>
+          <w:i/>
+          <w:sz w:val="20"/>
+          <w:szCs w:val="20"/>
+          <w:highlight w:val="yellow"/>
+        </w:rPr>
+        <w:t>[INSERIR IMAGEM: Mancha por bairro/área, sem pontos de residência das vítimas (LGPD)]</w:t>
+      </w:r>
+    </w:p>
+    <w:p>
+      <w:pPr>
+        <w:jc w:val="center"/>
+        <w:rPr>
+          <w:rFonts w:ascii="Verdana" w:eastAsia="Verdana" w:hAnsi="Verdana" w:cs="Verdana"/>
+          <w:b/>
+          <w:bCs/>
+          <w:color w:val="000000"/>
+          <w:sz w:val="20"/>
+          <w:szCs w:val="20"/>
+        </w:rPr>
+      </w:pPr>
+      <w:r>
+        <w:rPr>
+          <w:rFonts w:ascii="Verdana" w:eastAsia="Verdana" w:hAnsi="Verdana" w:cs="Verdana"/>
+          <w:b/>
+          <w:bCs/>
+          <w:color w:val="000000"/>
+          <w:sz w:val="20"/>
+          <w:szCs w:val="20"/>
+        </w:rPr>
+        <w:br w:type="page"/>
+      </w:r>
+      <w:r>
+        <w:rPr>
+          <w:rFonts w:ascii="Verdana" w:eastAsia="Verdana" w:hAnsi="Verdana" w:cs="Verdana"/>
+          <w:b/>
+          <w:bCs/>
+          <w:color w:val="000000"/>
+          <w:sz w:val="20"/>
+          <w:szCs w:val="20"/>
+        </w:rPr>
+        <w:t>ANEXO – E</w:t>
+      </w:r>
+    </w:p>
+    <w:p>
+      <w:pPr>
+        <w:pBdr>
+          <w:top w:val="nil"/>
+          <w:left w:val="nil"/>
+          <w:bottom w:val="nil"/>
+          <w:right w:val="nil"/>
+          <w:between w:val="nil"/>
+        </w:pBdr>
+        <w:spacing w:line="360" w:lineRule="auto"/>
+        <w:jc w:val="center"/>
+        <w:rPr>
+          <w:rFonts w:ascii="Verdana" w:eastAsia="Verdana" w:hAnsi="Verdana" w:cs="Verdana"/>
+          <w:color w:val="000000"/>
+          <w:sz w:val="20"/>
+          <w:szCs w:val="20"/>
+        </w:rPr>
+      </w:pPr>
+      <w:r>
+        <w:rPr>
+          <w:rFonts w:ascii="Verdana" w:eastAsia="Verdana" w:hAnsi="Verdana" w:cs="Verdana"/>
+          <w:color w:val="000000"/>
+          <w:sz w:val="20"/>
+          <w:szCs w:val="20"/>
+        </w:rPr>
+        <w:t>GRÁFICO DAS MPUs ATIVAS (2025–2026)</w:t>
+      </w:r>
+    </w:p>
+    <w:p>
+      <w:pPr>
+        <w:spacing w:line="360" w:lineRule="auto"/>
+        <w:ind w:firstLine="720"/>
+        <w:jc w:val="center"/>
+        <w:rPr>
+          <w:rFonts w:ascii="Verdana" w:eastAsia="Verdana" w:hAnsi="Verdana" w:cs="Verdana"/>
+          <w:sz w:val="20"/>
+          <w:szCs w:val="20"/>
+        </w:rPr>
+      </w:pPr>
+      <w:r>
+        <w:rPr>
+          <w:rFonts w:ascii="Verdana" w:eastAsia="Verdana" w:hAnsi="Verdana" w:cs="Verdana"/>
+          <w:i/>
+          <w:sz w:val="20"/>
+          <w:szCs w:val="20"/>
+          <w:highlight w:val="yellow"/>
+        </w:rPr>
+        <w:t>[INSERIR IMAGEM: Gráfico de colunas: 2025 – 192; 2026 – 202]</w:t>
+      </w:r>
+    </w:p>
+    <w:p>
+      <w:pPr>
+        <w:jc w:val="center"/>
+        <w:rPr>
+          <w:rFonts w:ascii="Verdana" w:eastAsia="Verdana" w:hAnsi="Verdana" w:cs="Verdana"/>
+          <w:b/>
+          <w:bCs/>
+          <w:color w:val="000000"/>
+          <w:sz w:val="20"/>
+          <w:szCs w:val="20"/>
+        </w:rPr>
+      </w:pPr>
+      <w:r>
+        <w:rPr>
+          <w:rFonts w:ascii="Verdana" w:eastAsia="Verdana" w:hAnsi="Verdana" w:cs="Verdana"/>
+          <w:b/>
+          <w:bCs/>
+          <w:color w:val="000000"/>
+          <w:sz w:val="20"/>
+          <w:szCs w:val="20"/>
+        </w:rPr>
+        <w:br w:type="page"/>
+      </w:r>
+      <w:r>
+        <w:rPr>
+          <w:rFonts w:ascii="Verdana" w:eastAsia="Verdana" w:hAnsi="Verdana" w:cs="Verdana"/>
+          <w:b/>
+          <w:bCs/>
+          <w:color w:val="000000"/>
+          <w:sz w:val="20"/>
+          <w:szCs w:val="20"/>
+        </w:rPr>
+        <w:t>ANEXO – F</w:t>
+      </w:r>
+    </w:p>
+    <w:p>
+      <w:pPr>
+        <w:pBdr>
+          <w:top w:val="nil"/>
+          <w:left w:val="nil"/>
+          <w:bottom w:val="nil"/>
+          <w:right w:val="nil"/>
+          <w:between w:val="nil"/>
+        </w:pBdr>
+        <w:spacing w:line="360" w:lineRule="auto"/>
+        <w:jc w:val="center"/>
+        <w:rPr>
+          <w:rFonts w:ascii="Verdana" w:eastAsia="Verdana" w:hAnsi="Verdana" w:cs="Verdana"/>
+          <w:color w:val="000000"/>
+          <w:sz w:val="20"/>
+          <w:szCs w:val="20"/>
+        </w:rPr>
+      </w:pPr>
+      <w:r>
+        <w:rPr>
+          <w:rFonts w:ascii="Verdana" w:eastAsia="Verdana" w:hAnsi="Verdana" w:cs="Verdana"/>
+          <w:color w:val="000000"/>
+          <w:sz w:val="20"/>
+          <w:szCs w:val="20"/>
+        </w:rPr>
+        <w:t>INSTALAÇÕES DA RMP</w:t>
+      </w:r>
+    </w:p>
+    <w:p>
+      <w:pPr>
+        <w:spacing w:line="360" w:lineRule="auto"/>
+        <w:ind w:firstLine="720"/>
+        <w:jc w:val="center"/>
+        <w:rPr>
+          <w:rFonts w:ascii="Verdana" w:eastAsia="Verdana" w:hAnsi="Verdana" w:cs="Verdana"/>
+          <w:sz w:val="20"/>
+          <w:szCs w:val="20"/>
+        </w:rPr>
+      </w:pPr>
+      <w:r>
+        <w:rPr>
+          <w:rFonts w:ascii="Verdana" w:eastAsia="Verdana" w:hAnsi="Verdana" w:cs="Verdana"/>
+          <w:i/>
+          <w:sz w:val="20"/>
+          <w:szCs w:val="20"/>
+          <w:highlight w:val="yellow"/>
+        </w:rPr>
+        <w:t>[INSERIR IMAGEM: Fotos do espaço da RMP na sede do 27º BPM, sem pessoas atendidas]</w:t>
+      </w:r>
+    </w:p>
+    <w:p>
+      <w:pPr>
+        <w:jc w:val="center"/>
+        <w:rPr>
+          <w:rFonts w:ascii="Verdana" w:eastAsia="Verdana" w:hAnsi="Verdana" w:cs="Verdana"/>
+          <w:b/>
+          <w:bCs/>
+          <w:color w:val="000000"/>
+          <w:sz w:val="20"/>
+          <w:szCs w:val="20"/>
+        </w:rPr>
+      </w:pPr>
+      <w:r>
+        <w:rPr>
+          <w:rFonts w:ascii="Verdana" w:eastAsia="Verdana" w:hAnsi="Verdana" w:cs="Verdana"/>
+          <w:b/>
+          <w:bCs/>
+          <w:color w:val="000000"/>
+          <w:sz w:val="20"/>
+          <w:szCs w:val="20"/>
+        </w:rPr>
+        <w:br w:type="page"/>
+      </w:r>
+      <w:r>
+        <w:rPr>
+          <w:rFonts w:ascii="Verdana" w:eastAsia="Verdana" w:hAnsi="Verdana" w:cs="Verdana"/>
+          <w:b/>
+          <w:bCs/>
+          <w:color w:val="000000"/>
+          <w:sz w:val="20"/>
+          <w:szCs w:val="20"/>
+        </w:rPr>
+        <w:t>ANEXO – G</w:t>
+      </w:r>
+    </w:p>
+    <w:p>
+      <w:pPr>
+        <w:pBdr>
+          <w:top w:val="nil"/>
+          <w:left w:val="nil"/>
+          <w:bottom w:val="nil"/>
+          <w:right w:val="nil"/>
+          <w:between w:val="nil"/>
+        </w:pBdr>
+        <w:spacing w:line="360" w:lineRule="auto"/>
+        <w:jc w:val="center"/>
+        <w:rPr>
+          <w:rFonts w:ascii="Verdana" w:eastAsia="Verdana" w:hAnsi="Verdana" w:cs="Verdana"/>
+          <w:color w:val="000000"/>
+          <w:sz w:val="20"/>
+          <w:szCs w:val="20"/>
+        </w:rPr>
+      </w:pPr>
+      <w:r>
+        <w:rPr>
+          <w:rFonts w:ascii="Verdana" w:eastAsia="Verdana" w:hAnsi="Verdana" w:cs="Verdana"/>
+          <w:color w:val="000000"/>
+          <w:sz w:val="20"/>
+          <w:szCs w:val="20"/>
+        </w:rPr>
+        <w:t>VIATURA DA RMP</w:t>
+      </w:r>
+    </w:p>
+    <w:p>
+      <w:pPr>
+        <w:spacing w:line="360" w:lineRule="auto"/>
+        <w:ind w:firstLine="720"/>
+        <w:jc w:val="center"/>
+        <w:rPr>
+          <w:rFonts w:ascii="Verdana" w:eastAsia="Verdana" w:hAnsi="Verdana" w:cs="Verdana"/>
+          <w:sz w:val="20"/>
+          <w:szCs w:val="20"/>
+        </w:rPr>
+      </w:pPr>
+      <w:r>
+        <w:rPr>
+          <w:rFonts w:ascii="Verdana" w:eastAsia="Verdana" w:hAnsi="Verdana" w:cs="Verdana"/>
+          <w:i/>
+          <w:sz w:val="20"/>
+          <w:szCs w:val="20"/>
+          <w:highlight w:val="yellow"/>
+        </w:rPr>
+        <w:t>[INSERIR IMAGEM: Foto da viatura 8.2732 – Renault/Duster]</w:t>
+      </w:r>
+    </w:p>
+    <w:p>
+      <w:pPr>
+        <w:jc w:val="center"/>
+        <w:rPr>
+          <w:rFonts w:ascii="Verdana" w:eastAsia="Verdana" w:hAnsi="Verdana" w:cs="Verdana"/>
+          <w:b/>
+          <w:bCs/>
+          <w:color w:val="000000"/>
+          <w:sz w:val="20"/>
+          <w:szCs w:val="20"/>
+        </w:rPr>
+      </w:pPr>
+      <w:r>
+        <w:rPr>
+          <w:rFonts w:ascii="Verdana" w:eastAsia="Verdana" w:hAnsi="Verdana" w:cs="Verdana"/>
+          <w:b/>
+          <w:bCs/>
+          <w:color w:val="000000"/>
+          <w:sz w:val="20"/>
+          <w:szCs w:val="20"/>
+        </w:rPr>
+        <w:br w:type="page"/>
+      </w:r>
+      <w:r>
+        <w:rPr>
+          <w:rFonts w:ascii="Verdana" w:eastAsia="Verdana" w:hAnsi="Verdana" w:cs="Verdana"/>
+          <w:b/>
+          <w:bCs/>
+          <w:color w:val="000000"/>
+          <w:sz w:val="20"/>
+          <w:szCs w:val="20"/>
+        </w:rPr>
+        <w:t>ANEXO – H</w:t>
+      </w:r>
+    </w:p>
+    <w:p>
+      <w:pPr>
+        <w:pBdr>
+          <w:top w:val="nil"/>
+          <w:left w:val="nil"/>
+          <w:bottom w:val="nil"/>
+          <w:right w:val="nil"/>
+          <w:between w:val="nil"/>
+        </w:pBdr>
+        <w:spacing w:line="360" w:lineRule="auto"/>
+        <w:jc w:val="center"/>
+        <w:rPr>
+          <w:rFonts w:ascii="Verdana" w:eastAsia="Verdana" w:hAnsi="Verdana" w:cs="Verdana"/>
+          <w:color w:val="000000"/>
+          <w:sz w:val="20"/>
+          <w:szCs w:val="20"/>
+        </w:rPr>
+      </w:pPr>
+      <w:r>
+        <w:rPr>
+          <w:rFonts w:ascii="Verdana" w:eastAsia="Verdana" w:hAnsi="Verdana" w:cs="Verdana"/>
+          <w:color w:val="000000"/>
+          <w:sz w:val="20"/>
+          <w:szCs w:val="20"/>
+        </w:rPr>
+        <w:t>PALESTRAS E AÇÕES DA RMP</w:t>
+      </w:r>
+    </w:p>
+    <w:p>
+      <w:pPr>
+        <w:spacing w:line="360" w:lineRule="auto"/>
+        <w:ind w:firstLine="720"/>
+        <w:jc w:val="center"/>
+        <w:rPr>
+          <w:rFonts w:ascii="Verdana" w:eastAsia="Verdana" w:hAnsi="Verdana" w:cs="Verdana"/>
+          <w:sz w:val="20"/>
+          <w:szCs w:val="20"/>
+        </w:rPr>
+      </w:pPr>
+      <w:r>
+        <w:rPr>
+          <w:rFonts w:ascii="Verdana" w:eastAsia="Verdana" w:hAnsi="Verdana" w:cs="Verdana"/>
+          <w:i/>
+          <w:sz w:val="20"/>
+          <w:szCs w:val="20"/>
+          <w:highlight w:val="yellow"/>
+        </w:rPr>
+        <w:t>[INSERIR IMAGEM: Fotos de palestras e ações, sem rostos de vítimas]</w:t>
+      </w:r>
+    </w:p>
+    <w:p>
+      <w:pPr>
+        <w:spacing w:line="360" w:lineRule="auto"/>
+        <w:ind w:firstLine="720"/>
+        <w:jc w:val="both"/>
+        <w:rPr>
+          <w:rFonts w:ascii="Verdana" w:eastAsia="Verdana" w:hAnsi="Verdana" w:cs="Verdana"/>
+          <w:sz w:val="20"/>
+          <w:szCs w:val="20"/>
+        </w:rPr>
+      </w:pPr>
     </w:p>
     <w:p>
       <w:pPr>
@@ -4404,7 +4991,7 @@
             </wp:anchor>
           </w:drawing>
         </mc:Choice>
-        <mc:Fallback xmlns:sl="http://schemas.openxmlformats.org/schemaLibrary/2006/main" xmlns:a="http://schemas.openxmlformats.org/drawingml/2006/main" xmlns:pic="http://schemas.openxmlformats.org/drawingml/2006/picture" xmlns:c="http://schemas.openxmlformats.org/drawingml/2006/chart" xmlns:lc="http://schemas.openxmlformats.org/drawingml/2006/lockedCanvas" xmlns:dgm="http://schemas.openxmlformats.org/drawingml/2006/diagram" xmlns="http://schemas.microsoft.com/office/tasks/2019/documenttasks" xmlns:cr="http://schemas.microsoft.com/office/comments/2020/reactions">
+        <mc:Fallback xmlns:cr="http://schemas.microsoft.com/office/comments/2020/reactions" xmlns="http://schemas.microsoft.com/office/tasks/2019/documenttasks" xmlns:dgm="http://schemas.openxmlformats.org/drawingml/2006/diagram" xmlns:lc="http://schemas.openxmlformats.org/drawingml/2006/lockedCanvas" xmlns:c="http://schemas.openxmlformats.org/drawingml/2006/chart" xmlns:pic="http://schemas.openxmlformats.org/drawingml/2006/picture" xmlns:a="http://schemas.openxmlformats.org/drawingml/2006/main" xmlns:sl="http://schemas.openxmlformats.org/schemaLibrary/2006/main">
           <w:drawing>
             <wp:anchor allowOverlap="1" behindDoc="0" distB="0" distT="0" distL="114300" distR="114300" hidden="0" layoutInCell="1" locked="0" relativeHeight="0" simplePos="0">
               <wp:simplePos x="0" y="0"/>
@@ -5092,6 +5679,92 @@
     </w:lvl>
   </w:abstractNum>
   <w:abstractNum w:abstractNumId="5" w15:restartNumberingAfterBreak="0">
+    <w:nsid w:val="2E85529C"/>
+    <w:multiLevelType w:val="hybridMultilevel"/>
+    <w:tmpl w:val="B694C2B4"/>
+    <w:lvl w:ilvl="0" w:tplc="04160017">
+      <w:start w:val="1"/>
+      <w:numFmt w:val="lowerLetter"/>
+      <w:lvlText w:val="%1)"/>
+      <w:lvlJc w:val="left"/>
+      <w:pPr>
+        <w:ind w:left="1429" w:hanging="360"/>
+      </w:pPr>
+    </w:lvl>
+    <w:lvl w:ilvl="1" w:tplc="04160019" w:tentative="1">
+      <w:start w:val="1"/>
+      <w:numFmt w:val="lowerLetter"/>
+      <w:lvlText w:val="%2."/>
+      <w:lvlJc w:val="left"/>
+      <w:pPr>
+        <w:ind w:left="2149" w:hanging="360"/>
+      </w:pPr>
+    </w:lvl>
+    <w:lvl w:ilvl="2" w:tplc="0416001B" w:tentative="1">
+      <w:start w:val="1"/>
+      <w:numFmt w:val="lowerRoman"/>
+      <w:lvlText w:val="%3."/>
+      <w:lvlJc w:val="right"/>
+      <w:pPr>
+        <w:ind w:left="2869" w:hanging="180"/>
+      </w:pPr>
+    </w:lvl>
+    <w:lvl w:ilvl="3" w:tplc="0416000F" w:tentative="1">
+      <w:start w:val="1"/>
+      <w:numFmt w:val="decimal"/>
+      <w:lvlText w:val="%4."/>
+      <w:lvlJc w:val="left"/>
+      <w:pPr>
+        <w:ind w:left="3589" w:hanging="360"/>
+      </w:pPr>
+    </w:lvl>
+    <w:lvl w:ilvl="4" w:tplc="04160019" w:tentative="1">
+      <w:start w:val="1"/>
+      <w:numFmt w:val="lowerLetter"/>
+      <w:lvlText w:val="%5."/>
+      <w:lvlJc w:val="left"/>
+      <w:pPr>
+        <w:ind w:left="4309" w:hanging="360"/>
+      </w:pPr>
+    </w:lvl>
+    <w:lvl w:ilvl="5" w:tplc="0416001B" w:tentative="1">
+      <w:start w:val="1"/>
+      <w:numFmt w:val="lowerRoman"/>
+      <w:lvlText w:val="%6."/>
+      <w:lvlJc w:val="right"/>
+      <w:pPr>
+        <w:ind w:left="5029" w:hanging="180"/>
+      </w:pPr>
+    </w:lvl>
+    <w:lvl w:ilvl="6" w:tplc="0416000F" w:tentative="1">
+      <w:start w:val="1"/>
+      <w:numFmt w:val="decimal"/>
+      <w:lvlText w:val="%7."/>
+      <w:lvlJc w:val="left"/>
+      <w:pPr>
+        <w:ind w:left="5749" w:hanging="360"/>
+      </w:pPr>
+    </w:lvl>
+    <w:lvl w:ilvl="7" w:tplc="04160019" w:tentative="1">
+      <w:start w:val="1"/>
+      <w:numFmt w:val="lowerLetter"/>
+      <w:lvlText w:val="%8."/>
+      <w:lvlJc w:val="left"/>
+      <w:pPr>
+        <w:ind w:left="6469" w:hanging="360"/>
+      </w:pPr>
+    </w:lvl>
+    <w:lvl w:ilvl="8" w:tplc="0416001B" w:tentative="1">
+      <w:start w:val="1"/>
+      <w:numFmt w:val="lowerRoman"/>
+      <w:lvlText w:val="%9."/>
+      <w:lvlJc w:val="right"/>
+      <w:pPr>
+        <w:ind w:left="7189" w:hanging="180"/>
+      </w:pPr>
+    </w:lvl>
+  </w:abstractNum>
+  <w:abstractNum w:abstractNumId="6" w15:restartNumberingAfterBreak="0">
     <w:nsid w:val="2EF705CA"/>
     <w:multiLevelType w:val="hybridMultilevel"/>
     <w:tmpl w:val="6B5E5814"/>
@@ -5204,7 +5877,7 @@
       </w:rPr>
     </w:lvl>
   </w:abstractNum>
-  <w:abstractNum w:abstractNumId="6" w15:restartNumberingAfterBreak="0">
+  <w:abstractNum w:abstractNumId="7" w15:restartNumberingAfterBreak="0">
     <w:nsid w:val="43BD7B92"/>
     <w:multiLevelType w:val="hybridMultilevel"/>
     <w:tmpl w:val="C9BE14C8"/>
@@ -5317,7 +5990,7 @@
       </w:rPr>
     </w:lvl>
   </w:abstractNum>
-  <w:abstractNum w:abstractNumId="7" w15:restartNumberingAfterBreak="0">
+  <w:abstractNum w:abstractNumId="8" w15:restartNumberingAfterBreak="0">
     <w:nsid w:val="4BE37C5C"/>
     <w:multiLevelType w:val="multilevel"/>
     <w:tmpl w:val="3E84D2F8"/>
@@ -5430,7 +6103,7 @@
       </w:rPr>
     </w:lvl>
   </w:abstractNum>
-  <w:abstractNum w:abstractNumId="8" w15:restartNumberingAfterBreak="0">
+  <w:abstractNum w:abstractNumId="9" w15:restartNumberingAfterBreak="0">
     <w:nsid w:val="50B164C2"/>
     <w:multiLevelType w:val="multilevel"/>
     <w:tmpl w:val="64B83EE4"/>
@@ -5543,7 +6216,7 @@
       </w:rPr>
     </w:lvl>
   </w:abstractNum>
-  <w:abstractNum w:abstractNumId="9" w15:restartNumberingAfterBreak="0">
+  <w:abstractNum w:abstractNumId="10" w15:restartNumberingAfterBreak="0">
     <w:nsid w:val="517F490F"/>
     <w:multiLevelType w:val="multilevel"/>
     <w:tmpl w:val="01ACA42A"/>
@@ -5656,7 +6329,7 @@
       </w:rPr>
     </w:lvl>
   </w:abstractNum>
-  <w:abstractNum w:abstractNumId="10" w15:restartNumberingAfterBreak="0">
+  <w:abstractNum w:abstractNumId="11" w15:restartNumberingAfterBreak="0">
     <w:nsid w:val="5EA94401"/>
     <w:multiLevelType w:val="multilevel"/>
     <w:tmpl w:val="142890CE"/>
@@ -5769,7 +6442,7 @@
       </w:rPr>
     </w:lvl>
   </w:abstractNum>
-  <w:abstractNum w:abstractNumId="11" w15:restartNumberingAfterBreak="0">
+  <w:abstractNum w:abstractNumId="12" w15:restartNumberingAfterBreak="0">
     <w:nsid w:val="5EBF0033"/>
     <w:multiLevelType w:val="hybridMultilevel"/>
     <w:tmpl w:val="BBFC6942"/>
@@ -5882,7 +6555,7 @@
       </w:rPr>
     </w:lvl>
   </w:abstractNum>
-  <w:abstractNum w:abstractNumId="12" w15:restartNumberingAfterBreak="0">
+  <w:abstractNum w:abstractNumId="13" w15:restartNumberingAfterBreak="0">
     <w:nsid w:val="78AF10D8"/>
     <w:multiLevelType w:val="multilevel"/>
     <w:tmpl w:val="C7DA9F18"/>
@@ -6003,7 +6676,7 @@
       </w:rPr>
     </w:lvl>
   </w:abstractNum>
-  <w:abstractNum w:abstractNumId="13" w15:restartNumberingAfterBreak="0">
+  <w:abstractNum w:abstractNumId="14" w15:restartNumberingAfterBreak="0">
     <w:nsid w:val="798C354F"/>
     <w:multiLevelType w:val="multilevel"/>
     <w:tmpl w:val="956CFFB0"/>
@@ -6090,10 +6763,10 @@
     </w:lvl>
   </w:abstractNum>
   <w:num w:numId="1" w16cid:durableId="1987314243">
-    <w:abstractNumId w:val="7"/>
+    <w:abstractNumId w:val="8"/>
   </w:num>
   <w:num w:numId="2" w16cid:durableId="371686843">
-    <w:abstractNumId w:val="9"/>
+    <w:abstractNumId w:val="10"/>
   </w:num>
   <w:num w:numId="3" w16cid:durableId="1034189520">
     <w:abstractNumId w:val="1"/>
@@ -6102,19 +6775,19 @@
     <w:abstractNumId w:val="4"/>
   </w:num>
   <w:num w:numId="5" w16cid:durableId="2009944936">
-    <w:abstractNumId w:val="10"/>
+    <w:abstractNumId w:val="11"/>
   </w:num>
   <w:num w:numId="6" w16cid:durableId="761535456">
     <w:abstractNumId w:val="2"/>
   </w:num>
   <w:num w:numId="7" w16cid:durableId="1765225165">
+    <w:abstractNumId w:val="14"/>
+  </w:num>
+  <w:num w:numId="8" w16cid:durableId="402148737">
     <w:abstractNumId w:val="13"/>
   </w:num>
-  <w:num w:numId="8" w16cid:durableId="402148737">
-    <w:abstractNumId w:val="12"/>
-  </w:num>
   <w:num w:numId="9" w16cid:durableId="655765296">
-    <w:abstractNumId w:val="8"/>
+    <w:abstractNumId w:val="9"/>
   </w:num>
   <w:num w:numId="10" w16cid:durableId="435565807">
     <w:abstractNumId w:val="3"/>
@@ -6123,12 +6796,15 @@
     <w:abstractNumId w:val="0"/>
   </w:num>
   <w:num w:numId="12" w16cid:durableId="1923371892">
+    <w:abstractNumId w:val="7"/>
+  </w:num>
+  <w:num w:numId="13" w16cid:durableId="132454707">
+    <w:abstractNumId w:val="12"/>
+  </w:num>
+  <w:num w:numId="14" w16cid:durableId="437023632">
     <w:abstractNumId w:val="6"/>
   </w:num>
-  <w:num w:numId="13" w16cid:durableId="132454707">
-    <w:abstractNumId w:val="11"/>
-  </w:num>
-  <w:num w:numId="14" w16cid:durableId="437023632">
+  <w:num w:numId="15" w16cid:durableId="160704558">
     <w:abstractNumId w:val="5"/>
   </w:num>
 </w:numbering>

</xml_diff>

<commit_message>
Insere gráficos (Anexos C e E) e fotos de ações (Anexo H)
Co-Authored-By: Claude Opus 5.5 <noreply@anthropic.com>
Claude-Session: https://claude.ai/code/session_01NkJxMjLTPT7uCe2XDfKQHG
</commit_message>
<xml_diff>
--- a/estudo/Estudo_de_Situacao_RMP_27BPM.docx
+++ b/estudo/Estudo_de_Situacao_RMP_27BPM.docx
@@ -4146,12 +4146,42 @@
       <w:r>
         <w:rPr>
           <w:rFonts w:ascii="Verdana" w:eastAsia="Verdana" w:hAnsi="Verdana" w:cs="Verdana"/>
-          <w:i/>
-          <w:sz w:val="20"/>
-          <w:szCs w:val="20"/>
-          <w:highlight w:val="yellow"/>
-        </w:rPr>
-        <w:t>[INSERIR IMAGEM: Gráfico de colunas: 2024 – 382; 2025 – 404; 2026 – 314 (até 12/10/2026). Fonte: SIGESPOL]</w:t>
+          <w:i w:val="0"/>
+          <w:sz w:val="20"/>
+          <w:szCs w:val="20"/>
+        </w:rPr>
+        <w:drawing>
+          <wp:inline xmlns:a="http://schemas.openxmlformats.org/drawingml/2006/main" xmlns:pic="http://schemas.openxmlformats.org/drawingml/2006/picture">
+            <wp:extent cx="5760000" cy="3291429"/>
+            <wp:docPr id="9" name="Picture 9"/>
+            <wp:cNvGraphicFramePr>
+              <a:graphicFrameLocks noChangeAspect="1"/>
+            </wp:cNvGraphicFramePr>
+            <a:graphic>
+              <a:graphicData uri="http://schemas.openxmlformats.org/drawingml/2006/picture">
+                <pic:pic>
+                  <pic:nvPicPr>
+                    <pic:cNvPr id="0" name="graf_ocorrencias.png"/>
+                    <pic:cNvPicPr/>
+                  </pic:nvPicPr>
+                  <pic:blipFill>
+                    <a:blip r:embed="rId16"/>
+                    <a:stretch>
+                      <a:fillRect/>
+                    </a:stretch>
+                  </pic:blipFill>
+                  <pic:spPr>
+                    <a:xfrm>
+                      <a:off x="0" y="0"/>
+                      <a:ext cx="5760000" cy="3291429"/>
+                    </a:xfrm>
+                    <a:prstGeom prst="rect"/>
+                  </pic:spPr>
+                </pic:pic>
+              </a:graphicData>
+            </a:graphic>
+          </wp:inline>
+        </w:drawing>
       </w:r>
     </w:p>
     <w:p>
@@ -4316,12 +4346,42 @@
       <w:r>
         <w:rPr>
           <w:rFonts w:ascii="Verdana" w:eastAsia="Verdana" w:hAnsi="Verdana" w:cs="Verdana"/>
-          <w:i/>
-          <w:sz w:val="20"/>
-          <w:szCs w:val="20"/>
-          <w:highlight w:val="yellow"/>
-        </w:rPr>
-        <w:t>[INSERIR IMAGEM: Gráfico de colunas: 2025 – 192; 2026 – 202]</w:t>
+          <w:i w:val="0"/>
+          <w:sz w:val="20"/>
+          <w:szCs w:val="20"/>
+        </w:rPr>
+        <w:drawing>
+          <wp:inline xmlns:a="http://schemas.openxmlformats.org/drawingml/2006/main" xmlns:pic="http://schemas.openxmlformats.org/drawingml/2006/picture">
+            <wp:extent cx="5760000" cy="3291429"/>
+            <wp:docPr id="10" name="Picture 10"/>
+            <wp:cNvGraphicFramePr>
+              <a:graphicFrameLocks noChangeAspect="1"/>
+            </wp:cNvGraphicFramePr>
+            <a:graphic>
+              <a:graphicData uri="http://schemas.openxmlformats.org/drawingml/2006/picture">
+                <pic:pic>
+                  <pic:nvPicPr>
+                    <pic:cNvPr id="0" name="graf_mpu.png"/>
+                    <pic:cNvPicPr/>
+                  </pic:nvPicPr>
+                  <pic:blipFill>
+                    <a:blip r:embed="rId17"/>
+                    <a:stretch>
+                      <a:fillRect/>
+                    </a:stretch>
+                  </pic:blipFill>
+                  <pic:spPr>
+                    <a:xfrm>
+                      <a:off x="0" y="0"/>
+                      <a:ext cx="5760000" cy="3291429"/>
+                    </a:xfrm>
+                    <a:prstGeom prst="rect"/>
+                  </pic:spPr>
+                </pic:pic>
+              </a:graphicData>
+            </a:graphic>
+          </wp:inline>
+        </w:drawing>
       </w:r>
     </w:p>
     <w:p>
@@ -4571,12 +4631,75 @@
       <w:r>
         <w:rPr>
           <w:rFonts w:ascii="Verdana" w:eastAsia="Verdana" w:hAnsi="Verdana" w:cs="Verdana"/>
-          <w:i/>
-          <w:sz w:val="20"/>
-          <w:szCs w:val="20"/>
-          <w:highlight w:val="yellow"/>
-        </w:rPr>
-        <w:t>[INSERIR IMAGEM: Fotos de palestras e ações, sem rostos de vítimas]</w:t>
+          <w:i w:val="0"/>
+          <w:sz w:val="20"/>
+          <w:szCs w:val="20"/>
+        </w:rPr>
+        <w:drawing>
+          <wp:inline xmlns:a="http://schemas.openxmlformats.org/drawingml/2006/main" xmlns:pic="http://schemas.openxmlformats.org/drawingml/2006/picture">
+            <wp:extent cx="3960000" cy="5280000"/>
+            <wp:docPr id="11" name="Picture 11"/>
+            <wp:cNvGraphicFramePr>
+              <a:graphicFrameLocks noChangeAspect="1"/>
+            </wp:cNvGraphicFramePr>
+            <a:graphic>
+              <a:graphicData uri="http://schemas.openxmlformats.org/drawingml/2006/picture">
+                <pic:pic>
+                  <pic:nvPicPr>
+                    <pic:cNvPr id="0" name="7.jpg"/>
+                    <pic:cNvPicPr/>
+                  </pic:nvPicPr>
+                  <pic:blipFill>
+                    <a:blip r:embed="rId18"/>
+                    <a:stretch>
+                      <a:fillRect/>
+                    </a:stretch>
+                  </pic:blipFill>
+                  <pic:spPr>
+                    <a:xfrm>
+                      <a:off x="0" y="0"/>
+                      <a:ext cx="3960000" cy="5280000"/>
+                    </a:xfrm>
+                    <a:prstGeom prst="rect"/>
+                  </pic:spPr>
+                </pic:pic>
+              </a:graphicData>
+            </a:graphic>
+          </wp:inline>
+        </w:drawing>
+        <w:br/>
+        <w:drawing>
+          <wp:inline xmlns:a="http://schemas.openxmlformats.org/drawingml/2006/main" xmlns:pic="http://schemas.openxmlformats.org/drawingml/2006/picture">
+            <wp:extent cx="3960000" cy="2227500"/>
+            <wp:docPr id="12" name="Picture 12"/>
+            <wp:cNvGraphicFramePr>
+              <a:graphicFrameLocks noChangeAspect="1"/>
+            </wp:cNvGraphicFramePr>
+            <a:graphic>
+              <a:graphicData uri="http://schemas.openxmlformats.org/drawingml/2006/picture">
+                <pic:pic>
+                  <pic:nvPicPr>
+                    <pic:cNvPr id="0" name="6.jpg"/>
+                    <pic:cNvPicPr/>
+                  </pic:nvPicPr>
+                  <pic:blipFill>
+                    <a:blip r:embed="rId19"/>
+                    <a:stretch>
+                      <a:fillRect/>
+                    </a:stretch>
+                  </pic:blipFill>
+                  <pic:spPr>
+                    <a:xfrm>
+                      <a:off x="0" y="0"/>
+                      <a:ext cx="3960000" cy="2227500"/>
+                    </a:xfrm>
+                    <a:prstGeom prst="rect"/>
+                  </pic:spPr>
+                </pic:pic>
+              </a:graphicData>
+            </a:graphic>
+          </wp:inline>
+        </w:drawing>
       </w:r>
     </w:p>
     <w:p>

</xml_diff>

<commit_message>
Anexo H: fotos do Agosto Lilás e palestras da RMP
Co-Authored-By: Claude Opus 5.5 <noreply@anthropic.com>
Claude-Session: https://claude.ai/code/session_01NkJxMjLTPT7uCe2XDfKQHG
</commit_message>
<xml_diff>
--- a/estudo/Estudo_de_Situacao_RMP_27BPM.docx
+++ b/estudo/Estudo_de_Situacao_RMP_27BPM.docx
@@ -4637,7 +4637,7 @@
         </w:rPr>
         <w:drawing>
           <wp:inline xmlns:a="http://schemas.openxmlformats.org/drawingml/2006/main" xmlns:pic="http://schemas.openxmlformats.org/drawingml/2006/picture">
-            <wp:extent cx="3960000" cy="5280000"/>
+            <wp:extent cx="2025000" cy="3600000"/>
             <wp:docPr id="11" name="Picture 11"/>
             <wp:cNvGraphicFramePr>
               <a:graphicFrameLocks noChangeAspect="1"/>
@@ -4646,11 +4646,11 @@
               <a:graphicData uri="http://schemas.openxmlformats.org/drawingml/2006/picture">
                 <pic:pic>
                   <pic:nvPicPr>
-                    <pic:cNvPr id="0" name="7.jpg"/>
+                    <pic:cNvPr id="0" name="13.jpg"/>
                     <pic:cNvPicPr/>
                   </pic:nvPicPr>
                   <pic:blipFill>
-                    <a:blip r:embed="rId18"/>
+                    <a:blip r:embed="rId20"/>
                     <a:stretch>
                       <a:fillRect/>
                     </a:stretch>
@@ -4658,7 +4658,40 @@
                   <pic:spPr>
                     <a:xfrm>
                       <a:off x="0" y="0"/>
-                      <a:ext cx="3960000" cy="5280000"/>
+                      <a:ext cx="2025000" cy="3600000"/>
+                    </a:xfrm>
+                    <a:prstGeom prst="rect"/>
+                  </pic:spPr>
+                </pic:pic>
+              </a:graphicData>
+            </a:graphic>
+          </wp:inline>
+        </w:drawing>
+        <w:t xml:space="preserve">  </w:t>
+        <w:drawing>
+          <wp:inline xmlns:a="http://schemas.openxmlformats.org/drawingml/2006/main" xmlns:pic="http://schemas.openxmlformats.org/drawingml/2006/picture">
+            <wp:extent cx="2700000" cy="3600000"/>
+            <wp:docPr id="12" name="Picture 12"/>
+            <wp:cNvGraphicFramePr>
+              <a:graphicFrameLocks noChangeAspect="1"/>
+            </wp:cNvGraphicFramePr>
+            <a:graphic>
+              <a:graphicData uri="http://schemas.openxmlformats.org/drawingml/2006/picture">
+                <pic:pic>
+                  <pic:nvPicPr>
+                    <pic:cNvPr id="0" name="12.jpg"/>
+                    <pic:cNvPicPr/>
+                  </pic:nvPicPr>
+                  <pic:blipFill>
+                    <a:blip r:embed="rId21"/>
+                    <a:stretch>
+                      <a:fillRect/>
+                    </a:stretch>
+                  </pic:blipFill>
+                  <pic:spPr>
+                    <a:xfrm>
+                      <a:off x="0" y="0"/>
+                      <a:ext cx="2700000" cy="3600000"/>
                     </a:xfrm>
                     <a:prstGeom prst="rect"/>
                   </pic:spPr>
@@ -4670,8 +4703,8 @@
         <w:br/>
         <w:drawing>
           <wp:inline xmlns:a="http://schemas.openxmlformats.org/drawingml/2006/main" xmlns:pic="http://schemas.openxmlformats.org/drawingml/2006/picture">
-            <wp:extent cx="3960000" cy="2227500"/>
-            <wp:docPr id="12" name="Picture 12"/>
+            <wp:extent cx="5040000" cy="3780000"/>
+            <wp:docPr id="13" name="Picture 13"/>
             <wp:cNvGraphicFramePr>
               <a:graphicFrameLocks noChangeAspect="1"/>
             </wp:cNvGraphicFramePr>
@@ -4679,11 +4712,11 @@
               <a:graphicData uri="http://schemas.openxmlformats.org/drawingml/2006/picture">
                 <pic:pic>
                   <pic:nvPicPr>
-                    <pic:cNvPr id="0" name="6.jpg"/>
+                    <pic:cNvPr id="0" name="11.jpg"/>
                     <pic:cNvPicPr/>
                   </pic:nvPicPr>
                   <pic:blipFill>
-                    <a:blip r:embed="rId19"/>
+                    <a:blip r:embed="rId22"/>
                     <a:stretch>
                       <a:fillRect/>
                     </a:stretch>
@@ -4691,7 +4724,40 @@
                   <pic:spPr>
                     <a:xfrm>
                       <a:off x="0" y="0"/>
-                      <a:ext cx="3960000" cy="2227500"/>
+                      <a:ext cx="5040000" cy="3780000"/>
+                    </a:xfrm>
+                    <a:prstGeom prst="rect"/>
+                  </pic:spPr>
+                </pic:pic>
+              </a:graphicData>
+            </a:graphic>
+          </wp:inline>
+        </w:drawing>
+        <w:br/>
+        <w:drawing>
+          <wp:inline xmlns:a="http://schemas.openxmlformats.org/drawingml/2006/main" xmlns:pic="http://schemas.openxmlformats.org/drawingml/2006/picture">
+            <wp:extent cx="5040000" cy="3780000"/>
+            <wp:docPr id="14" name="Picture 14"/>
+            <wp:cNvGraphicFramePr>
+              <a:graphicFrameLocks noChangeAspect="1"/>
+            </wp:cNvGraphicFramePr>
+            <a:graphic>
+              <a:graphicData uri="http://schemas.openxmlformats.org/drawingml/2006/picture">
+                <pic:pic>
+                  <pic:nvPicPr>
+                    <pic:cNvPr id="0" name="10.jpg"/>
+                    <pic:cNvPicPr/>
+                  </pic:nvPicPr>
+                  <pic:blipFill>
+                    <a:blip r:embed="rId23"/>
+                    <a:stretch>
+                      <a:fillRect/>
+                    </a:stretch>
+                  </pic:blipFill>
+                  <pic:spPr>
+                    <a:xfrm>
+                      <a:off x="0" y="0"/>
+                      <a:ext cx="5040000" cy="3780000"/>
                     </a:xfrm>
                     <a:prstGeom prst="rect"/>
                   </pic:spPr>

</xml_diff>

<commit_message>
Remove parecer e mancha; reordena anexos A–F; fotos de viatura e instalações
Co-Authored-By: Claude Opus 5.5 <noreply@anthropic.com>
Claude-Session: https://claude.ai/code/session_01NkJxMjLTPT7uCe2XDfKQHG
</commit_message>
<xml_diff>
--- a/estudo/Estudo_de_Situacao_RMP_27BPM.docx
+++ b/estudo/Estudo_de_Situacao_RMP_27BPM.docx
@@ -1955,7 +1955,7 @@
           <w:sz w:val="20"/>
           <w:szCs w:val="20"/>
         </w:rPr>
-        <w:t>(Gráfico das ocorrências de 2024 a 2026 – ver Anexo C)</w:t>
+        <w:t>(Gráfico das ocorrências de 2024 a 2026 – ver Anexo B)</w:t>
       </w:r>
     </w:p>
     <w:p>
@@ -1984,7 +1984,7 @@
           <w:sz w:val="20"/>
           <w:szCs w:val="20"/>
         </w:rPr>
-        <w:t>(Mancha criminal de violência doméstica em 2026 – ver Anexo D)</w:t>
+        <w:t>4. Medidas Protetivas de Urgência (últimos três anos)</w:t>
       </w:r>
     </w:p>
     <w:p>
@@ -2013,7 +2013,7 @@
           <w:sz w:val="20"/>
           <w:szCs w:val="20"/>
         </w:rPr>
-        <w:t>4. Medidas Protetivas de Urgência (últimos três anos)</w:t>
+        <w:t>A RMP acompanhava 192 (cento e noventa e duas) MPUs ativas em 2025 e acompanha, atualmente, 202 (duzentas e duas) MPUs ativas em 2026, aumento de aproximadamente 5%. Os registros de MPUs de períodos anteriores não estão disponíveis no 27º BPM, pois eram realizados pela Unidade da RMP da 83ª CIPM/Barreiras, o que reforça a necessidade de gestão própria. A fiscalização regular desse universo já é realizada pelo efetivo do 27º BPM, sendo necessária a sua formalização para garantir gestão, controle e planejamento próprios.</w:t>
       </w:r>
     </w:p>
     <w:p>
@@ -2042,7 +2042,7 @@
           <w:sz w:val="20"/>
           <w:szCs w:val="20"/>
         </w:rPr>
-        <w:t>A RMP acompanhava 192 (cento e noventa e duas) MPUs ativas em 2025 e acompanha, atualmente, 202 (duzentas e duas) MPUs ativas em 2026, aumento de aproximadamente 5%. Os registros de MPUs de períodos anteriores não estão disponíveis no 27º BPM, pois eram realizados pela Unidade da RMP da 83ª CIPM/Barreiras, o que reforça a necessidade de gestão própria. A fiscalização regular desse universo já é realizada pelo efetivo do 27º BPM, sendo necessária a sua formalização para garantir gestão, controle e planejamento próprios.</w:t>
+        <w:t>(Gráfico das MPUs ativas em 2025 e 2026 – ver Anexo C)</w:t>
       </w:r>
     </w:p>
     <w:p>
@@ -2071,7 +2071,7 @@
           <w:sz w:val="20"/>
           <w:szCs w:val="20"/>
         </w:rPr>
-        <w:t>(Gráfico das MPUs ativas em 2025 e 2026 – ver Anexo E)</w:t>
+        <w:t>5. Local de funcionamento</w:t>
       </w:r>
     </w:p>
     <w:p>
@@ -2100,7 +2100,7 @@
           <w:sz w:val="20"/>
           <w:szCs w:val="20"/>
         </w:rPr>
-        <w:t>5. Local de funcionamento</w:t>
+        <w:t>A RMP do 27º BPM funciona na sede do 27º BPM, à Rua Xique-Xique, n.º 530, Loteamento Santa Cruz, Luís Eduardo Magalhães/BA, em espaço compartilhado com a Coordenação de Apoio Administrativo (CAA), dispondo de ambiente reservado para o acolhimento das mulheres, garantindo privacidade no atendimento.</w:t>
       </w:r>
     </w:p>
     <w:p>
@@ -2129,7 +2129,7 @@
           <w:sz w:val="20"/>
           <w:szCs w:val="20"/>
         </w:rPr>
-        <w:t>A RMP do 27º BPM funciona na sede do 27º BPM, à Rua Xique-Xique, n.º 530, Loteamento Santa Cruz, Luís Eduardo Magalhães/BA, em espaço compartilhado com a Coordenação de Apoio Administrativo (CAA), dispondo de ambiente reservado para o acolhimento das mulheres, garantindo privacidade no atendimento.</w:t>
+        <w:t>(Fotos das instalações da RMP – ver Anexo D)</w:t>
       </w:r>
     </w:p>
     <w:p>
@@ -2158,7 +2158,7 @@
           <w:sz w:val="20"/>
           <w:szCs w:val="20"/>
         </w:rPr>
-        <w:t>(Fotos das instalações da RMP – ver Anexo F)</w:t>
+        <w:t>6. Recursos humanos e materiais exclusivos</w:t>
       </w:r>
     </w:p>
     <w:p>
@@ -2187,7 +2187,7 @@
           <w:sz w:val="20"/>
           <w:szCs w:val="20"/>
         </w:rPr>
-        <w:t>6. Recursos humanos e materiais exclusivos</w:t>
+        <w:t>Em atendimento ao art. 4º, §2º, e art. 7º, §2º, da Portaria n.º 042-CG/2024, a RMP já conta com 05 (cinco) policiais militares do 27º BPM, efetivo mínimo exigido, sendo 01 (um) Oficial (Tenente PM), comandante da RMP, 01 (um) Sargento, 01 (um) Cabo e 02 (dois) Soldados, dos quais 02 (duas) são policiais femininas (relação nominal no Anexo A, de acesso restrito), empregados em guarnição tipo “B”, em regime de escala ordinário, empregados exclusivamente na atividade da RMP, estando a capacitação em enfrentamento à violência contra a mulher (art. 4º, §5º) já agendada junto ao BPPM. A RMP já dispõe de viatura exclusiva, prefixo 8.2732, Renault/Duster, placa TGX 2E57, com cota de combustível sob gestão da Unidade.</w:t>
       </w:r>
     </w:p>
     <w:p>
@@ -2216,7 +2216,7 @@
           <w:sz w:val="20"/>
           <w:szCs w:val="20"/>
         </w:rPr>
-        <w:t>Em atendimento ao art. 4º, §2º, e art. 7º, §2º, da Portaria n.º 042-CG/2024, a RMP já conta com 05 (cinco) policiais militares do 27º BPM, efetivo mínimo exigido, sendo 01 (um) Oficial (Tenente PM), comandante da RMP, 01 (um) Sargento, 01 (um) Cabo e 02 (dois) Soldados, dos quais 02 (duas) são policiais femininas (relação nominal no Anexo B, de acesso restrito), empregados em guarnição tipo “B”, em regime de escala ordinário, empregados exclusivamente na atividade da RMP, estando a capacitação em enfrentamento à violência contra a mulher (art. 4º, §5º) já agendada junto ao BPPM. A RMP já dispõe de viatura exclusiva, prefixo 8.2732, Renault/Duster, placa TGX 2E57, com cota de combustível sob gestão da Unidade.</w:t>
+        <w:t>(Foto da viatura da RMP – ver Anexo E)</w:t>
       </w:r>
     </w:p>
     <w:p>
@@ -2245,7 +2245,7 @@
           <w:sz w:val="20"/>
           <w:szCs w:val="20"/>
         </w:rPr>
-        <w:t>(Foto da viatura da RMP – ver Anexo G)</w:t>
+        <w:t>7. Outras informações</w:t>
       </w:r>
     </w:p>
     <w:p>
@@ -2274,7 +2274,17 @@
           <w:sz w:val="20"/>
           <w:szCs w:val="20"/>
         </w:rPr>
-        <w:t>7. Outras informações</w:t>
+        <w:t xml:space="preserve">A atuação já desenvolvida na área do 27º BPM (fiscalização de MPU, atendimento pós-ocorrência, palestras e Sala Lilás) demonstra a viabilidade da formalização. Registra-se, </w:t>
+      </w:r>
+      <w:r>
+        <w:rPr>
+          <w:rFonts w:ascii="Verdana" w:eastAsia="Verdana" w:hAnsi="Verdana" w:cs="Verdana"/>
+          <w:color w:val="000000"/>
+          <w:sz w:val="20"/>
+          <w:szCs w:val="20"/>
+        </w:rPr>
+        <w:lastRenderedPageBreak/>
+        <w:t>ainda, a realização de mais de 25 (vinte e cinco) palestras em 2025 e de 22 (vinte e duas) palestras em 2026, até a presente data, voltadas ao público interno e externo (art. 2º, IV, da Portaria n.º 042-CG/2024). A RMP também atuará no cumprimento da Portaria n.º 083-CG/2026, apoiando os casos que envolvam policiais militares e conduzindo o projeto “Homens em Diálogo”.</w:t>
       </w:r>
     </w:p>
     <w:p>
@@ -2303,46 +2313,7 @@
           <w:sz w:val="20"/>
           <w:szCs w:val="20"/>
         </w:rPr>
-        <w:t xml:space="preserve">A atuação já desenvolvida na área do 27º BPM (fiscalização de MPU, atendimento pós-ocorrência, palestras e Sala Lilás) demonstra a viabilidade da formalização. Registra-se, </w:t>
-      </w:r>
-      <w:r>
-        <w:rPr>
-          <w:rFonts w:ascii="Verdana" w:eastAsia="Verdana" w:hAnsi="Verdana" w:cs="Verdana"/>
-          <w:color w:val="000000"/>
-          <w:sz w:val="20"/>
-          <w:szCs w:val="20"/>
-        </w:rPr>
-        <w:lastRenderedPageBreak/>
-        <w:t>ainda, a realização de mais de 25 (vinte e cinco) palestras em 2025 e de 22 (vinte e duas) palestras em 2026, até a presente data, voltadas ao público interno e externo (art. 2º, IV, da Portaria n.º 042-CG/2024). A RMP também atuará no cumprimento da Portaria n.º 083-CG/2026, apoiando os casos que envolvam policiais militares e conduzindo o projeto “Homens em Diálogo”.</w:t>
-      </w:r>
-    </w:p>
-    <w:p>
-      <w:pPr>
-        <w:pBdr>
-          <w:top w:val="nil"/>
-          <w:left w:val="nil"/>
-          <w:bottom w:val="nil"/>
-          <w:right w:val="nil"/>
-          <w:between w:val="nil"/>
-        </w:pBdr>
-        <w:spacing w:line="360" w:lineRule="auto"/>
-        <w:ind w:firstLine="709"/>
-        <w:jc w:val="both"/>
-        <w:rPr>
-          <w:rFonts w:ascii="Verdana" w:eastAsia="Verdana" w:hAnsi="Verdana" w:cs="Verdana"/>
-          <w:color w:val="000000"/>
-          <w:sz w:val="20"/>
-          <w:szCs w:val="20"/>
-        </w:rPr>
-      </w:pPr>
-      <w:r>
-        <w:rPr>
-          <w:rFonts w:ascii="Verdana" w:eastAsia="Verdana" w:hAnsi="Verdana" w:cs="Verdana"/>
-          <w:color w:val="000000"/>
-          <w:sz w:val="20"/>
-          <w:szCs w:val="20"/>
-        </w:rPr>
-        <w:t>(Registros fotográficos de palestras e ações da RMP – ver Anexo H)</w:t>
+        <w:t>(Registros fotográficos de palestras e ações da RMP – ver Anexo F)</w:t>
       </w:r>
     </w:p>
     <w:p>
@@ -2862,7 +2833,7 @@
           <w:sz w:val="20"/>
           <w:szCs w:val="20"/>
         </w:rPr>
-        <w:t>Anexo A – Parecer do Comandante do CPR-O (art. 4º, I, “g”);</w:t>
+        <w:t>Anexo A – Relação do efetivo da RMP, por posto/graduação e capacitação (documento de acesso restrito);</w:t>
       </w:r>
     </w:p>
     <w:p>
@@ -2890,7 +2861,7 @@
           <w:sz w:val="20"/>
           <w:szCs w:val="20"/>
         </w:rPr>
-        <w:t>Anexo B – Relação do efetivo da RMP, por posto/graduação e capacitação (documento de acesso restrito);</w:t>
+        <w:t>Anexo B – Gráfico das ocorrências de violência doméstica (2024–2026), fonte SIGESPOL;</w:t>
       </w:r>
     </w:p>
     <w:p>
@@ -2918,7 +2889,7 @@
           <w:sz w:val="20"/>
           <w:szCs w:val="20"/>
         </w:rPr>
-        <w:t>Anexo C – Gráfico das ocorrências de violência doméstica (2024–2026), fonte SIGESPOL;</w:t>
+        <w:t>Anexo C – Gráfico das MPUs ativas (2025–2026);</w:t>
       </w:r>
     </w:p>
     <w:p>
@@ -2946,7 +2917,7 @@
           <w:sz w:val="20"/>
           <w:szCs w:val="20"/>
         </w:rPr>
-        <w:t>Anexo D – Mancha criminal de violência doméstica (2026);</w:t>
+        <w:t>Anexo D – Fotos das instalações da RMP;</w:t>
       </w:r>
     </w:p>
     <w:p>
@@ -2974,7 +2945,7 @@
           <w:sz w:val="20"/>
           <w:szCs w:val="20"/>
         </w:rPr>
-        <w:t>Anexo E – Gráfico das MPUs ativas (2025–2026);</w:t>
+        <w:t>Anexo E – Foto da viatura da RMP;</w:t>
       </w:r>
     </w:p>
     <w:p>
@@ -3002,63 +2973,7 @@
           <w:sz w:val="20"/>
           <w:szCs w:val="20"/>
         </w:rPr>
-        <w:t>Anexo F – Fotos das instalações da RMP;</w:t>
-      </w:r>
-    </w:p>
-    <w:p>
-      <w:pPr>
-        <w:pBdr>
-          <w:top w:val="nil"/>
-          <w:left w:val="nil"/>
-          <w:bottom w:val="nil"/>
-          <w:right w:val="nil"/>
-          <w:between w:val="nil"/>
-        </w:pBdr>
-        <w:spacing w:line="360" w:lineRule="auto"/>
-        <w:ind w:left="426"/>
-        <w:rPr>
-          <w:rFonts w:ascii="Verdana" w:eastAsia="Verdana" w:hAnsi="Verdana" w:cs="Verdana"/>
-          <w:color w:val="000000"/>
-          <w:sz w:val="20"/>
-          <w:szCs w:val="20"/>
-        </w:rPr>
-      </w:pPr>
-      <w:r>
-        <w:rPr>
-          <w:rFonts w:ascii="Verdana" w:eastAsia="Verdana" w:hAnsi="Verdana" w:cs="Verdana"/>
-          <w:color w:val="000000"/>
-          <w:sz w:val="20"/>
-          <w:szCs w:val="20"/>
-        </w:rPr>
-        <w:t>Anexo G – Foto da viatura da RMP;</w:t>
-      </w:r>
-    </w:p>
-    <w:p>
-      <w:pPr>
-        <w:pBdr>
-          <w:top w:val="nil"/>
-          <w:left w:val="nil"/>
-          <w:bottom w:val="nil"/>
-          <w:right w:val="nil"/>
-          <w:between w:val="nil"/>
-        </w:pBdr>
-        <w:spacing w:line="360" w:lineRule="auto"/>
-        <w:ind w:left="426"/>
-        <w:rPr>
-          <w:rFonts w:ascii="Verdana" w:eastAsia="Verdana" w:hAnsi="Verdana" w:cs="Verdana"/>
-          <w:color w:val="000000"/>
-          <w:sz w:val="20"/>
-          <w:szCs w:val="20"/>
-        </w:rPr>
-      </w:pPr>
-      <w:r>
-        <w:rPr>
-          <w:rFonts w:ascii="Verdana" w:eastAsia="Verdana" w:hAnsi="Verdana" w:cs="Verdana"/>
-          <w:color w:val="000000"/>
-          <w:sz w:val="20"/>
-          <w:szCs w:val="20"/>
-        </w:rPr>
-        <w:t>Anexo H – Registros fotográficos de palestras e ações da RMP.</w:t>
+        <w:t>Anexo F – Registros fotográficos de palestras e ações da RMP.</w:t>
       </w:r>
     </w:p>
     <w:p>
@@ -3809,6 +3724,186 @@
     </w:p>
     <w:p>
       <w:pPr>
+        <w:pBdr>
+          <w:top w:val="nil"/>
+          <w:left w:val="nil"/>
+          <w:bottom w:val="nil"/>
+          <w:right w:val="nil"/>
+          <w:between w:val="nil"/>
+        </w:pBdr>
+        <w:spacing w:line="360" w:lineRule="auto"/>
+        <w:jc w:val="center"/>
+        <w:rPr>
+          <w:rFonts w:ascii="Verdana" w:eastAsia="Verdana" w:hAnsi="Verdana" w:cs="Verdana"/>
+          <w:noProof/>
+          <w:color w:val="000000"/>
+          <w:sz w:val="20"/>
+          <w:szCs w:val="20"/>
+        </w:rPr>
+      </w:pPr>
+    </w:p>
+    <w:p>
+      <w:pPr>
+        <w:spacing w:line="360" w:lineRule="auto"/>
+        <w:ind w:firstLine="720"/>
+        <w:jc w:val="both"/>
+        <w:rPr>
+          <w:rFonts w:ascii="Verdana" w:eastAsia="Verdana" w:hAnsi="Verdana" w:cs="Verdana"/>
+          <w:sz w:val="20"/>
+          <w:szCs w:val="20"/>
+        </w:rPr>
+      </w:pPr>
+      <w:r>
+        <w:rPr>
+          <w:rFonts w:ascii="Verdana" w:eastAsia="Verdana" w:hAnsi="Verdana" w:cs="Verdana"/>
+          <w:sz w:val="20"/>
+          <w:szCs w:val="20"/>
+        </w:rPr>
+        <w:t>ANEXO – A (ACESSO RESTRITO – LGPD)</w:t>
+      </w:r>
+    </w:p>
+    <w:p>
+      <w:pPr>
+        <w:spacing w:line="360" w:lineRule="auto"/>
+        <w:ind w:firstLine="720"/>
+        <w:jc w:val="both"/>
+        <w:rPr>
+          <w:rFonts w:ascii="Verdana" w:eastAsia="Verdana" w:hAnsi="Verdana" w:cs="Verdana"/>
+          <w:sz w:val="20"/>
+          <w:szCs w:val="20"/>
+        </w:rPr>
+      </w:pPr>
+      <w:r>
+        <w:rPr>
+          <w:rFonts w:ascii="Verdana" w:eastAsia="Verdana" w:hAnsi="Verdana" w:cs="Verdana"/>
+          <w:sz w:val="20"/>
+          <w:szCs w:val="20"/>
+        </w:rPr>
+        <w:t>RELAÇÃO NOMINAL DO EFETIVO DA RMP/27º BPM</w:t>
+      </w:r>
+    </w:p>
+    <w:p>
+      <w:pPr>
+        <w:spacing w:line="360" w:lineRule="auto"/>
+        <w:ind w:firstLine="720"/>
+        <w:jc w:val="both"/>
+        <w:rPr>
+          <w:rFonts w:ascii="Verdana" w:eastAsia="Verdana" w:hAnsi="Verdana" w:cs="Verdana"/>
+          <w:sz w:val="20"/>
+          <w:szCs w:val="20"/>
+        </w:rPr>
+      </w:pPr>
+      <w:r>
+        <w:rPr>
+          <w:rFonts w:ascii="Verdana" w:eastAsia="Verdana" w:hAnsi="Verdana" w:cs="Verdana"/>
+          <w:sz w:val="20"/>
+          <w:szCs w:val="20"/>
+        </w:rPr>
+        <w:t>Comandante da RMP: TEN PM LUIS HENRIQUE SANTOS SOUSA</w:t>
+      </w:r>
+    </w:p>
+    <w:p>
+      <w:pPr>
+        <w:spacing w:line="360" w:lineRule="auto"/>
+        <w:ind w:firstLine="720"/>
+        <w:jc w:val="both"/>
+        <w:rPr>
+          <w:rFonts w:ascii="Verdana" w:eastAsia="Verdana" w:hAnsi="Verdana" w:cs="Verdana"/>
+          <w:sz w:val="20"/>
+          <w:szCs w:val="20"/>
+        </w:rPr>
+      </w:pPr>
+      <w:r>
+        <w:rPr>
+          <w:rFonts w:ascii="Verdana" w:eastAsia="Verdana" w:hAnsi="Verdana" w:cs="Verdana"/>
+          <w:sz w:val="20"/>
+          <w:szCs w:val="20"/>
+        </w:rPr>
+        <w:t>SGT PM FLAVIO DE SOUZA SARDEIRO</w:t>
+      </w:r>
+    </w:p>
+    <w:p>
+      <w:pPr>
+        <w:spacing w:line="360" w:lineRule="auto"/>
+        <w:ind w:firstLine="720"/>
+        <w:jc w:val="both"/>
+        <w:rPr>
+          <w:rFonts w:ascii="Verdana" w:eastAsia="Verdana" w:hAnsi="Verdana" w:cs="Verdana"/>
+          <w:sz w:val="20"/>
+          <w:szCs w:val="20"/>
+        </w:rPr>
+      </w:pPr>
+      <w:r>
+        <w:rPr>
+          <w:rFonts w:ascii="Verdana" w:eastAsia="Verdana" w:hAnsi="Verdana" w:cs="Verdana"/>
+          <w:sz w:val="20"/>
+          <w:szCs w:val="20"/>
+        </w:rPr>
+        <w:t>CB PM LIVIA MACIEL SANTIAGO DOS SANTOS</w:t>
+      </w:r>
+    </w:p>
+    <w:p>
+      <w:pPr>
+        <w:spacing w:line="360" w:lineRule="auto"/>
+        <w:ind w:firstLine="720"/>
+        <w:jc w:val="both"/>
+        <w:rPr>
+          <w:rFonts w:ascii="Verdana" w:eastAsia="Verdana" w:hAnsi="Verdana" w:cs="Verdana"/>
+          <w:sz w:val="20"/>
+          <w:szCs w:val="20"/>
+        </w:rPr>
+      </w:pPr>
+      <w:r>
+        <w:rPr>
+          <w:rFonts w:ascii="Verdana" w:eastAsia="Verdana" w:hAnsi="Verdana" w:cs="Verdana"/>
+          <w:sz w:val="20"/>
+          <w:szCs w:val="20"/>
+        </w:rPr>
+        <w:t>SD PM DAVI ALVES DA SILVA</w:t>
+      </w:r>
+    </w:p>
+    <w:p>
+      <w:pPr>
+        <w:spacing w:line="360" w:lineRule="auto"/>
+        <w:ind w:firstLine="720"/>
+        <w:jc w:val="both"/>
+        <w:rPr>
+          <w:rFonts w:ascii="Verdana" w:eastAsia="Verdana" w:hAnsi="Verdana" w:cs="Verdana"/>
+          <w:sz w:val="20"/>
+          <w:szCs w:val="20"/>
+        </w:rPr>
+      </w:pPr>
+      <w:r>
+        <w:rPr>
+          <w:rFonts w:ascii="Verdana" w:eastAsia="Verdana" w:hAnsi="Verdana" w:cs="Verdana"/>
+          <w:sz w:val="20"/>
+          <w:szCs w:val="20"/>
+        </w:rPr>
+        <w:t>SD PM JEOVANA ALVES CIRIACO DOS SANTOS</w:t>
+      </w:r>
+    </w:p>
+    <w:p>
+      <w:pPr>
+        <w:spacing w:line="360" w:lineRule="auto"/>
+        <w:ind w:firstLine="720"/>
+        <w:jc w:val="both"/>
+        <w:rPr>
+          <w:rFonts w:ascii="Verdana" w:eastAsia="Verdana" w:hAnsi="Verdana" w:cs="Verdana"/>
+          <w:sz w:val="20"/>
+          <w:szCs w:val="20"/>
+        </w:rPr>
+      </w:pPr>
+      <w:r>
+        <w:rPr>
+          <w:rFonts w:ascii="Verdana" w:eastAsia="Verdana" w:hAnsi="Verdana" w:cs="Verdana"/>
+          <w:sz w:val="20"/>
+          <w:szCs w:val="20"/>
+        </w:rPr>
+        <w:t>Capacitação: agendada junto ao BPPM.</w:t>
+      </w:r>
+    </w:p>
+    <w:p>
+      <w:pPr>
         <w:jc w:val="center"/>
         <w:rPr>
           <w:rFonts w:ascii="Verdana" w:eastAsia="Verdana" w:hAnsi="Verdana" w:cs="Verdana"/>
@@ -3828,250 +3923,9 @@
           <w:sz w:val="20"/>
           <w:szCs w:val="20"/>
         </w:rPr>
-        <w:t>ANEXO – A</w:t>
-      </w:r>
-    </w:p>
-    <w:p>
-      <w:pPr>
-        <w:pBdr>
-          <w:top w:val="nil"/>
-          <w:left w:val="nil"/>
-          <w:bottom w:val="nil"/>
-          <w:right w:val="nil"/>
-          <w:between w:val="nil"/>
-        </w:pBdr>
-        <w:spacing w:line="360" w:lineRule="auto"/>
-        <w:jc w:val="center"/>
-        <w:rPr>
-          <w:rFonts w:ascii="Verdana" w:eastAsia="Verdana" w:hAnsi="Verdana" w:cs="Verdana"/>
-          <w:color w:val="000000"/>
-          <w:sz w:val="20"/>
-          <w:szCs w:val="20"/>
-        </w:rPr>
-      </w:pPr>
-      <w:r>
-        <w:rPr>
-          <w:rFonts w:ascii="Verdana" w:eastAsia="Verdana" w:hAnsi="Verdana" w:cs="Verdana"/>
-          <w:color w:val="000000"/>
-          <w:sz w:val="20"/>
-          <w:szCs w:val="20"/>
-        </w:rPr>
-        <w:t>PARECER DO COMANDANTE DO CPR-O</w:t>
-      </w:r>
-    </w:p>
-    <w:p>
-      <w:pPr>
-        <w:spacing w:line="360" w:lineRule="auto"/>
-        <w:ind w:firstLine="720"/>
-        <w:jc w:val="center"/>
-        <w:rPr>
-          <w:rFonts w:ascii="Verdana" w:eastAsia="Verdana" w:hAnsi="Verdana" w:cs="Verdana"/>
-          <w:sz w:val="20"/>
-          <w:szCs w:val="20"/>
-        </w:rPr>
-      </w:pPr>
-      <w:r>
-        <w:rPr>
-          <w:rFonts w:ascii="Verdana" w:eastAsia="Verdana" w:hAnsi="Verdana" w:cs="Verdana"/>
-          <w:i/>
-          <w:sz w:val="20"/>
-          <w:szCs w:val="20"/>
-          <w:highlight w:val="yellow"/>
-        </w:rPr>
-        <w:t>[INSERIR IMAGEM: Digitalização do parecer favorável do Comandante do CPR-O]</w:t>
-      </w:r>
-    </w:p>
-    <w:p>
-      <w:pPr>
-        <w:pBdr>
-          <w:top w:val="nil"/>
-          <w:left w:val="nil"/>
-          <w:bottom w:val="nil"/>
-          <w:right w:val="nil"/>
-          <w:between w:val="nil"/>
-        </w:pBdr>
-        <w:spacing w:line="360" w:lineRule="auto"/>
-        <w:jc w:val="center"/>
-        <w:rPr>
-          <w:rFonts w:ascii="Verdana" w:eastAsia="Verdana" w:hAnsi="Verdana" w:cs="Verdana"/>
-          <w:noProof/>
-          <w:color w:val="000000"/>
-          <w:sz w:val="20"/>
-          <w:szCs w:val="20"/>
-        </w:rPr>
-      </w:pPr>
-    </w:p>
-    <w:p>
-      <w:pPr>
-        <w:spacing w:line="360" w:lineRule="auto"/>
-        <w:ind w:firstLine="720"/>
-        <w:jc w:val="both"/>
-        <w:rPr>
-          <w:rFonts w:ascii="Verdana" w:eastAsia="Verdana" w:hAnsi="Verdana" w:cs="Verdana"/>
-          <w:sz w:val="20"/>
-          <w:szCs w:val="20"/>
-        </w:rPr>
-      </w:pPr>
-      <w:r>
-        <w:rPr>
-          <w:rFonts w:ascii="Verdana" w:eastAsia="Verdana" w:hAnsi="Verdana" w:cs="Verdana"/>
-          <w:sz w:val="20"/>
-          <w:szCs w:val="20"/>
-        </w:rPr>
         <w:br w:type="page"/>
       </w:r>
       <w:r>
-        <w:rPr>
-          <w:rFonts w:ascii="Verdana" w:eastAsia="Verdana" w:hAnsi="Verdana" w:cs="Verdana"/>
-          <w:sz w:val="20"/>
-          <w:szCs w:val="20"/>
-        </w:rPr>
-        <w:t>ANEXO – B (ACESSO RESTRITO – LGPD)</w:t>
-      </w:r>
-    </w:p>
-    <w:p>
-      <w:pPr>
-        <w:spacing w:line="360" w:lineRule="auto"/>
-        <w:ind w:firstLine="720"/>
-        <w:jc w:val="both"/>
-        <w:rPr>
-          <w:rFonts w:ascii="Verdana" w:eastAsia="Verdana" w:hAnsi="Verdana" w:cs="Verdana"/>
-          <w:sz w:val="20"/>
-          <w:szCs w:val="20"/>
-        </w:rPr>
-      </w:pPr>
-      <w:r>
-        <w:rPr>
-          <w:rFonts w:ascii="Verdana" w:eastAsia="Verdana" w:hAnsi="Verdana" w:cs="Verdana"/>
-          <w:sz w:val="20"/>
-          <w:szCs w:val="20"/>
-        </w:rPr>
-        <w:t>RELAÇÃO NOMINAL DO EFETIVO DA RMP/27º BPM</w:t>
-      </w:r>
-    </w:p>
-    <w:p>
-      <w:pPr>
-        <w:spacing w:line="360" w:lineRule="auto"/>
-        <w:ind w:firstLine="720"/>
-        <w:jc w:val="both"/>
-        <w:rPr>
-          <w:rFonts w:ascii="Verdana" w:eastAsia="Verdana" w:hAnsi="Verdana" w:cs="Verdana"/>
-          <w:sz w:val="20"/>
-          <w:szCs w:val="20"/>
-        </w:rPr>
-      </w:pPr>
-      <w:r>
-        <w:rPr>
-          <w:rFonts w:ascii="Verdana" w:eastAsia="Verdana" w:hAnsi="Verdana" w:cs="Verdana"/>
-          <w:sz w:val="20"/>
-          <w:szCs w:val="20"/>
-        </w:rPr>
-        <w:t>Comandante da RMP: TEN PM LUIS HENRIQUE SANTOS SOUSA</w:t>
-      </w:r>
-    </w:p>
-    <w:p>
-      <w:pPr>
-        <w:spacing w:line="360" w:lineRule="auto"/>
-        <w:ind w:firstLine="720"/>
-        <w:jc w:val="both"/>
-        <w:rPr>
-          <w:rFonts w:ascii="Verdana" w:eastAsia="Verdana" w:hAnsi="Verdana" w:cs="Verdana"/>
-          <w:sz w:val="20"/>
-          <w:szCs w:val="20"/>
-        </w:rPr>
-      </w:pPr>
-      <w:r>
-        <w:rPr>
-          <w:rFonts w:ascii="Verdana" w:eastAsia="Verdana" w:hAnsi="Verdana" w:cs="Verdana"/>
-          <w:sz w:val="20"/>
-          <w:szCs w:val="20"/>
-        </w:rPr>
-        <w:t>SGT PM FLAVIO DE SOUZA SARDEIRO</w:t>
-      </w:r>
-    </w:p>
-    <w:p>
-      <w:pPr>
-        <w:spacing w:line="360" w:lineRule="auto"/>
-        <w:ind w:firstLine="720"/>
-        <w:jc w:val="both"/>
-        <w:rPr>
-          <w:rFonts w:ascii="Verdana" w:eastAsia="Verdana" w:hAnsi="Verdana" w:cs="Verdana"/>
-          <w:sz w:val="20"/>
-          <w:szCs w:val="20"/>
-        </w:rPr>
-      </w:pPr>
-      <w:r>
-        <w:rPr>
-          <w:rFonts w:ascii="Verdana" w:eastAsia="Verdana" w:hAnsi="Verdana" w:cs="Verdana"/>
-          <w:sz w:val="20"/>
-          <w:szCs w:val="20"/>
-        </w:rPr>
-        <w:t>CB PM LIVIA MACIEL SANTIAGO DOS SANTOS</w:t>
-      </w:r>
-    </w:p>
-    <w:p>
-      <w:pPr>
-        <w:spacing w:line="360" w:lineRule="auto"/>
-        <w:ind w:firstLine="720"/>
-        <w:jc w:val="both"/>
-        <w:rPr>
-          <w:rFonts w:ascii="Verdana" w:eastAsia="Verdana" w:hAnsi="Verdana" w:cs="Verdana"/>
-          <w:sz w:val="20"/>
-          <w:szCs w:val="20"/>
-        </w:rPr>
-      </w:pPr>
-      <w:r>
-        <w:rPr>
-          <w:rFonts w:ascii="Verdana" w:eastAsia="Verdana" w:hAnsi="Verdana" w:cs="Verdana"/>
-          <w:sz w:val="20"/>
-          <w:szCs w:val="20"/>
-        </w:rPr>
-        <w:t>SD PM DAVI ALVES DA SILVA</w:t>
-      </w:r>
-    </w:p>
-    <w:p>
-      <w:pPr>
-        <w:spacing w:line="360" w:lineRule="auto"/>
-        <w:ind w:firstLine="720"/>
-        <w:jc w:val="both"/>
-        <w:rPr>
-          <w:rFonts w:ascii="Verdana" w:eastAsia="Verdana" w:hAnsi="Verdana" w:cs="Verdana"/>
-          <w:sz w:val="20"/>
-          <w:szCs w:val="20"/>
-        </w:rPr>
-      </w:pPr>
-      <w:r>
-        <w:rPr>
-          <w:rFonts w:ascii="Verdana" w:eastAsia="Verdana" w:hAnsi="Verdana" w:cs="Verdana"/>
-          <w:sz w:val="20"/>
-          <w:szCs w:val="20"/>
-        </w:rPr>
-        <w:t>SD PM JEOVANA ALVES CIRIACO DOS SANTOS</w:t>
-      </w:r>
-    </w:p>
-    <w:p>
-      <w:pPr>
-        <w:spacing w:line="360" w:lineRule="auto"/>
-        <w:ind w:firstLine="720"/>
-        <w:jc w:val="both"/>
-        <w:rPr>
-          <w:rFonts w:ascii="Verdana" w:eastAsia="Verdana" w:hAnsi="Verdana" w:cs="Verdana"/>
-          <w:sz w:val="20"/>
-          <w:szCs w:val="20"/>
-        </w:rPr>
-      </w:pPr>
-      <w:r>
-        <w:rPr>
-          <w:rFonts w:ascii="Verdana" w:eastAsia="Verdana" w:hAnsi="Verdana" w:cs="Verdana"/>
-          <w:sz w:val="20"/>
-          <w:szCs w:val="20"/>
-        </w:rPr>
-        <w:t>Capacitação: agendada junto ao BPPM.</w:t>
-      </w:r>
-    </w:p>
-    <w:p>
-      <w:pPr>
-        <w:jc w:val="center"/>
         <w:rPr>
           <w:rFonts w:ascii="Verdana" w:eastAsia="Verdana" w:hAnsi="Verdana" w:cs="Verdana"/>
           <w:b/>
@@ -4080,28 +3934,7 @@
           <w:sz w:val="20"/>
           <w:szCs w:val="20"/>
         </w:rPr>
-      </w:pPr>
-      <w:r>
-        <w:rPr>
-          <w:rFonts w:ascii="Verdana" w:eastAsia="Verdana" w:hAnsi="Verdana" w:cs="Verdana"/>
-          <w:b/>
-          <w:bCs/>
-          <w:color w:val="000000"/>
-          <w:sz w:val="20"/>
-          <w:szCs w:val="20"/>
-        </w:rPr>
-        <w:br w:type="page"/>
-      </w:r>
-      <w:r>
-        <w:rPr>
-          <w:rFonts w:ascii="Verdana" w:eastAsia="Verdana" w:hAnsi="Verdana" w:cs="Verdana"/>
-          <w:b/>
-          <w:bCs/>
-          <w:color w:val="000000"/>
-          <w:sz w:val="20"/>
-          <w:szCs w:val="20"/>
-        </w:rPr>
-        <w:t>ANEXO – C</w:t>
+        <w:t>ANEXO – B</w:t>
       </w:r>
     </w:p>
     <w:p>
@@ -4216,92 +4049,7 @@
           <w:sz w:val="20"/>
           <w:szCs w:val="20"/>
         </w:rPr>
-        <w:t>ANEXO – D</w:t>
-      </w:r>
-    </w:p>
-    <w:p>
-      <w:pPr>
-        <w:pBdr>
-          <w:top w:val="nil"/>
-          <w:left w:val="nil"/>
-          <w:bottom w:val="nil"/>
-          <w:right w:val="nil"/>
-          <w:between w:val="nil"/>
-        </w:pBdr>
-        <w:spacing w:line="360" w:lineRule="auto"/>
-        <w:jc w:val="center"/>
-        <w:rPr>
-          <w:rFonts w:ascii="Verdana" w:eastAsia="Verdana" w:hAnsi="Verdana" w:cs="Verdana"/>
-          <w:color w:val="000000"/>
-          <w:sz w:val="20"/>
-          <w:szCs w:val="20"/>
-        </w:rPr>
-      </w:pPr>
-      <w:r>
-        <w:rPr>
-          <w:rFonts w:ascii="Verdana" w:eastAsia="Verdana" w:hAnsi="Verdana" w:cs="Verdana"/>
-          <w:color w:val="000000"/>
-          <w:sz w:val="20"/>
-          <w:szCs w:val="20"/>
-        </w:rPr>
-        <w:t>MANCHA CRIMINAL DE VIOLÊNCIA DOMÉSTICA (2026)</w:t>
-      </w:r>
-    </w:p>
-    <w:p>
-      <w:pPr>
-        <w:spacing w:line="360" w:lineRule="auto"/>
-        <w:ind w:firstLine="720"/>
-        <w:jc w:val="center"/>
-        <w:rPr>
-          <w:rFonts w:ascii="Verdana" w:eastAsia="Verdana" w:hAnsi="Verdana" w:cs="Verdana"/>
-          <w:sz w:val="20"/>
-          <w:szCs w:val="20"/>
-        </w:rPr>
-      </w:pPr>
-      <w:r>
-        <w:rPr>
-          <w:rFonts w:ascii="Verdana" w:eastAsia="Verdana" w:hAnsi="Verdana" w:cs="Verdana"/>
-          <w:i/>
-          <w:sz w:val="20"/>
-          <w:szCs w:val="20"/>
-          <w:highlight w:val="yellow"/>
-        </w:rPr>
-        <w:t>[INSERIR IMAGEM: Mancha por bairro/área, sem pontos de residência das vítimas (LGPD)]</w:t>
-      </w:r>
-    </w:p>
-    <w:p>
-      <w:pPr>
-        <w:jc w:val="center"/>
-        <w:rPr>
-          <w:rFonts w:ascii="Verdana" w:eastAsia="Verdana" w:hAnsi="Verdana" w:cs="Verdana"/>
-          <w:b/>
-          <w:bCs/>
-          <w:color w:val="000000"/>
-          <w:sz w:val="20"/>
-          <w:szCs w:val="20"/>
-        </w:rPr>
-      </w:pPr>
-      <w:r>
-        <w:rPr>
-          <w:rFonts w:ascii="Verdana" w:eastAsia="Verdana" w:hAnsi="Verdana" w:cs="Verdana"/>
-          <w:b/>
-          <w:bCs/>
-          <w:color w:val="000000"/>
-          <w:sz w:val="20"/>
-          <w:szCs w:val="20"/>
-        </w:rPr>
-        <w:br w:type="page"/>
-      </w:r>
-      <w:r>
-        <w:rPr>
-          <w:rFonts w:ascii="Verdana" w:eastAsia="Verdana" w:hAnsi="Verdana" w:cs="Verdana"/>
-          <w:b/>
-          <w:bCs/>
-          <w:color w:val="000000"/>
-          <w:sz w:val="20"/>
-          <w:szCs w:val="20"/>
-        </w:rPr>
-        <w:t>ANEXO – E</w:t>
+        <w:t>ANEXO – C</w:t>
       </w:r>
     </w:p>
     <w:p>
@@ -4416,7 +4164,7 @@
           <w:sz w:val="20"/>
           <w:szCs w:val="20"/>
         </w:rPr>
-        <w:t>ANEXO – F</w:t>
+        <w:t>ANEXO – D</w:t>
       </w:r>
     </w:p>
     <w:p>
@@ -4461,12 +4209,75 @@
       <w:r>
         <w:rPr>
           <w:rFonts w:ascii="Verdana" w:eastAsia="Verdana" w:hAnsi="Verdana" w:cs="Verdana"/>
-          <w:i/>
-          <w:sz w:val="20"/>
-          <w:szCs w:val="20"/>
-          <w:highlight w:val="yellow"/>
-        </w:rPr>
-        <w:t>[INSERIR IMAGEM: Fotos do espaço da RMP na sede do 27º BPM, sem pessoas atendidas]</w:t>
+          <w:i w:val="0"/>
+          <w:sz w:val="20"/>
+          <w:szCs w:val="20"/>
+        </w:rPr>
+        <w:drawing>
+          <wp:inline xmlns:a="http://schemas.openxmlformats.org/drawingml/2006/main" xmlns:pic="http://schemas.openxmlformats.org/drawingml/2006/picture">
+            <wp:extent cx="2700000" cy="3600000"/>
+            <wp:docPr id="17" name="Picture 17"/>
+            <wp:cNvGraphicFramePr>
+              <a:graphicFrameLocks noChangeAspect="1"/>
+            </wp:cNvGraphicFramePr>
+            <a:graphic>
+              <a:graphicData uri="http://schemas.openxmlformats.org/drawingml/2006/picture">
+                <pic:pic>
+                  <pic:nvPicPr>
+                    <pic:cNvPr id="0" name="16.jpg"/>
+                    <pic:cNvPicPr/>
+                  </pic:nvPicPr>
+                  <pic:blipFill>
+                    <a:blip r:embed="rId26"/>
+                    <a:stretch>
+                      <a:fillRect/>
+                    </a:stretch>
+                  </pic:blipFill>
+                  <pic:spPr>
+                    <a:xfrm>
+                      <a:off x="0" y="0"/>
+                      <a:ext cx="2700000" cy="3600000"/>
+                    </a:xfrm>
+                    <a:prstGeom prst="rect"/>
+                  </pic:spPr>
+                </pic:pic>
+              </a:graphicData>
+            </a:graphic>
+          </wp:inline>
+        </w:drawing>
+        <w:br/>
+        <w:drawing>
+          <wp:inline xmlns:a="http://schemas.openxmlformats.org/drawingml/2006/main" xmlns:pic="http://schemas.openxmlformats.org/drawingml/2006/picture">
+            <wp:extent cx="2700000" cy="3600000"/>
+            <wp:docPr id="18" name="Picture 18"/>
+            <wp:cNvGraphicFramePr>
+              <a:graphicFrameLocks noChangeAspect="1"/>
+            </wp:cNvGraphicFramePr>
+            <a:graphic>
+              <a:graphicData uri="http://schemas.openxmlformats.org/drawingml/2006/picture">
+                <pic:pic>
+                  <pic:nvPicPr>
+                    <pic:cNvPr id="0" name="17.jpg"/>
+                    <pic:cNvPicPr/>
+                  </pic:nvPicPr>
+                  <pic:blipFill>
+                    <a:blip r:embed="rId27"/>
+                    <a:stretch>
+                      <a:fillRect/>
+                    </a:stretch>
+                  </pic:blipFill>
+                  <pic:spPr>
+                    <a:xfrm>
+                      <a:off x="0" y="0"/>
+                      <a:ext cx="2700000" cy="3600000"/>
+                    </a:xfrm>
+                    <a:prstGeom prst="rect"/>
+                  </pic:spPr>
+                </pic:pic>
+              </a:graphicData>
+            </a:graphic>
+          </wp:inline>
+        </w:drawing>
       </w:r>
     </w:p>
     <w:p>
@@ -4501,7 +4312,7 @@
           <w:sz w:val="20"/>
           <w:szCs w:val="20"/>
         </w:rPr>
-        <w:t>ANEXO – G</w:t>
+        <w:t>ANEXO – E</w:t>
       </w:r>
     </w:p>
     <w:p>
@@ -4546,12 +4357,75 @@
       <w:r>
         <w:rPr>
           <w:rFonts w:ascii="Verdana" w:eastAsia="Verdana" w:hAnsi="Verdana" w:cs="Verdana"/>
-          <w:i/>
-          <w:sz w:val="20"/>
-          <w:szCs w:val="20"/>
-          <w:highlight w:val="yellow"/>
-        </w:rPr>
-        <w:t>[INSERIR IMAGEM: Foto da viatura 8.2732 – Renault/Duster]</w:t>
+          <w:i w:val="0"/>
+          <w:sz w:val="20"/>
+          <w:szCs w:val="20"/>
+        </w:rPr>
+        <w:drawing>
+          <wp:inline xmlns:a="http://schemas.openxmlformats.org/drawingml/2006/main" xmlns:pic="http://schemas.openxmlformats.org/drawingml/2006/picture">
+            <wp:extent cx="5400000" cy="3037500"/>
+            <wp:docPr id="15" name="Picture 15"/>
+            <wp:cNvGraphicFramePr>
+              <a:graphicFrameLocks noChangeAspect="1"/>
+            </wp:cNvGraphicFramePr>
+            <a:graphic>
+              <a:graphicData uri="http://schemas.openxmlformats.org/drawingml/2006/picture">
+                <pic:pic>
+                  <pic:nvPicPr>
+                    <pic:cNvPr id="0" name="14.jpg"/>
+                    <pic:cNvPicPr/>
+                  </pic:nvPicPr>
+                  <pic:blipFill>
+                    <a:blip r:embed="rId24"/>
+                    <a:stretch>
+                      <a:fillRect/>
+                    </a:stretch>
+                  </pic:blipFill>
+                  <pic:spPr>
+                    <a:xfrm>
+                      <a:off x="0" y="0"/>
+                      <a:ext cx="5400000" cy="3037500"/>
+                    </a:xfrm>
+                    <a:prstGeom prst="rect"/>
+                  </pic:spPr>
+                </pic:pic>
+              </a:graphicData>
+            </a:graphic>
+          </wp:inline>
+        </w:drawing>
+        <w:br/>
+        <w:drawing>
+          <wp:inline xmlns:a="http://schemas.openxmlformats.org/drawingml/2006/main" xmlns:pic="http://schemas.openxmlformats.org/drawingml/2006/picture">
+            <wp:extent cx="2227500" cy="3960000"/>
+            <wp:docPr id="16" name="Picture 16"/>
+            <wp:cNvGraphicFramePr>
+              <a:graphicFrameLocks noChangeAspect="1"/>
+            </wp:cNvGraphicFramePr>
+            <a:graphic>
+              <a:graphicData uri="http://schemas.openxmlformats.org/drawingml/2006/picture">
+                <pic:pic>
+                  <pic:nvPicPr>
+                    <pic:cNvPr id="0" name="15.jpg"/>
+                    <pic:cNvPicPr/>
+                  </pic:nvPicPr>
+                  <pic:blipFill>
+                    <a:blip r:embed="rId25"/>
+                    <a:stretch>
+                      <a:fillRect/>
+                    </a:stretch>
+                  </pic:blipFill>
+                  <pic:spPr>
+                    <a:xfrm>
+                      <a:off x="0" y="0"/>
+                      <a:ext cx="2227500" cy="3960000"/>
+                    </a:xfrm>
+                    <a:prstGeom prst="rect"/>
+                  </pic:spPr>
+                </pic:pic>
+              </a:graphicData>
+            </a:graphic>
+          </wp:inline>
+        </w:drawing>
       </w:r>
     </w:p>
     <w:p>
@@ -4586,7 +4460,7 @@
           <w:sz w:val="20"/>
           <w:szCs w:val="20"/>
         </w:rPr>
-        <w:t>ANEXO – H</w:t>
+        <w:t>ANEXO – F</w:t>
       </w:r>
     </w:p>
     <w:p>

</xml_diff>

<commit_message>
Discussão: subitens a) a g) com letras
Co-Authored-By: Claude Opus 5.5 <noreply@anthropic.com>
Claude-Session: https://claude.ai/code/session_01NkJxMjLTPT7uCe2XDfKQHG
</commit_message>
<xml_diff>
--- a/estudo/Estudo_de_Situacao_RMP_27BPM.docx
+++ b/estudo/Estudo_de_Situacao_RMP_27BPM.docx
@@ -1960,6 +1960,40 @@
     </w:p>
     <w:p>
       <w:pPr>
+        <w:pStyle w:val="PargrafodaLista"/>
+        <w:numPr>
+          <w:ilvl w:val="0"/>
+          <w:numId w:val="15"/>
+        </w:numPr>
+        <w:pBdr>
+          <w:top w:val="nil"/>
+          <w:left w:val="nil"/>
+          <w:bottom w:val="nil"/>
+          <w:right w:val="nil"/>
+          <w:between w:val="nil"/>
+        </w:pBdr>
+        <w:spacing w:line="360" w:lineRule="auto"/>
+        <w:ind w:left="0" w:firstLine="709"/>
+        <w:jc w:val="both"/>
+        <w:rPr>
+          <w:rFonts w:ascii="Verdana" w:eastAsia="Verdana" w:hAnsi="Verdana" w:cs="Verdana"/>
+          <w:color w:val="000000"/>
+          <w:sz w:val="20"/>
+          <w:szCs w:val="20"/>
+        </w:rPr>
+      </w:pPr>
+      <w:r>
+        <w:rPr>
+          <w:rFonts w:ascii="Verdana" w:eastAsia="Verdana" w:hAnsi="Verdana" w:cs="Verdana"/>
+          <w:color w:val="000000"/>
+          <w:sz w:val="20"/>
+          <w:szCs w:val="20"/>
+        </w:rPr>
+        <w:t>Medidas Protetivas de Urgência (2025–2026)</w:t>
+      </w:r>
+    </w:p>
+    <w:p>
+      <w:pPr>
         <w:pBdr>
           <w:top w:val="nil"/>
           <w:left w:val="nil"/>
@@ -1984,7 +2018,7 @@
           <w:sz w:val="20"/>
           <w:szCs w:val="20"/>
         </w:rPr>
-        <w:t>4. Medidas Protetivas de Urgência (últimos três anos)</w:t>
+        <w:t>A RMP acompanhava 192 (cento e noventa e duas) MPUs ativas em 2025 e acompanha, atualmente, 202 (duzentas e duas) MPUs ativas em 2026, aumento de aproximadamente 5%. Os registros de MPUs de períodos anteriores não estão disponíveis no 27º BPM, pois eram realizados pela Unidade da RMP da 83ª CIPM/Barreiras, o que reforça a necessidade de gestão própria. A fiscalização regular desse universo já é realizada pelo efetivo do 27º BPM, sendo necessária a sua formalização para garantir gestão, controle e planejamento próprios.</w:t>
       </w:r>
     </w:p>
     <w:p>
@@ -2013,7 +2047,41 @@
           <w:sz w:val="20"/>
           <w:szCs w:val="20"/>
         </w:rPr>
-        <w:t>A RMP acompanhava 192 (cento e noventa e duas) MPUs ativas em 2025 e acompanha, atualmente, 202 (duzentas e duas) MPUs ativas em 2026, aumento de aproximadamente 5%. Os registros de MPUs de períodos anteriores não estão disponíveis no 27º BPM, pois eram realizados pela Unidade da RMP da 83ª CIPM/Barreiras, o que reforça a necessidade de gestão própria. A fiscalização regular desse universo já é realizada pelo efetivo do 27º BPM, sendo necessária a sua formalização para garantir gestão, controle e planejamento próprios.</w:t>
+        <w:t>(Gráfico das MPUs ativas em 2025 e 2026 – ver Anexo C)</w:t>
+      </w:r>
+    </w:p>
+    <w:p>
+      <w:pPr>
+        <w:pStyle w:val="PargrafodaLista"/>
+        <w:numPr>
+          <w:ilvl w:val="0"/>
+          <w:numId w:val="15"/>
+        </w:numPr>
+        <w:pBdr>
+          <w:top w:val="nil"/>
+          <w:left w:val="nil"/>
+          <w:bottom w:val="nil"/>
+          <w:right w:val="nil"/>
+          <w:between w:val="nil"/>
+        </w:pBdr>
+        <w:spacing w:line="360" w:lineRule="auto"/>
+        <w:ind w:left="0" w:firstLine="709"/>
+        <w:jc w:val="both"/>
+        <w:rPr>
+          <w:rFonts w:ascii="Verdana" w:eastAsia="Verdana" w:hAnsi="Verdana" w:cs="Verdana"/>
+          <w:color w:val="000000"/>
+          <w:sz w:val="20"/>
+          <w:szCs w:val="20"/>
+        </w:rPr>
+      </w:pPr>
+      <w:r>
+        <w:rPr>
+          <w:rFonts w:ascii="Verdana" w:eastAsia="Verdana" w:hAnsi="Verdana" w:cs="Verdana"/>
+          <w:color w:val="000000"/>
+          <w:sz w:val="20"/>
+          <w:szCs w:val="20"/>
+        </w:rPr>
+        <w:t>Local de funcionamento</w:t>
       </w:r>
     </w:p>
     <w:p>
@@ -2042,7 +2110,7 @@
           <w:sz w:val="20"/>
           <w:szCs w:val="20"/>
         </w:rPr>
-        <w:t>(Gráfico das MPUs ativas em 2025 e 2026 – ver Anexo C)</w:t>
+        <w:t>A RMP do 27º BPM funciona na sede do 27º BPM, à Rua Xique-Xique, n.º 530, Loteamento Santa Cruz, Luís Eduardo Magalhães/BA, em espaço compartilhado com a Coordenação de Apoio Administrativo (CAA), dispondo de ambiente reservado para o acolhimento das mulheres, garantindo privacidade no atendimento.</w:t>
       </w:r>
     </w:p>
     <w:p>
@@ -2071,7 +2139,41 @@
           <w:sz w:val="20"/>
           <w:szCs w:val="20"/>
         </w:rPr>
-        <w:t>5. Local de funcionamento</w:t>
+        <w:t>(Fotos das instalações da RMP – ver Anexo D)</w:t>
+      </w:r>
+    </w:p>
+    <w:p>
+      <w:pPr>
+        <w:pStyle w:val="PargrafodaLista"/>
+        <w:numPr>
+          <w:ilvl w:val="0"/>
+          <w:numId w:val="15"/>
+        </w:numPr>
+        <w:pBdr>
+          <w:top w:val="nil"/>
+          <w:left w:val="nil"/>
+          <w:bottom w:val="nil"/>
+          <w:right w:val="nil"/>
+          <w:between w:val="nil"/>
+        </w:pBdr>
+        <w:spacing w:line="360" w:lineRule="auto"/>
+        <w:ind w:left="0" w:firstLine="709"/>
+        <w:jc w:val="both"/>
+        <w:rPr>
+          <w:rFonts w:ascii="Verdana" w:eastAsia="Verdana" w:hAnsi="Verdana" w:cs="Verdana"/>
+          <w:color w:val="000000"/>
+          <w:sz w:val="20"/>
+          <w:szCs w:val="20"/>
+        </w:rPr>
+      </w:pPr>
+      <w:r>
+        <w:rPr>
+          <w:rFonts w:ascii="Verdana" w:eastAsia="Verdana" w:hAnsi="Verdana" w:cs="Verdana"/>
+          <w:color w:val="000000"/>
+          <w:sz w:val="20"/>
+          <w:szCs w:val="20"/>
+        </w:rPr>
+        <w:t>Recursos humanos e materiais exclusivos</w:t>
       </w:r>
     </w:p>
     <w:p>
@@ -2100,7 +2202,7 @@
           <w:sz w:val="20"/>
           <w:szCs w:val="20"/>
         </w:rPr>
-        <w:t>A RMP do 27º BPM funciona na sede do 27º BPM, à Rua Xique-Xique, n.º 530, Loteamento Santa Cruz, Luís Eduardo Magalhães/BA, em espaço compartilhado com a Coordenação de Apoio Administrativo (CAA), dispondo de ambiente reservado para o acolhimento das mulheres, garantindo privacidade no atendimento.</w:t>
+        <w:t>Em atendimento ao art. 4º, §2º, e art. 7º, §2º, da Portaria n.º 042-CG/2024, a RMP já conta com 05 (cinco) policiais militares do 27º BPM, efetivo mínimo exigido, sendo 01 (um) Oficial (Tenente PM), comandante da RMP, 01 (um) Sargento, 01 (um) Cabo e 02 (dois) Soldados, dos quais 02 (duas) são policiais femininas (relação nominal no Anexo A, de acesso restrito), empregados em guarnição tipo “B”, em regime de escala ordinário, empregados exclusivamente na atividade da RMP, estando a capacitação em enfrentamento à violência contra a mulher (art. 4º, §5º) já agendada junto ao BPPM. A RMP já dispõe de viatura exclusiva, prefixo 8.2732, Renault/Duster, placa TGX 2E57, com cota de combustível sob gestão da Unidade.</w:t>
       </w:r>
     </w:p>
     <w:p>
@@ -2129,20 +2231,25 @@
           <w:sz w:val="20"/>
           <w:szCs w:val="20"/>
         </w:rPr>
-        <w:t>(Fotos das instalações da RMP – ver Anexo D)</w:t>
-      </w:r>
-    </w:p>
-    <w:p>
-      <w:pPr>
-        <w:pBdr>
-          <w:top w:val="nil"/>
-          <w:left w:val="nil"/>
-          <w:bottom w:val="nil"/>
-          <w:right w:val="nil"/>
-          <w:between w:val="nil"/>
-        </w:pBdr>
-        <w:spacing w:line="360" w:lineRule="auto"/>
-        <w:ind w:firstLine="709"/>
+        <w:t>(Foto da viatura da RMP – ver Anexo E)</w:t>
+      </w:r>
+    </w:p>
+    <w:p>
+      <w:pPr>
+        <w:pStyle w:val="PargrafodaLista"/>
+        <w:numPr>
+          <w:ilvl w:val="0"/>
+          <w:numId w:val="15"/>
+        </w:numPr>
+        <w:pBdr>
+          <w:top w:val="nil"/>
+          <w:left w:val="nil"/>
+          <w:bottom w:val="nil"/>
+          <w:right w:val="nil"/>
+          <w:between w:val="nil"/>
+        </w:pBdr>
+        <w:spacing w:line="360" w:lineRule="auto"/>
+        <w:ind w:left="0" w:firstLine="709"/>
         <w:jc w:val="both"/>
         <w:rPr>
           <w:rFonts w:ascii="Verdana" w:eastAsia="Verdana" w:hAnsi="Verdana" w:cs="Verdana"/>
@@ -2158,94 +2265,7 @@
           <w:sz w:val="20"/>
           <w:szCs w:val="20"/>
         </w:rPr>
-        <w:t>6. Recursos humanos e materiais exclusivos</w:t>
-      </w:r>
-    </w:p>
-    <w:p>
-      <w:pPr>
-        <w:pBdr>
-          <w:top w:val="nil"/>
-          <w:left w:val="nil"/>
-          <w:bottom w:val="nil"/>
-          <w:right w:val="nil"/>
-          <w:between w:val="nil"/>
-        </w:pBdr>
-        <w:spacing w:line="360" w:lineRule="auto"/>
-        <w:ind w:firstLine="709"/>
-        <w:jc w:val="both"/>
-        <w:rPr>
-          <w:rFonts w:ascii="Verdana" w:eastAsia="Verdana" w:hAnsi="Verdana" w:cs="Verdana"/>
-          <w:color w:val="000000"/>
-          <w:sz w:val="20"/>
-          <w:szCs w:val="20"/>
-        </w:rPr>
-      </w:pPr>
-      <w:r>
-        <w:rPr>
-          <w:rFonts w:ascii="Verdana" w:eastAsia="Verdana" w:hAnsi="Verdana" w:cs="Verdana"/>
-          <w:color w:val="000000"/>
-          <w:sz w:val="20"/>
-          <w:szCs w:val="20"/>
-        </w:rPr>
-        <w:t>Em atendimento ao art. 4º, §2º, e art. 7º, §2º, da Portaria n.º 042-CG/2024, a RMP já conta com 05 (cinco) policiais militares do 27º BPM, efetivo mínimo exigido, sendo 01 (um) Oficial (Tenente PM), comandante da RMP, 01 (um) Sargento, 01 (um) Cabo e 02 (dois) Soldados, dos quais 02 (duas) são policiais femininas (relação nominal no Anexo A, de acesso restrito), empregados em guarnição tipo “B”, em regime de escala ordinário, empregados exclusivamente na atividade da RMP, estando a capacitação em enfrentamento à violência contra a mulher (art. 4º, §5º) já agendada junto ao BPPM. A RMP já dispõe de viatura exclusiva, prefixo 8.2732, Renault/Duster, placa TGX 2E57, com cota de combustível sob gestão da Unidade.</w:t>
-      </w:r>
-    </w:p>
-    <w:p>
-      <w:pPr>
-        <w:pBdr>
-          <w:top w:val="nil"/>
-          <w:left w:val="nil"/>
-          <w:bottom w:val="nil"/>
-          <w:right w:val="nil"/>
-          <w:between w:val="nil"/>
-        </w:pBdr>
-        <w:spacing w:line="360" w:lineRule="auto"/>
-        <w:ind w:firstLine="709"/>
-        <w:jc w:val="both"/>
-        <w:rPr>
-          <w:rFonts w:ascii="Verdana" w:eastAsia="Verdana" w:hAnsi="Verdana" w:cs="Verdana"/>
-          <w:color w:val="000000"/>
-          <w:sz w:val="20"/>
-          <w:szCs w:val="20"/>
-        </w:rPr>
-      </w:pPr>
-      <w:r>
-        <w:rPr>
-          <w:rFonts w:ascii="Verdana" w:eastAsia="Verdana" w:hAnsi="Verdana" w:cs="Verdana"/>
-          <w:color w:val="000000"/>
-          <w:sz w:val="20"/>
-          <w:szCs w:val="20"/>
-        </w:rPr>
-        <w:t>(Foto da viatura da RMP – ver Anexo E)</w:t>
-      </w:r>
-    </w:p>
-    <w:p>
-      <w:pPr>
-        <w:pBdr>
-          <w:top w:val="nil"/>
-          <w:left w:val="nil"/>
-          <w:bottom w:val="nil"/>
-          <w:right w:val="nil"/>
-          <w:between w:val="nil"/>
-        </w:pBdr>
-        <w:spacing w:line="360" w:lineRule="auto"/>
-        <w:ind w:firstLine="709"/>
-        <w:jc w:val="both"/>
-        <w:rPr>
-          <w:rFonts w:ascii="Verdana" w:eastAsia="Verdana" w:hAnsi="Verdana" w:cs="Verdana"/>
-          <w:color w:val="000000"/>
-          <w:sz w:val="20"/>
-          <w:szCs w:val="20"/>
-        </w:rPr>
-      </w:pPr>
-      <w:r>
-        <w:rPr>
-          <w:rFonts w:ascii="Verdana" w:eastAsia="Verdana" w:hAnsi="Verdana" w:cs="Verdana"/>
-          <w:color w:val="000000"/>
-          <w:sz w:val="20"/>
-          <w:szCs w:val="20"/>
-        </w:rPr>
-        <w:t>7. Outras informações</w:t>
+        <w:t>Outras informações</w:t>
       </w:r>
     </w:p>
     <w:p>

</xml_diff>

<commit_message>
Reescreve item f) do efetivo com quadro de distribuição
Co-Authored-By: Claude Opus 5.5 <noreply@anthropic.com>
Claude-Session: https://claude.ai/code/session_01NkJxMjLTPT7uCe2XDfKQHG
</commit_message>
<xml_diff>
--- a/estudo/Estudo_de_Situacao_RMP_27BPM.docx
+++ b/estudo/Estudo_de_Situacao_RMP_27BPM.docx
@@ -2202,9 +2202,383 @@
           <w:sz w:val="20"/>
           <w:szCs w:val="20"/>
         </w:rPr>
-        <w:t>Em atendimento ao art. 4º, §2º, e art. 7º, §2º, da Portaria n.º 042-CG/2024, a RMP já conta com 05 (cinco) policiais militares do 27º BPM, efetivo mínimo exigido, sendo 01 (um) Oficial (Tenente PM), comandante da RMP, 01 (um) Sargento, 01 (um) Cabo e 02 (dois) Soldados, dos quais 02 (duas) são policiais femininas (relação nominal no Anexo A, de acesso restrito), empregados em guarnição tipo “B”, em regime de escala ordinário, empregados exclusivamente na atividade da RMP, estando a capacitação em enfrentamento à violência contra a mulher (art. 4º, §5º) já agendada junto ao BPPM. A RMP já dispõe de viatura exclusiva, prefixo 8.2732, Renault/Duster, placa TGX 2E57, com cota de combustível sob gestão da Unidade.</w:t>
-      </w:r>
-    </w:p>
+        <w:t>A RMP do 27º BPM conta com efetivo próprio de 05 (cinco) policiais militares, atendendo ao mínimo previsto no art. 4º, §2º, da Portaria n.º 042-CG/2024, assim distribuído:</w:t>
+      </w:r>
+    </w:p>
+    <w:tbl>
+      <w:tblPr>
+        <w:tblW w:type="auto" w:w="0"/>
+        <w:jc w:val="center"/>
+        <w:tblLook w:firstColumn="1" w:firstRow="1" w:lastColumn="0" w:lastRow="0" w:noHBand="0" w:noVBand="1" w:val="04A0"/>
+        <w:tblBorders>
+          <w:top w:val="single" w:sz="4" w:color="000000"/>
+          <w:left w:val="single" w:sz="4" w:color="000000"/>
+          <w:bottom w:val="single" w:sz="4" w:color="000000"/>
+          <w:right w:val="single" w:sz="4" w:color="000000"/>
+          <w:insideH w:val="single" w:sz="4" w:color="000000"/>
+          <w:insideV w:val="single" w:sz="4" w:color="000000"/>
+        </w:tblBorders>
+      </w:tblPr>
+      <w:tblGrid>
+        <w:gridCol w:w="3118"/>
+        <w:gridCol w:w="3118"/>
+        <w:gridCol w:w="3118"/>
+      </w:tblGrid>
+      <w:tr>
+        <w:tc>
+          <w:tcPr>
+            <w:tcW w:type="dxa" w:w="3118"/>
+          </w:tcPr>
+          <w:p>
+            <w:pPr>
+              <w:jc w:val="center"/>
+            </w:pPr>
+            <w:r/>
+            <w:r>
+              <w:rPr>
+                <w:rFonts w:ascii="Verdana" w:hAnsi="Verdana"/>
+                <w:b/>
+                <w:sz w:val="22"/>
+              </w:rPr>
+              <w:t>Posto/Graduação</w:t>
+            </w:r>
+          </w:p>
+        </w:tc>
+        <w:tc>
+          <w:tcPr>
+            <w:tcW w:type="dxa" w:w="3118"/>
+          </w:tcPr>
+          <w:p>
+            <w:pPr>
+              <w:jc w:val="center"/>
+            </w:pPr>
+            <w:r/>
+            <w:r>
+              <w:rPr>
+                <w:rFonts w:ascii="Verdana" w:hAnsi="Verdana"/>
+                <w:b/>
+                <w:sz w:val="22"/>
+              </w:rPr>
+              <w:t>Quantidade</w:t>
+            </w:r>
+          </w:p>
+        </w:tc>
+        <w:tc>
+          <w:tcPr>
+            <w:tcW w:type="dxa" w:w="3118"/>
+          </w:tcPr>
+          <w:p>
+            <w:pPr>
+              <w:jc w:val="center"/>
+            </w:pPr>
+            <w:r/>
+            <w:r>
+              <w:rPr>
+                <w:rFonts w:ascii="Verdana" w:hAnsi="Verdana"/>
+                <w:b/>
+                <w:sz w:val="22"/>
+              </w:rPr>
+              <w:t>Função</w:t>
+            </w:r>
+          </w:p>
+        </w:tc>
+      </w:tr>
+      <w:tr>
+        <w:tc>
+          <w:tcPr>
+            <w:tcW w:type="dxa" w:w="3118"/>
+          </w:tcPr>
+          <w:p>
+            <w:pPr>
+              <w:jc w:val="center"/>
+            </w:pPr>
+            <w:r/>
+            <w:r>
+              <w:rPr>
+                <w:rFonts w:ascii="Verdana" w:hAnsi="Verdana"/>
+                <w:b w:val="0"/>
+                <w:sz w:val="22"/>
+              </w:rPr>
+              <w:t>Tenente PM</w:t>
+            </w:r>
+          </w:p>
+        </w:tc>
+        <w:tc>
+          <w:tcPr>
+            <w:tcW w:type="dxa" w:w="3118"/>
+          </w:tcPr>
+          <w:p>
+            <w:pPr>
+              <w:jc w:val="center"/>
+            </w:pPr>
+            <w:r/>
+            <w:r>
+              <w:rPr>
+                <w:rFonts w:ascii="Verdana" w:hAnsi="Verdana"/>
+                <w:b w:val="0"/>
+                <w:sz w:val="22"/>
+              </w:rPr>
+              <w:t>01</w:t>
+            </w:r>
+          </w:p>
+        </w:tc>
+        <w:tc>
+          <w:tcPr>
+            <w:tcW w:type="dxa" w:w="3118"/>
+          </w:tcPr>
+          <w:p>
+            <w:pPr>
+              <w:jc w:val="center"/>
+            </w:pPr>
+            <w:r/>
+            <w:r>
+              <w:rPr>
+                <w:rFonts w:ascii="Verdana" w:hAnsi="Verdana"/>
+                <w:b w:val="0"/>
+                <w:sz w:val="22"/>
+              </w:rPr>
+              <w:t>Comandante da RMP</w:t>
+            </w:r>
+          </w:p>
+        </w:tc>
+      </w:tr>
+      <w:tr>
+        <w:tc>
+          <w:tcPr>
+            <w:tcW w:type="dxa" w:w="3118"/>
+          </w:tcPr>
+          <w:p>
+            <w:pPr>
+              <w:jc w:val="center"/>
+            </w:pPr>
+            <w:r/>
+            <w:r>
+              <w:rPr>
+                <w:rFonts w:ascii="Verdana" w:hAnsi="Verdana"/>
+                <w:b w:val="0"/>
+                <w:sz w:val="22"/>
+              </w:rPr>
+              <w:t>Sargento PM</w:t>
+            </w:r>
+          </w:p>
+        </w:tc>
+        <w:tc>
+          <w:tcPr>
+            <w:tcW w:type="dxa" w:w="3118"/>
+          </w:tcPr>
+          <w:p>
+            <w:pPr>
+              <w:jc w:val="center"/>
+            </w:pPr>
+            <w:r/>
+            <w:r>
+              <w:rPr>
+                <w:rFonts w:ascii="Verdana" w:hAnsi="Verdana"/>
+                <w:b w:val="0"/>
+                <w:sz w:val="22"/>
+              </w:rPr>
+              <w:t>01</w:t>
+            </w:r>
+          </w:p>
+        </w:tc>
+        <w:tc>
+          <w:tcPr>
+            <w:tcW w:type="dxa" w:w="3118"/>
+          </w:tcPr>
+          <w:p>
+            <w:pPr>
+              <w:jc w:val="center"/>
+            </w:pPr>
+            <w:r/>
+            <w:r>
+              <w:rPr>
+                <w:rFonts w:ascii="Verdana" w:hAnsi="Verdana"/>
+                <w:b w:val="0"/>
+                <w:sz w:val="22"/>
+              </w:rPr>
+              <w:t>Integrante</w:t>
+            </w:r>
+          </w:p>
+        </w:tc>
+      </w:tr>
+      <w:tr>
+        <w:tc>
+          <w:tcPr>
+            <w:tcW w:type="dxa" w:w="3118"/>
+          </w:tcPr>
+          <w:p>
+            <w:pPr>
+              <w:jc w:val="center"/>
+            </w:pPr>
+            <w:r/>
+            <w:r>
+              <w:rPr>
+                <w:rFonts w:ascii="Verdana" w:hAnsi="Verdana"/>
+                <w:b w:val="0"/>
+                <w:sz w:val="22"/>
+              </w:rPr>
+              <w:t>Cabo PM</w:t>
+            </w:r>
+          </w:p>
+        </w:tc>
+        <w:tc>
+          <w:tcPr>
+            <w:tcW w:type="dxa" w:w="3118"/>
+          </w:tcPr>
+          <w:p>
+            <w:pPr>
+              <w:jc w:val="center"/>
+            </w:pPr>
+            <w:r/>
+            <w:r>
+              <w:rPr>
+                <w:rFonts w:ascii="Verdana" w:hAnsi="Verdana"/>
+                <w:b w:val="0"/>
+                <w:sz w:val="22"/>
+              </w:rPr>
+              <w:t>01</w:t>
+            </w:r>
+          </w:p>
+        </w:tc>
+        <w:tc>
+          <w:tcPr>
+            <w:tcW w:type="dxa" w:w="3118"/>
+          </w:tcPr>
+          <w:p>
+            <w:pPr>
+              <w:jc w:val="center"/>
+            </w:pPr>
+            <w:r/>
+            <w:r>
+              <w:rPr>
+                <w:rFonts w:ascii="Verdana" w:hAnsi="Verdana"/>
+                <w:b w:val="0"/>
+                <w:sz w:val="22"/>
+              </w:rPr>
+              <w:t>Integrante (policial feminina)</w:t>
+            </w:r>
+          </w:p>
+        </w:tc>
+      </w:tr>
+      <w:tr>
+        <w:tc>
+          <w:tcPr>
+            <w:tcW w:type="dxa" w:w="3118"/>
+          </w:tcPr>
+          <w:p>
+            <w:pPr>
+              <w:jc w:val="center"/>
+            </w:pPr>
+            <w:r/>
+            <w:r>
+              <w:rPr>
+                <w:rFonts w:ascii="Verdana" w:hAnsi="Verdana"/>
+                <w:b w:val="0"/>
+                <w:sz w:val="22"/>
+              </w:rPr>
+              <w:t>Soldado PM</w:t>
+            </w:r>
+          </w:p>
+        </w:tc>
+        <w:tc>
+          <w:tcPr>
+            <w:tcW w:type="dxa" w:w="3118"/>
+          </w:tcPr>
+          <w:p>
+            <w:pPr>
+              <w:jc w:val="center"/>
+            </w:pPr>
+            <w:r/>
+            <w:r>
+              <w:rPr>
+                <w:rFonts w:ascii="Verdana" w:hAnsi="Verdana"/>
+                <w:b w:val="0"/>
+                <w:sz w:val="22"/>
+              </w:rPr>
+              <w:t>02</w:t>
+            </w:r>
+          </w:p>
+        </w:tc>
+        <w:tc>
+          <w:tcPr>
+            <w:tcW w:type="dxa" w:w="3118"/>
+          </w:tcPr>
+          <w:p>
+            <w:pPr>
+              <w:jc w:val="center"/>
+            </w:pPr>
+            <w:r/>
+            <w:r>
+              <w:rPr>
+                <w:rFonts w:ascii="Verdana" w:hAnsi="Verdana"/>
+                <w:b w:val="0"/>
+                <w:sz w:val="22"/>
+              </w:rPr>
+              <w:t>Integrantes (01 policial feminina)</w:t>
+            </w:r>
+          </w:p>
+        </w:tc>
+      </w:tr>
+      <w:tr>
+        <w:tc>
+          <w:tcPr>
+            <w:tcW w:type="dxa" w:w="3118"/>
+          </w:tcPr>
+          <w:p>
+            <w:pPr>
+              <w:jc w:val="center"/>
+            </w:pPr>
+            <w:r/>
+            <w:r>
+              <w:rPr>
+                <w:rFonts w:ascii="Verdana" w:hAnsi="Verdana"/>
+                <w:b/>
+                <w:sz w:val="22"/>
+              </w:rPr>
+              <w:t>Total</w:t>
+            </w:r>
+          </w:p>
+        </w:tc>
+        <w:tc>
+          <w:tcPr>
+            <w:tcW w:type="dxa" w:w="3118"/>
+          </w:tcPr>
+          <w:p>
+            <w:pPr>
+              <w:jc w:val="center"/>
+            </w:pPr>
+            <w:r/>
+            <w:r>
+              <w:rPr>
+                <w:rFonts w:ascii="Verdana" w:hAnsi="Verdana"/>
+                <w:b/>
+                <w:sz w:val="22"/>
+              </w:rPr>
+              <w:t>05</w:t>
+            </w:r>
+          </w:p>
+        </w:tc>
+        <w:tc>
+          <w:tcPr>
+            <w:tcW w:type="dxa" w:w="3118"/>
+          </w:tcPr>
+          <w:p>
+            <w:pPr>
+              <w:jc w:val="center"/>
+            </w:pPr>
+            <w:r/>
+            <w:r>
+              <w:rPr>
+                <w:rFonts w:ascii="Verdana" w:hAnsi="Verdana"/>
+                <w:b/>
+                <w:sz w:val="22"/>
+              </w:rPr>
+              <w:t>02 policiais femininas</w:t>
+            </w:r>
+          </w:p>
+        </w:tc>
+      </w:tr>
+    </w:tbl>
     <w:p>
       <w:pPr>
         <w:pBdr>
@@ -2231,7 +2605,65 @@
           <w:sz w:val="20"/>
           <w:szCs w:val="20"/>
         </w:rPr>
-        <w:t>(Foto da viatura da RMP – ver Anexo E)</w:t>
+        <w:t>O efetivo é empregado exclusivamente na atividade da RMP, em regime de escala ordinário (art. 4º, §4º), compondo guarnição tipo “B” com a presença de policial feminina (art. 7º, §2º). A relação nominal consta do Anexo A, de acesso restrito.</w:t>
+      </w:r>
+    </w:p>
+    <w:p>
+      <w:pPr>
+        <w:pBdr>
+          <w:top w:val="nil"/>
+          <w:left w:val="nil"/>
+          <w:bottom w:val="nil"/>
+          <w:right w:val="nil"/>
+          <w:between w:val="nil"/>
+        </w:pBdr>
+        <w:spacing w:line="360" w:lineRule="auto"/>
+        <w:ind w:firstLine="709"/>
+        <w:jc w:val="both"/>
+        <w:rPr>
+          <w:rFonts w:ascii="Verdana" w:eastAsia="Verdana" w:hAnsi="Verdana" w:cs="Verdana"/>
+          <w:color w:val="000000"/>
+          <w:sz w:val="20"/>
+          <w:szCs w:val="20"/>
+        </w:rPr>
+      </w:pPr>
+      <w:r>
+        <w:rPr>
+          <w:rFonts w:ascii="Verdana" w:eastAsia="Verdana" w:hAnsi="Verdana" w:cs="Verdana"/>
+          <w:color w:val="000000"/>
+          <w:sz w:val="20"/>
+          <w:szCs w:val="20"/>
+        </w:rPr>
+        <w:t>A capacitação do efetivo em enfrentamento à violência contra a mulher, exigida pelo art. 4º, §5º, encontra-se agendada junto ao Batalhão de Policiamento de Proteção à Mulher (BPPM).</w:t>
+      </w:r>
+    </w:p>
+    <w:p>
+      <w:pPr>
+        <w:pBdr>
+          <w:top w:val="nil"/>
+          <w:left w:val="nil"/>
+          <w:bottom w:val="nil"/>
+          <w:right w:val="nil"/>
+          <w:between w:val="nil"/>
+        </w:pBdr>
+        <w:spacing w:line="360" w:lineRule="auto"/>
+        <w:ind w:firstLine="709"/>
+        <w:jc w:val="both"/>
+        <w:rPr>
+          <w:rFonts w:ascii="Verdana" w:eastAsia="Verdana" w:hAnsi="Verdana" w:cs="Verdana"/>
+          <w:color w:val="000000"/>
+          <w:sz w:val="20"/>
+          <w:szCs w:val="20"/>
+        </w:rPr>
+      </w:pPr>
+      <w:r>
+        <w:rPr>
+          <w:rFonts w:ascii="Verdana" w:eastAsia="Verdana" w:hAnsi="Verdana" w:cs="Verdana"/>
+          <w:color w:val="000000"/>
+          <w:sz w:val="20"/>
+          <w:szCs w:val="20"/>
+        </w:rPr>
+        <w:t>Quanto aos meios materiais, a RMP dispõe de viatura exclusiva Renault/Duster, prefixo 8.2732, placa TGX 2E57, cabendo ao 27º BPM a cota de combustível, a manutenção e a conservação (art. 7º, I, III e V) (Anexo E).</w:t>
       </w:r>
     </w:p>
     <w:p>

</xml_diff>

<commit_message>
Remove relação nominal; anexos reordenados A–E
Co-Authored-By: Claude Opus 5.5 <noreply@anthropic.com>
Claude-Session: https://claude.ai/code/session_01NkJxMjLTPT7uCe2XDfKQHG
</commit_message>
<xml_diff>
--- a/estudo/Estudo_de_Situacao_RMP_27BPM.docx
+++ b/estudo/Estudo_de_Situacao_RMP_27BPM.docx
@@ -1955,7 +1955,7 @@
           <w:sz w:val="20"/>
           <w:szCs w:val="20"/>
         </w:rPr>
-        <w:t>(Gráfico das ocorrências de 2024 a 2026 – ver Anexo B)</w:t>
+        <w:t>(Gráfico das ocorrências de 2024 a 2026 – ver Anexo A)</w:t>
       </w:r>
     </w:p>
     <w:p>
@@ -2047,7 +2047,7 @@
           <w:sz w:val="20"/>
           <w:szCs w:val="20"/>
         </w:rPr>
-        <w:t>(Gráfico das MPUs ativas em 2025 e 2026 – ver Anexo C)</w:t>
+        <w:t>(Gráfico das MPUs ativas em 2025 e 2026 – ver Anexo B)</w:t>
       </w:r>
     </w:p>
     <w:p>
@@ -2139,7 +2139,7 @@
           <w:sz w:val="20"/>
           <w:szCs w:val="20"/>
         </w:rPr>
-        <w:t>(Fotos das instalações da RMP – ver Anexo D)</w:t>
+        <w:t>(Fotos das instalações da RMP – ver Anexo C)</w:t>
       </w:r>
     </w:p>
     <w:p>
@@ -2605,7 +2605,7 @@
           <w:sz w:val="20"/>
           <w:szCs w:val="20"/>
         </w:rPr>
-        <w:t>O efetivo é empregado exclusivamente na atividade da RMP, em regime de escala ordinário (art. 4º, §4º), compondo guarnição tipo “B” com a presença de policial feminina (art. 7º, §2º). A relação nominal consta do Anexo A, de acesso restrito.</w:t>
+        <w:t>O efetivo é empregado exclusivamente na atividade da RMP, em regime de escala ordinário (art. 4º, §4º), compondo guarnição tipo “B” com a presença de policial feminina (art. 7º, §2º).</w:t>
       </w:r>
     </w:p>
     <w:p>
@@ -2663,7 +2663,7 @@
           <w:sz w:val="20"/>
           <w:szCs w:val="20"/>
         </w:rPr>
-        <w:t>Quanto aos meios materiais, a RMP dispõe de viatura exclusiva Renault/Duster, prefixo 8.2732, placa TGX 2E57, cabendo ao 27º BPM a cota de combustível, a manutenção e a conservação (art. 7º, I, III e V) (Anexo E).</w:t>
+        <w:t>Quanto aos meios materiais, a RMP dispõe de viatura exclusiva Renault/Duster, prefixo 8.2732, placa TGX 2E57, cabendo ao 27º BPM a cota de combustível, a manutenção e a conservação (art. 7º, I, III e V) (Anexo D).</w:t>
       </w:r>
     </w:p>
     <w:p>
@@ -2765,7 +2765,7 @@
           <w:sz w:val="20"/>
           <w:szCs w:val="20"/>
         </w:rPr>
-        <w:t>(Registros fotográficos de palestras e ações da RMP – ver Anexo F)</w:t>
+        <w:t>(Registros fotográficos de palestras e ações da RMP – ver Anexo E)</w:t>
       </w:r>
     </w:p>
     <w:p>
@@ -3285,7 +3285,7 @@
           <w:sz w:val="20"/>
           <w:szCs w:val="20"/>
         </w:rPr>
-        <w:t>Anexo A – Relação do efetivo da RMP, por posto/graduação e capacitação (documento de acesso restrito);</w:t>
+        <w:t>Anexo A – Gráfico das ocorrências de violência doméstica (2024–2026), fonte SIGESPOL;</w:t>
       </w:r>
     </w:p>
     <w:p>
@@ -3313,7 +3313,7 @@
           <w:sz w:val="20"/>
           <w:szCs w:val="20"/>
         </w:rPr>
-        <w:t>Anexo B – Gráfico das ocorrências de violência doméstica (2024–2026), fonte SIGESPOL;</w:t>
+        <w:t>Anexo B – Gráfico das MPUs ativas (2025–2026);</w:t>
       </w:r>
     </w:p>
     <w:p>
@@ -3341,7 +3341,7 @@
           <w:sz w:val="20"/>
           <w:szCs w:val="20"/>
         </w:rPr>
-        <w:t>Anexo C – Gráfico das MPUs ativas (2025–2026);</w:t>
+        <w:t>Anexo C – Fotos das instalações da RMP;</w:t>
       </w:r>
     </w:p>
     <w:p>
@@ -3369,7 +3369,7 @@
           <w:sz w:val="20"/>
           <w:szCs w:val="20"/>
         </w:rPr>
-        <w:t>Anexo D – Fotos das instalações da RMP;</w:t>
+        <w:t>Anexo D – Foto da viatura da RMP;</w:t>
       </w:r>
     </w:p>
     <w:p>
@@ -3397,35 +3397,7 @@
           <w:sz w:val="20"/>
           <w:szCs w:val="20"/>
         </w:rPr>
-        <w:t>Anexo E – Foto da viatura da RMP;</w:t>
-      </w:r>
-    </w:p>
-    <w:p>
-      <w:pPr>
-        <w:pBdr>
-          <w:top w:val="nil"/>
-          <w:left w:val="nil"/>
-          <w:bottom w:val="nil"/>
-          <w:right w:val="nil"/>
-          <w:between w:val="nil"/>
-        </w:pBdr>
-        <w:spacing w:line="360" w:lineRule="auto"/>
-        <w:ind w:left="426"/>
-        <w:rPr>
-          <w:rFonts w:ascii="Verdana" w:eastAsia="Verdana" w:hAnsi="Verdana" w:cs="Verdana"/>
-          <w:color w:val="000000"/>
-          <w:sz w:val="20"/>
-          <w:szCs w:val="20"/>
-        </w:rPr>
-      </w:pPr>
-      <w:r>
-        <w:rPr>
-          <w:rFonts w:ascii="Verdana" w:eastAsia="Verdana" w:hAnsi="Verdana" w:cs="Verdana"/>
-          <w:color w:val="000000"/>
-          <w:sz w:val="20"/>
-          <w:szCs w:val="20"/>
-        </w:rPr>
-        <w:t>Anexo F – Registros fotográficos de palestras e ações da RMP.</w:t>
+        <w:t>Anexo E – Registros fotográficos de palestras e ações da RMP.</w:t>
       </w:r>
     </w:p>
     <w:p>
@@ -4196,166 +4168,6 @@
     </w:p>
     <w:p>
       <w:pPr>
-        <w:spacing w:line="360" w:lineRule="auto"/>
-        <w:ind w:firstLine="720"/>
-        <w:jc w:val="both"/>
-        <w:rPr>
-          <w:rFonts w:ascii="Verdana" w:eastAsia="Verdana" w:hAnsi="Verdana" w:cs="Verdana"/>
-          <w:sz w:val="20"/>
-          <w:szCs w:val="20"/>
-        </w:rPr>
-      </w:pPr>
-      <w:r>
-        <w:rPr>
-          <w:rFonts w:ascii="Verdana" w:eastAsia="Verdana" w:hAnsi="Verdana" w:cs="Verdana"/>
-          <w:sz w:val="20"/>
-          <w:szCs w:val="20"/>
-        </w:rPr>
-        <w:t>ANEXO – A (ACESSO RESTRITO – LGPD)</w:t>
-      </w:r>
-    </w:p>
-    <w:p>
-      <w:pPr>
-        <w:spacing w:line="360" w:lineRule="auto"/>
-        <w:ind w:firstLine="720"/>
-        <w:jc w:val="both"/>
-        <w:rPr>
-          <w:rFonts w:ascii="Verdana" w:eastAsia="Verdana" w:hAnsi="Verdana" w:cs="Verdana"/>
-          <w:sz w:val="20"/>
-          <w:szCs w:val="20"/>
-        </w:rPr>
-      </w:pPr>
-      <w:r>
-        <w:rPr>
-          <w:rFonts w:ascii="Verdana" w:eastAsia="Verdana" w:hAnsi="Verdana" w:cs="Verdana"/>
-          <w:sz w:val="20"/>
-          <w:szCs w:val="20"/>
-        </w:rPr>
-        <w:t>RELAÇÃO NOMINAL DO EFETIVO DA RMP/27º BPM</w:t>
-      </w:r>
-    </w:p>
-    <w:p>
-      <w:pPr>
-        <w:spacing w:line="360" w:lineRule="auto"/>
-        <w:ind w:firstLine="720"/>
-        <w:jc w:val="both"/>
-        <w:rPr>
-          <w:rFonts w:ascii="Verdana" w:eastAsia="Verdana" w:hAnsi="Verdana" w:cs="Verdana"/>
-          <w:sz w:val="20"/>
-          <w:szCs w:val="20"/>
-        </w:rPr>
-      </w:pPr>
-      <w:r>
-        <w:rPr>
-          <w:rFonts w:ascii="Verdana" w:eastAsia="Verdana" w:hAnsi="Verdana" w:cs="Verdana"/>
-          <w:sz w:val="20"/>
-          <w:szCs w:val="20"/>
-        </w:rPr>
-        <w:t>Comandante da RMP: TEN PM LUIS HENRIQUE SANTOS SOUSA</w:t>
-      </w:r>
-    </w:p>
-    <w:p>
-      <w:pPr>
-        <w:spacing w:line="360" w:lineRule="auto"/>
-        <w:ind w:firstLine="720"/>
-        <w:jc w:val="both"/>
-        <w:rPr>
-          <w:rFonts w:ascii="Verdana" w:eastAsia="Verdana" w:hAnsi="Verdana" w:cs="Verdana"/>
-          <w:sz w:val="20"/>
-          <w:szCs w:val="20"/>
-        </w:rPr>
-      </w:pPr>
-      <w:r>
-        <w:rPr>
-          <w:rFonts w:ascii="Verdana" w:eastAsia="Verdana" w:hAnsi="Verdana" w:cs="Verdana"/>
-          <w:sz w:val="20"/>
-          <w:szCs w:val="20"/>
-        </w:rPr>
-        <w:t>SGT PM FLAVIO DE SOUZA SARDEIRO</w:t>
-      </w:r>
-    </w:p>
-    <w:p>
-      <w:pPr>
-        <w:spacing w:line="360" w:lineRule="auto"/>
-        <w:ind w:firstLine="720"/>
-        <w:jc w:val="both"/>
-        <w:rPr>
-          <w:rFonts w:ascii="Verdana" w:eastAsia="Verdana" w:hAnsi="Verdana" w:cs="Verdana"/>
-          <w:sz w:val="20"/>
-          <w:szCs w:val="20"/>
-        </w:rPr>
-      </w:pPr>
-      <w:r>
-        <w:rPr>
-          <w:rFonts w:ascii="Verdana" w:eastAsia="Verdana" w:hAnsi="Verdana" w:cs="Verdana"/>
-          <w:sz w:val="20"/>
-          <w:szCs w:val="20"/>
-        </w:rPr>
-        <w:t>CB PM LIVIA MACIEL SANTIAGO DOS SANTOS</w:t>
-      </w:r>
-    </w:p>
-    <w:p>
-      <w:pPr>
-        <w:spacing w:line="360" w:lineRule="auto"/>
-        <w:ind w:firstLine="720"/>
-        <w:jc w:val="both"/>
-        <w:rPr>
-          <w:rFonts w:ascii="Verdana" w:eastAsia="Verdana" w:hAnsi="Verdana" w:cs="Verdana"/>
-          <w:sz w:val="20"/>
-          <w:szCs w:val="20"/>
-        </w:rPr>
-      </w:pPr>
-      <w:r>
-        <w:rPr>
-          <w:rFonts w:ascii="Verdana" w:eastAsia="Verdana" w:hAnsi="Verdana" w:cs="Verdana"/>
-          <w:sz w:val="20"/>
-          <w:szCs w:val="20"/>
-        </w:rPr>
-        <w:t>SD PM DAVI ALVES DA SILVA</w:t>
-      </w:r>
-    </w:p>
-    <w:p>
-      <w:pPr>
-        <w:spacing w:line="360" w:lineRule="auto"/>
-        <w:ind w:firstLine="720"/>
-        <w:jc w:val="both"/>
-        <w:rPr>
-          <w:rFonts w:ascii="Verdana" w:eastAsia="Verdana" w:hAnsi="Verdana" w:cs="Verdana"/>
-          <w:sz w:val="20"/>
-          <w:szCs w:val="20"/>
-        </w:rPr>
-      </w:pPr>
-      <w:r>
-        <w:rPr>
-          <w:rFonts w:ascii="Verdana" w:eastAsia="Verdana" w:hAnsi="Verdana" w:cs="Verdana"/>
-          <w:sz w:val="20"/>
-          <w:szCs w:val="20"/>
-        </w:rPr>
-        <w:t>SD PM JEOVANA ALVES CIRIACO DOS SANTOS</w:t>
-      </w:r>
-    </w:p>
-    <w:p>
-      <w:pPr>
-        <w:spacing w:line="360" w:lineRule="auto"/>
-        <w:ind w:firstLine="720"/>
-        <w:jc w:val="both"/>
-        <w:rPr>
-          <w:rFonts w:ascii="Verdana" w:eastAsia="Verdana" w:hAnsi="Verdana" w:cs="Verdana"/>
-          <w:sz w:val="20"/>
-          <w:szCs w:val="20"/>
-        </w:rPr>
-      </w:pPr>
-      <w:r>
-        <w:rPr>
-          <w:rFonts w:ascii="Verdana" w:eastAsia="Verdana" w:hAnsi="Verdana" w:cs="Verdana"/>
-          <w:sz w:val="20"/>
-          <w:szCs w:val="20"/>
-        </w:rPr>
-        <w:t>Capacitação: agendada junto ao BPPM.</w:t>
-      </w:r>
-    </w:p>
-    <w:p>
-      <w:pPr>
         <w:jc w:val="center"/>
         <w:rPr>
           <w:rFonts w:ascii="Verdana" w:eastAsia="Verdana" w:hAnsi="Verdana" w:cs="Verdana"/>
@@ -4375,7 +4187,6 @@
           <w:sz w:val="20"/>
           <w:szCs w:val="20"/>
         </w:rPr>
-        <w:br w:type="page"/>
       </w:r>
       <w:r>
         <w:rPr>
@@ -4386,7 +4197,7 @@
           <w:sz w:val="20"/>
           <w:szCs w:val="20"/>
         </w:rPr>
-        <w:t>ANEXO – B</w:t>
+        <w:t>ANEXO – A</w:t>
       </w:r>
     </w:p>
     <w:p>
@@ -4501,7 +4312,7 @@
           <w:sz w:val="20"/>
           <w:szCs w:val="20"/>
         </w:rPr>
-        <w:t>ANEXO – C</w:t>
+        <w:t>ANEXO – B</w:t>
       </w:r>
     </w:p>
     <w:p>
@@ -4616,7 +4427,7 @@
           <w:sz w:val="20"/>
           <w:szCs w:val="20"/>
         </w:rPr>
-        <w:t>ANEXO – D</w:t>
+        <w:t>ANEXO – C</w:t>
       </w:r>
     </w:p>
     <w:p>
@@ -4764,7 +4575,7 @@
           <w:sz w:val="20"/>
           <w:szCs w:val="20"/>
         </w:rPr>
-        <w:t>ANEXO – E</w:t>
+        <w:t>ANEXO – D</w:t>
       </w:r>
     </w:p>
     <w:p>
@@ -4912,7 +4723,7 @@
           <w:sz w:val="20"/>
           <w:szCs w:val="20"/>
         </w:rPr>
-        <w:t>ANEXO – F</w:t>
+        <w:t>ANEXO – E</w:t>
       </w:r>
     </w:p>
     <w:p>

</xml_diff>

<commit_message>
Cabeçalho: total de folhas automático (NUMPAGES)
Co-Authored-By: Claude Opus 5.5 <noreply@anthropic.com>
Claude-Session: https://claude.ai/code/session_01NkJxMjLTPT7uCe2XDfKQHG
</commit_message>
<xml_diff>
--- a/estudo/Estudo_de_Situacao_RMP_27BPM.docx
+++ b/estudo/Estudo_de_Situacao_RMP_27BPM.docx
@@ -5246,7 +5246,51 @@
         <w:sz w:val="22"/>
         <w:szCs w:val="22"/>
       </w:rPr>
-      <w:t>5</w:t>
+      <w:fldChar w:fldCharType="begin"/>
+    </w:r>
+    <w:r>
+      <w:rPr>
+        <w:rFonts w:ascii="Verdana" w:eastAsia="Verdana" w:hAnsi="Verdana" w:cs="Verdana"/>
+        <w:b/>
+        <w:bCs/>
+        <w:color w:val="FF0000"/>
+        <w:sz w:val="22"/>
+        <w:szCs w:val="22"/>
+      </w:rPr>
+      <w:instrText xml:space="preserve"> NUMPAGES </w:instrText>
+    </w:r>
+    <w:r>
+      <w:rPr>
+        <w:rFonts w:ascii="Verdana" w:eastAsia="Verdana" w:hAnsi="Verdana" w:cs="Verdana"/>
+        <w:b/>
+        <w:bCs/>
+        <w:color w:val="FF0000"/>
+        <w:sz w:val="22"/>
+        <w:szCs w:val="22"/>
+      </w:rPr>
+      <w:fldChar w:fldCharType="separate"/>
+    </w:r>
+    <w:r>
+      <w:rPr>
+        <w:rFonts w:ascii="Verdana" w:eastAsia="Verdana" w:hAnsi="Verdana" w:cs="Verdana"/>
+        <w:b/>
+        <w:bCs/>
+        <w:color w:val="FF0000"/>
+        <w:sz w:val="22"/>
+        <w:szCs w:val="22"/>
+      </w:rPr>
+      <w:t>13</w:t>
+    </w:r>
+    <w:r>
+      <w:rPr>
+        <w:rFonts w:ascii="Verdana" w:eastAsia="Verdana" w:hAnsi="Verdana" w:cs="Verdana"/>
+        <w:b/>
+        <w:bCs/>
+        <w:color w:val="FF0000"/>
+        <w:sz w:val="22"/>
+        <w:szCs w:val="22"/>
+      </w:rPr>
+      <w:fldChar w:fldCharType="end"/>
     </w:r>
   </w:p>
   <w:p>

</xml_diff>